<commit_message>
Fix client-facing leaks in Siobhan Hansen, Sarah, and Moe Shahheidari Client Views
</commit_message>
<xml_diff>
--- a/clients/moe_shahheidari/Moe_Shahheidari_3Day_Training_Plan.docx
+++ b/clients/moe_shahheidari/Moe_Shahheidari_3Day_Training_Plan.docx
@@ -2819,7 +2819,32 @@
           <w:sz w:val="17"/>
           <w:szCs w:val="17"/>
         </w:rPr>
-        <w:t xml:space="preserve">Lean Mass 125.3 lbs (65.4%), Fat Mass 61 lbs, Bone Mass 5.8 lbs (3.0%), BMR 1858 cal/day, Shape Score 45/100 ("Needs Improvement"). ALST Index 7.92 kg/m² — EWGSOP2 2018's male low-muscle-mass cutoff is &lt;7.0 kg/m² AT-RISK / ≥7.0 kg/m² Not At-Risk (the same source already used for the women's 5.5 kg/m² threshold in this system); Moe sits comfortably above the line — this is the clinically-governing figure for his muscle-mass status, see the note below for how it relates to Styku's own internal flag. VFA 87.1 cm² is tracked here as a trend indicator rather than a fixed risk-band classification (CLAUDE.md's VFA section, corrected 8/17/2026) — no consensus body endorses a single absolute cm² cutoff, so this reading is watched directionally at future rescans rather than labeled against a risk band; the sex-independence of the underlying visceral-adiposity evidence still applies to him directly. BMI 26.7 falls in the WHO Overweight range (25-29.9) — WHO BMI thresholds are not sex-specific, and unlike the "over-flagged muscular athlete" caution the Male Client Programming Framework raises for reading BMI in isolation, this BMI reading is concordant with — not contradicted by — his body fat % and lean mass findings below. There is no muscular-athlete false positive to correct for here.</w:t>
+        <w:t xml:space="preserve">Lean Mass 125.3 lbs (65.4%), Fat Mass 61 lbs, Bone Mass 5.8 lbs (3.0%), BMR 1858 cal/day, Shape Score 45/100 ("Needs Improvement"). ALST Index 7.92 kg/m² — EWGSOP2 2018's male low-muscle-mass cutoff is &lt;7.0 kg/m² AT-RISK / ≥7.0 kg/m² Not At-Risk (the same source already used for the women's 5.5 kg/m² threshold in this system); Moe sits comfortably above the line — this is the clinically-governing figure for his muscle-mass status, see the note below for how it relates to Styku's own internal flag. VFA 87.1 cm² is tracked here as a trend indicator rather than a fixed risk-band classification — no consensus body endorses a single absolute cm² cutoff, so this reading is watched directionally at future rescans rather than labeled against a risk band; the sex-independence of the underlying visceral-adiposity evidence still applies to him directly. BMI 26.7 falls in the WHO Overweight range (25-29.9) — WHO BMI thresholds are not sex-specific, and unlike the "over-flagged muscular athlete" caution the Male Client Programming Framework raises for reading BMI in isolation, this BMI reading is concordant with — not contradicted by — his body fat % and lean mass findings below. There is no muscular-athlete false positive to correct for here.</w:t>
+      </w:r>
+    </w:p>
+    <w:p>
+      <w:pPr>
+        <w:spacing w:after="100"/>
+      </w:pPr>
+      <w:r>
+        <w:rPr>
+          <w:rFonts w:ascii="Arial" w:cs="Arial" w:eastAsia="Arial" w:hAnsi="Arial"/>
+          <w:b/>
+          <w:bCs/>
+          <w:color w:val="C9A227"/>
+          <w:sz w:val="17"/>
+          <w:szCs w:val="17"/>
+        </w:rPr>
+        <w:t xml:space="preserve">VFA Framing — Standard Basis for the Trend-Indicator Language:  </w:t>
+      </w:r>
+      <w:r>
+        <w:rPr>
+          <w:rFonts w:ascii="Arial" w:cs="Arial" w:eastAsia="Arial" w:hAnsi="Arial"/>
+          <w:color w:val="2C2C2C"/>
+          <w:sz w:val="17"/>
+          <w:szCs w:val="17"/>
+        </w:rPr>
+        <w:t xml:space="preserve">The VFA framing in the Styku interpretation note above follows CLAUDE.md's VFA section as corrected 8/17/2026, which retired the prior four-tier absolute risk-band table (&lt;70 / 70-99 / 100-149 / ≥150 cm²) in favor of per-client trend tracking. Rationale, for the record: no consensus body endorses a single VAT/VFA cm² cutoff, and Styku's own published VFA validation was against DXA in kilograms rather than CT in cm², so an absolute cm² reading should not be presented as a graded risk classification. Waist circumference against the IAS/ICCR thresholds is the preferred clinical-facing metric if that measurement is ever collected for him.</w:t>
       </w:r>
     </w:p>
     <w:p>

</xml_diff>

<commit_message>
Checkpoint: batch 4 in progress — Vinz Feller and Moe Shahheidari restructured
Agent still working (Daisy Auger Dominguez and Kerry Chandler triage
outstanding). Not audited, not delivered — checkpointed so an interruption
leaves whole work, per the pattern used through batches 3-4.

Kelly Mulroy and Siobhan Hansen docx are regeneration test artifacts from
verifying the weekOverview label override was inert; both confirmed
content-identical to HEAD (zip metadata only).

Co-Authored-By: Claude Fable 5 <noreply@anthropic.com>
Claude-Session: https://claude.ai/code/session_01VTRA12TAy4P16NRVKS4SK5
</commit_message>
<xml_diff>
--- a/clients/moe_shahheidari/Moe_Shahheidari_3Day_Training_Plan.docx
+++ b/clients/moe_shahheidari/Moe_Shahheidari_3Day_Training_Plan.docx
@@ -1650,7 +1650,7 @@
                 <w:sz w:val="16"/>
                 <w:szCs w:val="16"/>
               </w:rPr>
-              <w:t xml:space="preserve">Build progressively via 1-2 RIR — no fixed numeric target</w:t>
+              <w:t xml:space="preserve">Build progressively at 2 RIR — no fixed numeric target</w:t>
             </w:r>
           </w:p>
         </w:tc>
@@ -2076,7 +2076,7 @@
                 <w:sz w:val="16"/>
                 <w:szCs w:val="16"/>
               </w:rPr>
-              <w:t xml:space="preserve">Build progressively via 1-2 RIR — pain-free through the shoulder</w:t>
+              <w:t xml:space="preserve">Build progressively at 2 RIR — pain-free through the shoulder</w:t>
             </w:r>
           </w:p>
         </w:tc>
@@ -2360,7 +2360,7 @@
                 <w:sz w:val="16"/>
                 <w:szCs w:val="16"/>
               </w:rPr>
-              <w:t xml:space="preserve">Build progressively via 1-2 RIR — left leg leads</w:t>
+              <w:t xml:space="preserve">Build progressively at 2 RIR — left leg leads</w:t>
             </w:r>
           </w:p>
         </w:tc>
@@ -3006,6 +3006,106 @@
           <w:rFonts w:ascii="Arial" w:cs="Arial" w:eastAsia="Arial" w:hAnsi="Arial"/>
           <w:b/>
           <w:bCs/>
+          <w:color w:val="1565C0"/>
+          <w:sz w:val="17"/>
+          <w:szCs w:val="17"/>
+        </w:rPr>
+        <w:t xml:space="preserve">Planned Deload — Week 5, Directly After the Week 4 Strength Check:  </w:t>
+      </w:r>
+      <w:r>
+        <w:rPr>
+          <w:rFonts w:ascii="Arial" w:cs="Arial" w:eastAsia="Arial" w:hAnsi="Arial"/>
+          <w:color w:val="2C2C2C"/>
+          <w:sz w:val="17"/>
+          <w:szCs w:val="17"/>
+        </w:rPr>
+        <w:t xml:space="preserve">This program deliberately includes one lighter week, and it is planned rather than a reaction to anything going wrong. Week 5 — immediately after the Week 4 strength check — is a structured reload: the same three days, the same exercises, with working sets cut roughly in half, loads dropped to about 50-70% of the weights being used in Week 4, and every set held comfortably in the technique band with three or more reps left in reserve. No top sets, no personal bests, no max-effort tests that week. With a rotator cuff in active rehabilitation and eight straight weeks of climbing loads on either side of it, this is the week that keeps accumulated fatigue and joint stress from stacking up on a healing shoulder while the strength built in Weeks 1-4 consolidates. One deliberate exception: the rotator cuff and scapular block on Thursday holds its current stage through the deload week rather than either advancing or being cut back — rehab continuity matters more there than the fatigue relief the lighter week is providing everywhere else. One light week costs nothing that matters: muscle built over a month is not lost in a single reduced-volume week, and the small edge of peak strength that dips returns within days. Weeks 6-8 then rebuild from the Week 4 loads.</w:t>
+      </w:r>
+    </w:p>
+    <w:p>
+      <w:pPr>
+        <w:spacing w:after="100"/>
+      </w:pPr>
+      <w:r>
+        <w:rPr>
+          <w:rFonts w:ascii="Arial" w:cs="Arial" w:eastAsia="Arial" w:hAnsi="Arial"/>
+          <w:b/>
+          <w:bCs/>
+          <w:color w:val="C9A227"/>
+          <w:sz w:val="17"/>
+          <w:szCs w:val="17"/>
+        </w:rPr>
+        <w:t xml:space="preserve">How This Program Is Reassessed:  </w:t>
+      </w:r>
+      <w:r>
+        <w:rPr>
+          <w:rFonts w:ascii="Arial" w:cs="Arial" w:eastAsia="Arial" w:hAnsi="Arial"/>
+          <w:color w:val="2C2C2C"/>
+          <w:sz w:val="17"/>
+          <w:szCs w:val="17"/>
+        </w:rPr>
+        <w:t xml:space="preserve">Two separate clocks, and they are not the same measurement. Strength is rechecked every four weeks — the Week 4 numbers in each lift's load line are the checkpoint, and they set the loads for the block that follows. Body composition is rescanned on its own longer cycle, at roughly eight weeks, because composition moves on a slower timeline than strength does. The shoulder runs on a third track entirely: its progression is governed by pain-free range and Jason Bethea's own reassessment, not by the four-week clock — when he moves the cuff work to its next stage, that is the update that matters.</w:t>
+      </w:r>
+    </w:p>
+    <w:p>
+      <w:pPr>
+        <w:spacing w:after="100"/>
+      </w:pPr>
+      <w:r>
+        <w:rPr>
+          <w:rFonts w:ascii="Arial" w:cs="Arial" w:eastAsia="Arial" w:hAnsi="Arial"/>
+          <w:b/>
+          <w:bCs/>
+          <w:color w:val="00695C"/>
+          <w:sz w:val="17"/>
+          <w:szCs w:val="17"/>
+        </w:rPr>
+        <w:t xml:space="preserve">Session Architecture — Restructure Record (8/21/2026):  </w:t>
+      </w:r>
+      <w:r>
+        <w:rPr>
+          <w:rFonts w:ascii="Arial" w:cs="Arial" w:eastAsia="Arial" w:hAnsi="Arial"/>
+          <w:color w:val="2C2C2C"/>
+          <w:sz w:val="17"/>
+          <w:szCs w:val="17"/>
+        </w:rPr>
+        <w:t xml:space="preserve">Clinically-led build: the clinician's structure came first and the six-slot session architecture was fitted around it. Nothing about the rotator cuff protocol was re-derived, rescheduled, or advanced — Day 2's cuff/scapular block keeps its first position ahead of every compound lift, its three prescribed drills, its isometric -&gt; eccentric -&gt; concentric -&gt; dynamic progression, its REHAB/STRENGTH badge override, and its pain-guardrail framing verbatim. Slot 4 (Jason's exercise) omitted on all three days for two different honest reasons: on Day 2 it is CONSUMED BY THE CORRECTIVE SLOT (his Jason-coordinated shoulder work IS block A, and placing it again in slot 4 would double-count it); on Days 1 and 3 there is no documented Jason exercise for a lower-body session. No filler anywhere. New content, all of it real rather than placeholder: Day 1 machine leg work (leg extension + hamstring curl — confirmed inventory, zero shoulder involvement, self-select load), Day 3 a left-led split squat (the loaded lunge pattern the week otherwise never touched, dumbbells at the sides). Day 3's combined core-and-push-up block split into the accessory (push-ups) and integration (plank, with the carry) slots — same exercises, same targets, nothing lost. Antagonist rotation re-walked on the full rendered order across block boundaries: Day 1 runs leg extension before hamstring curl so Glute Bridge -&gt; Hex Deadlift -&gt; Hamstring Curl is never three consecutive posterior-chain; Day 2 alternates push/pull throughout; Day 3 runs hinge -&gt; push -&gt; knee -&gt; carry.</w:t>
+      </w:r>
+    </w:p>
+    <w:p>
+      <w:pPr>
+        <w:spacing w:after="100"/>
+      </w:pPr>
+      <w:r>
+        <w:rPr>
+          <w:rFonts w:ascii="Arial" w:cs="Arial" w:eastAsia="Arial" w:hAnsi="Arial"/>
+          <w:b/>
+          <w:bCs/>
+          <w:color w:val="00695C"/>
+          <w:sz w:val="17"/>
+          <w:szCs w:val="17"/>
+        </w:rPr>
+        <w:t xml:space="preserve">Shoulder-Reintroduction Standard &amp; Options Filtering — Selection Record (8/21/2026):  </w:t>
+      </w:r>
+      <w:r>
+        <w:rPr>
+          <w:rFonts w:ascii="Arial" w:cs="Arial" w:eastAsia="Arial" w:hAnsi="Arial"/>
+          <w:color w:val="2C2C2C"/>
+          <w:sz w:val="17"/>
+          <w:szCs w:val="17"/>
+        </w:rPr>
+        <w:t xml:space="preserve">This program reintroduces and progresses overhead pressing, so the shoulder-reintroduction standard binds. Two consequences, both applied: (1) the overhead press is now immediately followed by a static closed-chain hold — plank shoulder taps, with the quadruped/knees-down regression named in the exercise's own flag field — re-anchoring scapular control on a stable base straight after open-chain overhead loading; (2) the scapular block carries a real options menu (band pull-apart, scapular retraction-depression hold, scapular push-up, prone I's alongside the Y-T-W's, face pull, wall slide with lift-off) rather than one default set repeated by rote. Both additions are bodyweight, both name a regression, and neither advances his loading past what his record already documents — push-ups at 3 x 10-14 were already prescribed and tolerated, and the Day 2 closer is deliberately a bear crawl HOLD rather than a travelling crawl for the same reason. Every compound-slot options menu was filtered against his documented pain-free protocol before being written, and the exclusions are stated in the document rather than silently omitted: no barbell bench press (fixed bar path removes the shoulder's ability to find its own line), no front-rack barbell squat (end-range external rotation under load), no hanging or dead-hang scapular work (traction on a healing cuff), no end-range overhead loading beyond the prescribed press. Front-rack kettlebell carries are offered conditionally. RIR note for the record: the hypertrophy accessories are held at 2 RIR rather than the 1 RIR a healthy client's accessory work would use — with the cuff in active rehab the extra rep of margin is worth more than the last increment of stimulus, and the document says so plainly rather than leaving it as an unexplained inconsistency.</w:t>
+      </w:r>
+    </w:p>
+    <w:p>
+      <w:pPr>
+        <w:spacing w:after="100"/>
+      </w:pPr>
+      <w:r>
+        <w:rPr>
+          <w:rFonts w:ascii="Arial" w:cs="Arial" w:eastAsia="Arial" w:hAnsi="Arial"/>
+          <w:b/>
+          <w:bCs/>
           <w:color w:val="C9A227"/>
           <w:sz w:val="17"/>
           <w:szCs w:val="17"/>
@@ -3019,7 +3119,7 @@
           <w:sz w:val="17"/>
           <w:szCs w:val="17"/>
         </w:rPr>
-        <w:t xml:space="preserve">General strength and conditioning development, built around a rotator cuff tear currently in active rehabilitation coordinated with Jason Bethea — this is a program that actively rebuilds the shoulder, not one that avoids it. This 3-day build applies the ICONS three-zone philosophy (Isolated activation/corrective strengthening → Compound strength → Metabolic conditioning finisher) across a Lower Body / Upper Body / Full-Body split, with Day 2 carrying the dedicated rotator cuff and scapular strengthening work ahead of its compound pressing, and every primary and secondary lift autoregulated on RIR and pain-free range of motion rather than a fixed percentage grind.</w:t>
+        <w:t xml:space="preserve">General strength and conditioning development, built around a rotator cuff tear currently in active rehabilitation coordinated with Jason Bethea — this is a program that actively rebuilds the shoulder, not one that avoids it. This 3-day build applies the ICONS three-zone philosophy (Isolated activation/corrective strengthening → Compound strength → Metabolic conditioning finisher) across a Lower Body / Upper Body / Full-Body split. Every session runs the same shape: a corrective opener, a primary compound lift, muscle-building accessory work, a second compound lift in a different pattern, and a closing movement that pulls the day together — a loaded carry, or on Thursday a closed-chain hold that asks the whole shoulder girdle to support the body on a stable base. Day 2 carries the dedicated rotator cuff and scapular strengthening work first, ahead of every compound lift. Each compound lift lists alternates the coach can rotate to on the day, and every one of those alternates has been checked against the shoulder protocol before it appears — a few common variations are deliberately left off the lists, and the document says which and why rather than leaving it unexplained. Every primary and secondary lift is autoregulated on reps in reserve and pain-free range of motion rather than a fixed percentage grind.</w:t>
       </w:r>
     </w:p>
     <w:p>
@@ -3194,7 +3294,7 @@
           <w:sz w:val="17"/>
           <w:szCs w:val="17"/>
         </w:rPr>
-        <w:t xml:space="preserve">Primary strength day for the week — the last 1-2 reps on the deadlift should be hard but clean. Control precedes power: the corrective block below earns full-depth, braced positions before any load goes on the bar. No shoulder-specific concern in the primary lifts today; the loaded carry-prep work at the end still loads the shoulder girdle isometrically, so the same pain-monitoring rule applies there too.</w:t>
+        <w:t xml:space="preserve">Primary strength day for the week — the deadlift should finish with two clean reps still in reserve: hard, but never a grind. Control precedes power: the corrective block below earns full-depth, braced positions before any load goes on the bar. No shoulder-specific concern in the primary lifts today; the loaded carry that closes the session still loads the shoulder girdle isometrically, so the same pain-monitoring rule applies there too.</w:t>
       </w:r>
     </w:p>
     <w:p>
@@ -3235,7 +3335,7 @@
           <w:sz w:val="17"/>
           <w:szCs w:val="17"/>
         </w:rPr>
-        <w:t xml:space="preserve">A — HIP &amp; POSTERIOR CHAIN ACTIVATION</w:t>
+        <w:t xml:space="preserve">A — CORRECTIVE — HIP &amp; POSTERIOR CHAIN ACTIVATION</w:t>
       </w:r>
     </w:p>
     <w:p>
@@ -4237,7 +4337,7 @@
           <w:sz w:val="17"/>
           <w:szCs w:val="17"/>
         </w:rPr>
-        <w:t xml:space="preserve">B — PRIMARY STRENGTH — HEX BAR DEADLIFT</w:t>
+        <w:t xml:space="preserve">B — PRIMARY COMPOUND — HEX BAR DEADLIFT</w:t>
       </w:r>
     </w:p>
     <w:p>
@@ -4262,7 +4362,7 @@
           <w:sz w:val="17"/>
           <w:szCs w:val="17"/>
         </w:rPr>
-        <w:t xml:space="preserve">Week 1 working load 180 lbs (80% of est. 1RM 222) — 1 RIR on top sets. Add load only at the top of the rep range with clean form.</w:t>
+        <w:t xml:space="preserve">Week 1 working load 180 lbs (80% of est. 1RM 222), building toward roughly 190 lbs by Week 4 — two reps in reserve on the top set, which is the working standard for a primary lift. Add load only at the top of the rep range with clean form. If the day calls for a variation, rotate between: a conventional barbell deadlift (longer lever, a more demanding brace), a barbell Romanian deadlift (same hinge, longer hamstring range, lighter load), or a rack/block pull (a shortened range for a day the floor position isn't clean). All three keep the shoulder in the same neutral, hanging position the hex bar does — nothing here asks the cuff to stabilize overhead. The hex bar deadlift stays the lift that gets tracked and retested.</w:t>
       </w:r>
     </w:p>
     <w:tbl>
@@ -4661,7 +4761,7 @@
                 <w:sz w:val="15"/>
                 <w:szCs w:val="15"/>
               </w:rPr>
-              <w:t xml:space="preserve">180 lbs (Wk1)</w:t>
+              <w:t xml:space="preserve">Wk1: 180 → Wk4: 190 lbs</w:t>
             </w:r>
           </w:p>
         </w:tc>
@@ -4757,7 +4857,7 @@
                 <w:sz w:val="17"/>
                 <w:szCs w:val="17"/>
               </w:rPr>
-              <w:t xml:space="preserve">Neutral spine, brace hard. 1 RIR on top set.</w:t>
+              <w:t xml:space="preserve">Neutral spine, brace hard. Stop with 2 reps left.</w:t>
             </w:r>
             <w:r>
               <w:rPr>
@@ -4768,7 +4868,7 @@
                 <w:sz w:val="14"/>
                 <w:szCs w:val="14"/>
               </w:rPr>
-              <w:t xml:space="preserve">  1 RIR top set</w:t>
+              <w:t xml:space="preserve">  2 RIR top set</w:t>
             </w:r>
           </w:p>
         </w:tc>
@@ -4792,7 +4892,802 @@
           <w:sz w:val="17"/>
           <w:szCs w:val="17"/>
         </w:rPr>
-        <w:t xml:space="preserve">C — SECONDARY COMPOUND — BACK SQUAT</w:t>
+        <w:t xml:space="preserve">C — ACCESSORY — QUAD &amp; HAMSTRING HYPERTROPHY</w:t>
+      </w:r>
+    </w:p>
+    <w:p>
+      <w:pPr>
+        <w:spacing w:after="80"/>
+      </w:pPr>
+      <w:r>
+        <w:rPr>
+          <w:rFonts w:ascii="Arial" w:cs="Arial" w:eastAsia="Arial" w:hAnsi="Arial"/>
+          <w:b/>
+          <w:bCs/>
+          <w:color w:val="C9A227"/>
+          <w:sz w:val="17"/>
+          <w:szCs w:val="17"/>
+        </w:rPr>
+        <w:t xml:space="preserve">Format:  </w:t>
+      </w:r>
+      <w:r>
+        <w:rPr>
+          <w:rFonts w:ascii="Arial" w:cs="Arial" w:eastAsia="Arial" w:hAnsi="Arial"/>
+          <w:color w:val="2C2C2C"/>
+          <w:sz w:val="17"/>
+          <w:szCs w:val="17"/>
+        </w:rPr>
+        <w:t xml:space="preserve">Direct muscle-building work for the legs, machine-based so it can be pushed hard without adding spinal load after the deadlift — and with no shoulder involvement at all, which makes it the easiest hard work in the week right now. The leg extension primes the knee-dominant pattern for the squat that follows; the hamstring curl trains knee flexion, which the hinge above never reaches. There is no tested baseline on either machine yet, so load is self-selected and logged weekly.</w:t>
+      </w:r>
+    </w:p>
+    <w:tbl>
+      <w:tblPr>
+        <w:tblW w:type="dxa" w:w="10440"/>
+        <w:tblBorders>
+          <w:top w:val="none" w:color="FFFFFF" w:sz="0"/>
+          <w:left w:val="none" w:color="FFFFFF" w:sz="0"/>
+          <w:bottom w:val="none" w:color="FFFFFF" w:sz="0"/>
+          <w:right w:val="none" w:color="FFFFFF" w:sz="0"/>
+          <w:insideH w:val="single" w:color="auto" w:sz="4"/>
+          <w:insideV w:val="single" w:color="auto" w:sz="4"/>
+        </w:tblBorders>
+      </w:tblPr>
+      <w:tblGrid>
+        <w:gridCol w:w="2400"/>
+        <w:gridCol w:w="380"/>
+        <w:gridCol w:w="420"/>
+        <w:gridCol w:w="680"/>
+        <w:gridCol w:w="540"/>
+        <w:gridCol w:w="440"/>
+        <w:gridCol w:w="5580"/>
+      </w:tblGrid>
+      <w:tr>
+        <w:tc>
+          <w:tcPr>
+            <w:tcW w:type="dxa" w:w="2400"/>
+            <w:tcBorders>
+              <w:top w:val="none" w:color="FFFFFF" w:sz="0"/>
+              <w:left w:val="none" w:color="FFFFFF" w:sz="0"/>
+              <w:bottom w:val="none" w:color="FFFFFF" w:sz="0"/>
+              <w:right w:val="none" w:color="FFFFFF" w:sz="0"/>
+            </w:tcBorders>
+            <w:shd w:fill="F5E8C0" w:color="auto" w:val="clear"/>
+            <w:tcMar>
+              <w:top w:type="dxa" w:w="40"/>
+              <w:left w:type="dxa" w:w="80"/>
+              <w:bottom w:type="dxa" w:w="40"/>
+              <w:right w:type="dxa" w:w="80"/>
+            </w:tcMar>
+            <w:vAlign w:val="center"/>
+          </w:tcPr>
+          <w:p>
+            <w:pPr>
+              <w:jc w:val="left"/>
+            </w:pPr>
+            <w:r>
+              <w:rPr>
+                <w:rFonts w:ascii="Arial" w:cs="Arial" w:eastAsia="Arial" w:hAnsi="Arial"/>
+                <w:b/>
+                <w:bCs/>
+                <w:color w:val="C9A227"/>
+                <w:sz w:val="15"/>
+                <w:szCs w:val="15"/>
+              </w:rPr>
+              <w:t xml:space="preserve">EXERCISE</w:t>
+            </w:r>
+          </w:p>
+        </w:tc>
+        <w:tc>
+          <w:tcPr>
+            <w:tcW w:type="dxa" w:w="380"/>
+            <w:tcBorders>
+              <w:top w:val="none" w:color="FFFFFF" w:sz="0"/>
+              <w:left w:val="none" w:color="FFFFFF" w:sz="0"/>
+              <w:bottom w:val="none" w:color="FFFFFF" w:sz="0"/>
+              <w:right w:val="none" w:color="FFFFFF" w:sz="0"/>
+            </w:tcBorders>
+            <w:shd w:fill="F5E8C0" w:color="auto" w:val="clear"/>
+            <w:tcMar>
+              <w:top w:type="dxa" w:w="40"/>
+              <w:left w:type="dxa" w:w="80"/>
+              <w:bottom w:type="dxa" w:w="40"/>
+              <w:right w:type="dxa" w:w="80"/>
+            </w:tcMar>
+            <w:vAlign w:val="center"/>
+          </w:tcPr>
+          <w:p>
+            <w:pPr>
+              <w:jc w:val="center"/>
+            </w:pPr>
+            <w:r>
+              <w:rPr>
+                <w:rFonts w:ascii="Arial" w:cs="Arial" w:eastAsia="Arial" w:hAnsi="Arial"/>
+                <w:b/>
+                <w:bCs/>
+                <w:color w:val="C9A227"/>
+                <w:sz w:val="13"/>
+                <w:szCs w:val="13"/>
+              </w:rPr>
+              <w:t xml:space="preserve">SETS</w:t>
+            </w:r>
+          </w:p>
+        </w:tc>
+        <w:tc>
+          <w:tcPr>
+            <w:tcW w:type="dxa" w:w="420"/>
+            <w:tcBorders>
+              <w:top w:val="none" w:color="FFFFFF" w:sz="0"/>
+              <w:left w:val="none" w:color="FFFFFF" w:sz="0"/>
+              <w:bottom w:val="none" w:color="FFFFFF" w:sz="0"/>
+              <w:right w:val="none" w:color="FFFFFF" w:sz="0"/>
+            </w:tcBorders>
+            <w:shd w:fill="F5E8C0" w:color="auto" w:val="clear"/>
+            <w:tcMar>
+              <w:top w:type="dxa" w:w="40"/>
+              <w:left w:type="dxa" w:w="80"/>
+              <w:bottom w:type="dxa" w:w="40"/>
+              <w:right w:type="dxa" w:w="80"/>
+            </w:tcMar>
+            <w:vAlign w:val="center"/>
+          </w:tcPr>
+          <w:p>
+            <w:pPr>
+              <w:jc w:val="center"/>
+            </w:pPr>
+            <w:r>
+              <w:rPr>
+                <w:rFonts w:ascii="Arial" w:cs="Arial" w:eastAsia="Arial" w:hAnsi="Arial"/>
+                <w:b/>
+                <w:bCs/>
+                <w:color w:val="C9A227"/>
+                <w:sz w:val="13"/>
+                <w:szCs w:val="13"/>
+              </w:rPr>
+              <w:t xml:space="preserve">REPS</w:t>
+            </w:r>
+          </w:p>
+        </w:tc>
+        <w:tc>
+          <w:tcPr>
+            <w:tcW w:type="dxa" w:w="680"/>
+            <w:tcBorders>
+              <w:top w:val="none" w:color="FFFFFF" w:sz="0"/>
+              <w:left w:val="none" w:color="FFFFFF" w:sz="0"/>
+              <w:bottom w:val="none" w:color="FFFFFF" w:sz="0"/>
+              <w:right w:val="none" w:color="FFFFFF" w:sz="0"/>
+            </w:tcBorders>
+            <w:shd w:fill="F5E8C0" w:color="auto" w:val="clear"/>
+            <w:tcMar>
+              <w:top w:type="dxa" w:w="40"/>
+              <w:left w:type="dxa" w:w="80"/>
+              <w:bottom w:type="dxa" w:w="40"/>
+              <w:right w:type="dxa" w:w="80"/>
+            </w:tcMar>
+            <w:vAlign w:val="center"/>
+          </w:tcPr>
+          <w:p>
+            <w:pPr>
+              <w:jc w:val="center"/>
+            </w:pPr>
+            <w:r>
+              <w:rPr>
+                <w:rFonts w:ascii="Arial" w:cs="Arial" w:eastAsia="Arial" w:hAnsi="Arial"/>
+                <w:b/>
+                <w:bCs/>
+                <w:color w:val="C9A227"/>
+                <w:sz w:val="13"/>
+                <w:szCs w:val="13"/>
+              </w:rPr>
+              <w:t xml:space="preserve">LOAD</w:t>
+            </w:r>
+          </w:p>
+        </w:tc>
+        <w:tc>
+          <w:tcPr>
+            <w:tcW w:type="dxa" w:w="540"/>
+            <w:tcBorders>
+              <w:top w:val="none" w:color="FFFFFF" w:sz="0"/>
+              <w:left w:val="none" w:color="FFFFFF" w:sz="0"/>
+              <w:bottom w:val="none" w:color="FFFFFF" w:sz="0"/>
+              <w:right w:val="none" w:color="FFFFFF" w:sz="0"/>
+            </w:tcBorders>
+            <w:shd w:fill="F5E8C0" w:color="auto" w:val="clear"/>
+            <w:tcMar>
+              <w:top w:type="dxa" w:w="40"/>
+              <w:left w:type="dxa" w:w="80"/>
+              <w:bottom w:type="dxa" w:w="40"/>
+              <w:right w:type="dxa" w:w="80"/>
+            </w:tcMar>
+            <w:vAlign w:val="center"/>
+          </w:tcPr>
+          <w:p>
+            <w:pPr>
+              <w:jc w:val="center"/>
+            </w:pPr>
+            <w:r>
+              <w:rPr>
+                <w:rFonts w:ascii="Arial" w:cs="Arial" w:eastAsia="Arial" w:hAnsi="Arial"/>
+                <w:b/>
+                <w:bCs/>
+                <w:color w:val="C9A227"/>
+                <w:sz w:val="13"/>
+                <w:szCs w:val="13"/>
+              </w:rPr>
+              <w:t xml:space="preserve">TEMPO</w:t>
+            </w:r>
+          </w:p>
+        </w:tc>
+        <w:tc>
+          <w:tcPr>
+            <w:tcW w:type="dxa" w:w="440"/>
+            <w:tcBorders>
+              <w:top w:val="none" w:color="FFFFFF" w:sz="0"/>
+              <w:left w:val="none" w:color="FFFFFF" w:sz="0"/>
+              <w:bottom w:val="none" w:color="FFFFFF" w:sz="0"/>
+              <w:right w:val="none" w:color="FFFFFF" w:sz="0"/>
+            </w:tcBorders>
+            <w:shd w:fill="F5E8C0" w:color="auto" w:val="clear"/>
+            <w:tcMar>
+              <w:top w:type="dxa" w:w="40"/>
+              <w:left w:type="dxa" w:w="80"/>
+              <w:bottom w:type="dxa" w:w="40"/>
+              <w:right w:type="dxa" w:w="80"/>
+            </w:tcMar>
+            <w:vAlign w:val="center"/>
+          </w:tcPr>
+          <w:p>
+            <w:pPr>
+              <w:jc w:val="center"/>
+            </w:pPr>
+            <w:r>
+              <w:rPr>
+                <w:rFonts w:ascii="Arial" w:cs="Arial" w:eastAsia="Arial" w:hAnsi="Arial"/>
+                <w:b/>
+                <w:bCs/>
+                <w:color w:val="C9A227"/>
+                <w:sz w:val="13"/>
+                <w:szCs w:val="13"/>
+              </w:rPr>
+              <w:t xml:space="preserve">REST</w:t>
+            </w:r>
+          </w:p>
+        </w:tc>
+        <w:tc>
+          <w:tcPr>
+            <w:tcW w:type="dxa" w:w="5580"/>
+            <w:tcBorders>
+              <w:top w:val="none" w:color="FFFFFF" w:sz="0"/>
+              <w:left w:val="none" w:color="FFFFFF" w:sz="0"/>
+              <w:bottom w:val="none" w:color="FFFFFF" w:sz="0"/>
+              <w:right w:val="none" w:color="FFFFFF" w:sz="0"/>
+            </w:tcBorders>
+            <w:shd w:fill="F5E8C0" w:color="auto" w:val="clear"/>
+            <w:tcMar>
+              <w:top w:type="dxa" w:w="40"/>
+              <w:left w:type="dxa" w:w="80"/>
+              <w:bottom w:type="dxa" w:w="40"/>
+              <w:right w:type="dxa" w:w="80"/>
+            </w:tcMar>
+            <w:vAlign w:val="center"/>
+          </w:tcPr>
+          <w:p>
+            <w:pPr>
+              <w:jc w:val="left"/>
+            </w:pPr>
+            <w:r>
+              <w:rPr>
+                <w:rFonts w:ascii="Arial" w:cs="Arial" w:eastAsia="Arial" w:hAnsi="Arial"/>
+                <w:b/>
+                <w:bCs/>
+                <w:color w:val="C9A227"/>
+                <w:sz w:val="15"/>
+                <w:szCs w:val="15"/>
+              </w:rPr>
+              <w:t xml:space="preserve">COACHING CUE</w:t>
+            </w:r>
+          </w:p>
+        </w:tc>
+      </w:tr>
+      <w:tr>
+        <w:tc>
+          <w:tcPr>
+            <w:tcW w:type="dxa" w:w="2400"/>
+            <w:tcBorders>
+              <w:top w:val="none" w:color="FFFFFF" w:sz="0"/>
+              <w:left w:val="none" w:color="FFFFFF" w:sz="0"/>
+              <w:bottom w:val="none" w:color="FFFFFF" w:sz="0"/>
+              <w:right w:val="none" w:color="FFFFFF" w:sz="0"/>
+            </w:tcBorders>
+            <w:shd w:fill="FAF3E0" w:color="auto" w:val="clear"/>
+            <w:tcMar>
+              <w:top w:type="dxa" w:w="40"/>
+              <w:left w:type="dxa" w:w="80"/>
+              <w:bottom w:type="dxa" w:w="40"/>
+              <w:right w:type="dxa" w:w="80"/>
+            </w:tcMar>
+            <w:vAlign w:val="center"/>
+          </w:tcPr>
+          <w:p>
+            <w:r>
+              <w:rPr>
+                <w:rFonts w:ascii="Arial" w:cs="Arial" w:eastAsia="Arial" w:hAnsi="Arial"/>
+                <w:b/>
+                <w:bCs/>
+                <w:color w:val="2C2C2C"/>
+                <w:sz w:val="18"/>
+                <w:szCs w:val="18"/>
+              </w:rPr>
+              <w:t xml:space="preserve">Leg Extension</w:t>
+            </w:r>
+          </w:p>
+        </w:tc>
+        <w:tc>
+          <w:tcPr>
+            <w:tcW w:type="dxa" w:w="380"/>
+            <w:tcBorders>
+              <w:top w:val="none" w:color="FFFFFF" w:sz="0"/>
+              <w:left w:val="none" w:color="FFFFFF" w:sz="0"/>
+              <w:bottom w:val="none" w:color="FFFFFF" w:sz="0"/>
+              <w:right w:val="none" w:color="FFFFFF" w:sz="0"/>
+            </w:tcBorders>
+            <w:shd w:fill="FAF3E0" w:color="auto" w:val="clear"/>
+            <w:tcMar>
+              <w:top w:type="dxa" w:w="40"/>
+              <w:left w:type="dxa" w:w="80"/>
+              <w:bottom w:type="dxa" w:w="40"/>
+              <w:right w:type="dxa" w:w="80"/>
+            </w:tcMar>
+            <w:vAlign w:val="center"/>
+          </w:tcPr>
+          <w:p>
+            <w:pPr>
+              <w:jc w:val="center"/>
+            </w:pPr>
+            <w:r>
+              <w:rPr>
+                <w:rFonts w:ascii="Arial" w:cs="Arial" w:eastAsia="Arial" w:hAnsi="Arial"/>
+                <w:color w:val="6B6B6B"/>
+                <w:sz w:val="15"/>
+                <w:szCs w:val="15"/>
+              </w:rPr>
+              <w:t xml:space="preserve">3</w:t>
+            </w:r>
+          </w:p>
+        </w:tc>
+        <w:tc>
+          <w:tcPr>
+            <w:tcW w:type="dxa" w:w="420"/>
+            <w:tcBorders>
+              <w:top w:val="none" w:color="FFFFFF" w:sz="0"/>
+              <w:left w:val="none" w:color="FFFFFF" w:sz="0"/>
+              <w:bottom w:val="none" w:color="FFFFFF" w:sz="0"/>
+              <w:right w:val="none" w:color="FFFFFF" w:sz="0"/>
+            </w:tcBorders>
+            <w:shd w:fill="FAF3E0" w:color="auto" w:val="clear"/>
+            <w:tcMar>
+              <w:top w:type="dxa" w:w="40"/>
+              <w:left w:type="dxa" w:w="80"/>
+              <w:bottom w:type="dxa" w:w="40"/>
+              <w:right w:type="dxa" w:w="80"/>
+            </w:tcMar>
+            <w:vAlign w:val="center"/>
+          </w:tcPr>
+          <w:p>
+            <w:pPr>
+              <w:jc w:val="center"/>
+            </w:pPr>
+            <w:r>
+              <w:rPr>
+                <w:rFonts w:ascii="Arial" w:cs="Arial" w:eastAsia="Arial" w:hAnsi="Arial"/>
+                <w:color w:val="6B6B6B"/>
+                <w:sz w:val="15"/>
+                <w:szCs w:val="15"/>
+              </w:rPr>
+              <w:t xml:space="preserve">10–12</w:t>
+            </w:r>
+          </w:p>
+        </w:tc>
+        <w:tc>
+          <w:tcPr>
+            <w:tcW w:type="dxa" w:w="680"/>
+            <w:tcBorders>
+              <w:top w:val="none" w:color="FFFFFF" w:sz="0"/>
+              <w:left w:val="none" w:color="FFFFFF" w:sz="0"/>
+              <w:bottom w:val="none" w:color="FFFFFF" w:sz="0"/>
+              <w:right w:val="none" w:color="FFFFFF" w:sz="0"/>
+            </w:tcBorders>
+            <w:shd w:fill="FAF3E0" w:color="auto" w:val="clear"/>
+            <w:tcMar>
+              <w:top w:type="dxa" w:w="40"/>
+              <w:left w:type="dxa" w:w="80"/>
+              <w:bottom w:type="dxa" w:w="40"/>
+              <w:right w:type="dxa" w:w="80"/>
+            </w:tcMar>
+            <w:vAlign w:val="center"/>
+          </w:tcPr>
+          <w:p>
+            <w:pPr>
+              <w:jc w:val="center"/>
+            </w:pPr>
+            <w:r>
+              <w:rPr>
+                <w:rFonts w:ascii="Arial" w:cs="Arial" w:eastAsia="Arial" w:hAnsi="Arial"/>
+                <w:color w:val="6B6B6B"/>
+                <w:sz w:val="15"/>
+                <w:szCs w:val="15"/>
+              </w:rPr>
+              <w:t xml:space="preserve">Self-select at 2 RIR</w:t>
+            </w:r>
+          </w:p>
+        </w:tc>
+        <w:tc>
+          <w:tcPr>
+            <w:tcW w:type="dxa" w:w="540"/>
+            <w:tcBorders>
+              <w:top w:val="none" w:color="FFFFFF" w:sz="0"/>
+              <w:left w:val="none" w:color="FFFFFF" w:sz="0"/>
+              <w:bottom w:val="none" w:color="FFFFFF" w:sz="0"/>
+              <w:right w:val="none" w:color="FFFFFF" w:sz="0"/>
+            </w:tcBorders>
+            <w:shd w:fill="FAF3E0" w:color="auto" w:val="clear"/>
+            <w:tcMar>
+              <w:top w:type="dxa" w:w="40"/>
+              <w:left w:type="dxa" w:w="80"/>
+              <w:bottom w:type="dxa" w:w="40"/>
+              <w:right w:type="dxa" w:w="80"/>
+            </w:tcMar>
+            <w:vAlign w:val="center"/>
+          </w:tcPr>
+          <w:p>
+            <w:pPr>
+              <w:jc w:val="center"/>
+            </w:pPr>
+            <w:r>
+              <w:rPr>
+                <w:rFonts w:ascii="Arial" w:cs="Arial" w:eastAsia="Arial" w:hAnsi="Arial"/>
+                <w:color w:val="6B6B6B"/>
+                <w:sz w:val="15"/>
+                <w:szCs w:val="15"/>
+              </w:rPr>
+              <w:t xml:space="preserve">2-1-2</w:t>
+            </w:r>
+          </w:p>
+        </w:tc>
+        <w:tc>
+          <w:tcPr>
+            <w:tcW w:type="dxa" w:w="440"/>
+            <w:tcBorders>
+              <w:top w:val="none" w:color="FFFFFF" w:sz="0"/>
+              <w:left w:val="none" w:color="FFFFFF" w:sz="0"/>
+              <w:bottom w:val="none" w:color="FFFFFF" w:sz="0"/>
+              <w:right w:val="none" w:color="FFFFFF" w:sz="0"/>
+            </w:tcBorders>
+            <w:shd w:fill="FAF3E0" w:color="auto" w:val="clear"/>
+            <w:tcMar>
+              <w:top w:type="dxa" w:w="40"/>
+              <w:left w:type="dxa" w:w="80"/>
+              <w:bottom w:type="dxa" w:w="40"/>
+              <w:right w:type="dxa" w:w="80"/>
+            </w:tcMar>
+            <w:vAlign w:val="center"/>
+          </w:tcPr>
+          <w:p>
+            <w:pPr>
+              <w:jc w:val="center"/>
+            </w:pPr>
+            <w:r>
+              <w:rPr>
+                <w:rFonts w:ascii="Arial" w:cs="Arial" w:eastAsia="Arial" w:hAnsi="Arial"/>
+                <w:color w:val="6B6B6B"/>
+                <w:sz w:val="15"/>
+                <w:szCs w:val="15"/>
+              </w:rPr>
+              <w:t xml:space="preserve">60s</w:t>
+            </w:r>
+          </w:p>
+        </w:tc>
+        <w:tc>
+          <w:tcPr>
+            <w:tcW w:type="dxa" w:w="5580"/>
+            <w:tcBorders>
+              <w:top w:val="none" w:color="FFFFFF" w:sz="0"/>
+              <w:left w:val="none" w:color="FFFFFF" w:sz="0"/>
+              <w:bottom w:val="none" w:color="FFFFFF" w:sz="0"/>
+              <w:right w:val="none" w:color="FFFFFF" w:sz="0"/>
+            </w:tcBorders>
+            <w:shd w:fill="FAF3E0" w:color="auto" w:val="clear"/>
+            <w:tcMar>
+              <w:top w:type="dxa" w:w="40"/>
+              <w:left w:type="dxa" w:w="80"/>
+              <w:bottom w:type="dxa" w:w="40"/>
+              <w:right w:type="dxa" w:w="80"/>
+            </w:tcMar>
+            <w:vAlign w:val="center"/>
+          </w:tcPr>
+          <w:p>
+            <w:r>
+              <w:rPr>
+                <w:rFonts w:ascii="Arial" w:cs="Arial" w:eastAsia="Arial" w:hAnsi="Arial"/>
+                <w:color w:val="6B6B6B"/>
+                <w:sz w:val="17"/>
+                <w:szCs w:val="17"/>
+              </w:rPr>
+              <w:t xml:space="preserve">Full lockout, controlled lower. Log the setting weekly.</w:t>
+            </w:r>
+            <w:r>
+              <w:rPr>
+                <w:rFonts w:ascii="Arial" w:cs="Arial" w:eastAsia="Arial" w:hAnsi="Arial"/>
+                <w:i/>
+                <w:iCs/>
+                <w:color w:val="00695C"/>
+                <w:sz w:val="14"/>
+                <w:szCs w:val="14"/>
+              </w:rPr>
+              <w:t xml:space="preserve">  2 RIR</w:t>
+            </w:r>
+          </w:p>
+        </w:tc>
+      </w:tr>
+      <w:tr>
+        <w:tc>
+          <w:tcPr>
+            <w:tcW w:type="dxa" w:w="2400"/>
+            <w:tcBorders>
+              <w:top w:val="none" w:color="FFFFFF" w:sz="0"/>
+              <w:left w:val="none" w:color="FFFFFF" w:sz="0"/>
+              <w:bottom w:val="none" w:color="FFFFFF" w:sz="0"/>
+              <w:right w:val="none" w:color="FFFFFF" w:sz="0"/>
+            </w:tcBorders>
+            <w:shd w:fill="FFFFFF" w:color="auto" w:val="clear"/>
+            <w:tcMar>
+              <w:top w:type="dxa" w:w="40"/>
+              <w:left w:type="dxa" w:w="80"/>
+              <w:bottom w:type="dxa" w:w="40"/>
+              <w:right w:type="dxa" w:w="80"/>
+            </w:tcMar>
+            <w:vAlign w:val="center"/>
+          </w:tcPr>
+          <w:p>
+            <w:r>
+              <w:rPr>
+                <w:rFonts w:ascii="Arial" w:cs="Arial" w:eastAsia="Arial" w:hAnsi="Arial"/>
+                <w:b/>
+                <w:bCs/>
+                <w:color w:val="2C2C2C"/>
+                <w:sz w:val="18"/>
+                <w:szCs w:val="18"/>
+              </w:rPr>
+              <w:t xml:space="preserve">Lying/Seated Hamstring Curl</w:t>
+            </w:r>
+          </w:p>
+        </w:tc>
+        <w:tc>
+          <w:tcPr>
+            <w:tcW w:type="dxa" w:w="380"/>
+            <w:tcBorders>
+              <w:top w:val="none" w:color="FFFFFF" w:sz="0"/>
+              <w:left w:val="none" w:color="FFFFFF" w:sz="0"/>
+              <w:bottom w:val="none" w:color="FFFFFF" w:sz="0"/>
+              <w:right w:val="none" w:color="FFFFFF" w:sz="0"/>
+            </w:tcBorders>
+            <w:shd w:fill="FFFFFF" w:color="auto" w:val="clear"/>
+            <w:tcMar>
+              <w:top w:type="dxa" w:w="40"/>
+              <w:left w:type="dxa" w:w="80"/>
+              <w:bottom w:type="dxa" w:w="40"/>
+              <w:right w:type="dxa" w:w="80"/>
+            </w:tcMar>
+            <w:vAlign w:val="center"/>
+          </w:tcPr>
+          <w:p>
+            <w:pPr>
+              <w:jc w:val="center"/>
+            </w:pPr>
+            <w:r>
+              <w:rPr>
+                <w:rFonts w:ascii="Arial" w:cs="Arial" w:eastAsia="Arial" w:hAnsi="Arial"/>
+                <w:color w:val="6B6B6B"/>
+                <w:sz w:val="15"/>
+                <w:szCs w:val="15"/>
+              </w:rPr>
+              <w:t xml:space="preserve">3</w:t>
+            </w:r>
+          </w:p>
+        </w:tc>
+        <w:tc>
+          <w:tcPr>
+            <w:tcW w:type="dxa" w:w="420"/>
+            <w:tcBorders>
+              <w:top w:val="none" w:color="FFFFFF" w:sz="0"/>
+              <w:left w:val="none" w:color="FFFFFF" w:sz="0"/>
+              <w:bottom w:val="none" w:color="FFFFFF" w:sz="0"/>
+              <w:right w:val="none" w:color="FFFFFF" w:sz="0"/>
+            </w:tcBorders>
+            <w:shd w:fill="FFFFFF" w:color="auto" w:val="clear"/>
+            <w:tcMar>
+              <w:top w:type="dxa" w:w="40"/>
+              <w:left w:type="dxa" w:w="80"/>
+              <w:bottom w:type="dxa" w:w="40"/>
+              <w:right w:type="dxa" w:w="80"/>
+            </w:tcMar>
+            <w:vAlign w:val="center"/>
+          </w:tcPr>
+          <w:p>
+            <w:pPr>
+              <w:jc w:val="center"/>
+            </w:pPr>
+            <w:r>
+              <w:rPr>
+                <w:rFonts w:ascii="Arial" w:cs="Arial" w:eastAsia="Arial" w:hAnsi="Arial"/>
+                <w:color w:val="6B6B6B"/>
+                <w:sz w:val="15"/>
+                <w:szCs w:val="15"/>
+              </w:rPr>
+              <w:t xml:space="preserve">10–12</w:t>
+            </w:r>
+          </w:p>
+        </w:tc>
+        <w:tc>
+          <w:tcPr>
+            <w:tcW w:type="dxa" w:w="680"/>
+            <w:tcBorders>
+              <w:top w:val="none" w:color="FFFFFF" w:sz="0"/>
+              <w:left w:val="none" w:color="FFFFFF" w:sz="0"/>
+              <w:bottom w:val="none" w:color="FFFFFF" w:sz="0"/>
+              <w:right w:val="none" w:color="FFFFFF" w:sz="0"/>
+            </w:tcBorders>
+            <w:shd w:fill="FFFFFF" w:color="auto" w:val="clear"/>
+            <w:tcMar>
+              <w:top w:type="dxa" w:w="40"/>
+              <w:left w:type="dxa" w:w="80"/>
+              <w:bottom w:type="dxa" w:w="40"/>
+              <w:right w:type="dxa" w:w="80"/>
+            </w:tcMar>
+            <w:vAlign w:val="center"/>
+          </w:tcPr>
+          <w:p>
+            <w:pPr>
+              <w:jc w:val="center"/>
+            </w:pPr>
+            <w:r>
+              <w:rPr>
+                <w:rFonts w:ascii="Arial" w:cs="Arial" w:eastAsia="Arial" w:hAnsi="Arial"/>
+                <w:color w:val="6B6B6B"/>
+                <w:sz w:val="15"/>
+                <w:szCs w:val="15"/>
+              </w:rPr>
+              <w:t xml:space="preserve">Self-select at 2 RIR</w:t>
+            </w:r>
+          </w:p>
+        </w:tc>
+        <w:tc>
+          <w:tcPr>
+            <w:tcW w:type="dxa" w:w="540"/>
+            <w:tcBorders>
+              <w:top w:val="none" w:color="FFFFFF" w:sz="0"/>
+              <w:left w:val="none" w:color="FFFFFF" w:sz="0"/>
+              <w:bottom w:val="none" w:color="FFFFFF" w:sz="0"/>
+              <w:right w:val="none" w:color="FFFFFF" w:sz="0"/>
+            </w:tcBorders>
+            <w:shd w:fill="FFFFFF" w:color="auto" w:val="clear"/>
+            <w:tcMar>
+              <w:top w:type="dxa" w:w="40"/>
+              <w:left w:type="dxa" w:w="80"/>
+              <w:bottom w:type="dxa" w:w="40"/>
+              <w:right w:type="dxa" w:w="80"/>
+            </w:tcMar>
+            <w:vAlign w:val="center"/>
+          </w:tcPr>
+          <w:p>
+            <w:pPr>
+              <w:jc w:val="center"/>
+            </w:pPr>
+            <w:r>
+              <w:rPr>
+                <w:rFonts w:ascii="Arial" w:cs="Arial" w:eastAsia="Arial" w:hAnsi="Arial"/>
+                <w:color w:val="6B6B6B"/>
+                <w:sz w:val="15"/>
+                <w:szCs w:val="15"/>
+              </w:rPr>
+              <w:t xml:space="preserve">2-1-2</w:t>
+            </w:r>
+          </w:p>
+        </w:tc>
+        <w:tc>
+          <w:tcPr>
+            <w:tcW w:type="dxa" w:w="440"/>
+            <w:tcBorders>
+              <w:top w:val="none" w:color="FFFFFF" w:sz="0"/>
+              <w:left w:val="none" w:color="FFFFFF" w:sz="0"/>
+              <w:bottom w:val="none" w:color="FFFFFF" w:sz="0"/>
+              <w:right w:val="none" w:color="FFFFFF" w:sz="0"/>
+            </w:tcBorders>
+            <w:shd w:fill="FFFFFF" w:color="auto" w:val="clear"/>
+            <w:tcMar>
+              <w:top w:type="dxa" w:w="40"/>
+              <w:left w:type="dxa" w:w="80"/>
+              <w:bottom w:type="dxa" w:w="40"/>
+              <w:right w:type="dxa" w:w="80"/>
+            </w:tcMar>
+            <w:vAlign w:val="center"/>
+          </w:tcPr>
+          <w:p>
+            <w:pPr>
+              <w:jc w:val="center"/>
+            </w:pPr>
+            <w:r>
+              <w:rPr>
+                <w:rFonts w:ascii="Arial" w:cs="Arial" w:eastAsia="Arial" w:hAnsi="Arial"/>
+                <w:color w:val="6B6B6B"/>
+                <w:sz w:val="15"/>
+                <w:szCs w:val="15"/>
+              </w:rPr>
+              <w:t xml:space="preserve">60s</w:t>
+            </w:r>
+          </w:p>
+        </w:tc>
+        <w:tc>
+          <w:tcPr>
+            <w:tcW w:type="dxa" w:w="5580"/>
+            <w:tcBorders>
+              <w:top w:val="none" w:color="FFFFFF" w:sz="0"/>
+              <w:left w:val="none" w:color="FFFFFF" w:sz="0"/>
+              <w:bottom w:val="none" w:color="FFFFFF" w:sz="0"/>
+              <w:right w:val="none" w:color="FFFFFF" w:sz="0"/>
+            </w:tcBorders>
+            <w:shd w:fill="FFFFFF" w:color="auto" w:val="clear"/>
+            <w:tcMar>
+              <w:top w:type="dxa" w:w="40"/>
+              <w:left w:type="dxa" w:w="80"/>
+              <w:bottom w:type="dxa" w:w="40"/>
+              <w:right w:type="dxa" w:w="80"/>
+            </w:tcMar>
+            <w:vAlign w:val="center"/>
+          </w:tcPr>
+          <w:p>
+            <w:r>
+              <w:rPr>
+                <w:rFonts w:ascii="Arial" w:cs="Arial" w:eastAsia="Arial" w:hAnsi="Arial"/>
+                <w:color w:val="6B6B6B"/>
+                <w:sz w:val="17"/>
+                <w:szCs w:val="17"/>
+              </w:rPr>
+              <w:t xml:space="preserve">Hips stay down; slow return, no snapping back.</w:t>
+            </w:r>
+            <w:r>
+              <w:rPr>
+                <w:rFonts w:ascii="Arial" w:cs="Arial" w:eastAsia="Arial" w:hAnsi="Arial"/>
+                <w:i/>
+                <w:iCs/>
+                <w:color w:val="00695C"/>
+                <w:sz w:val="14"/>
+                <w:szCs w:val="14"/>
+              </w:rPr>
+              <w:t xml:space="preserve">  2 RIR</w:t>
+            </w:r>
+          </w:p>
+        </w:tc>
+      </w:tr>
+    </w:tbl>
+    <w:p>
+      <w:pPr>
+        <w:spacing w:after="100"/>
+      </w:pPr>
+    </w:p>
+    <w:p>
+      <w:pPr>
+        <w:spacing w:after="60" w:before="120"/>
+      </w:pPr>
+      <w:r>
+        <w:rPr>
+          <w:rFonts w:ascii="Arial" w:cs="Arial" w:eastAsia="Arial" w:hAnsi="Arial"/>
+          <w:b/>
+          <w:bCs/>
+          <w:color w:val="C9A227"/>
+          <w:sz w:val="17"/>
+          <w:szCs w:val="17"/>
+        </w:rPr>
+        <w:t xml:space="preserve">D — SECONDARY COMPOUND — BACK SQUAT</w:t>
       </w:r>
     </w:p>
     <w:p>
@@ -4817,7 +5712,7 @@
           <w:sz w:val="17"/>
           <w:szCs w:val="17"/>
         </w:rPr>
-        <w:t xml:space="preserve">Reference load 90 lbs (no rep count recorded at intake) — build progressively at 2 RIR rather than off a fixed percentage table.</w:t>
+        <w:t xml:space="preserve">Reference load 90 lbs (no rep count recorded at intake) — build progressively at two reps in reserve rather than off a fixed percentage table, and log the working weight each week so a real Week 4 number exists to check against. The day's second compound pattern: knee-dominant, rotating off the hinge above. If the day calls for a variation, rotate between: a goblet squat (lighter, upright torso, and the front-rack hold keeps the shoulder in a comfortable neutral position), a hex bar squat (same neutral shoulder position as the deadlift), or a box squat (a fixed depth that keeps the pattern honest on a tired day). A front-rack barbell squat is deliberately not on this list while the cuff is in active rehab — the rack position puts the shoulder in end-range external rotation under load.</w:t>
       </w:r>
     </w:p>
     <w:tbl>
@@ -5216,7 +6111,7 @@
                 <w:sz w:val="15"/>
                 <w:szCs w:val="15"/>
               </w:rPr>
-              <w:t xml:space="preserve">90 lbs (reference) → build 1-2 RIR</w:t>
+              <w:t xml:space="preserve">90 lbs (reference) → build weekly</w:t>
             </w:r>
           </w:p>
         </w:tc>
@@ -5312,7 +6207,18 @@
                 <w:sz w:val="17"/>
                 <w:szCs w:val="17"/>
               </w:rPr>
-              <w:t xml:space="preserve">Ribs stacked over pelvis; full depth, 2 RIR.</w:t>
+              <w:t xml:space="preserve">Ribs stacked over pelvis; full depth, 2 reps left.</w:t>
+            </w:r>
+            <w:r>
+              <w:rPr>
+                <w:rFonts w:ascii="Arial" w:cs="Arial" w:eastAsia="Arial" w:hAnsi="Arial"/>
+                <w:i/>
+                <w:iCs/>
+                <w:color w:val="00695C"/>
+                <w:sz w:val="14"/>
+                <w:szCs w:val="14"/>
+              </w:rPr>
+              <w:t xml:space="preserve">  2 RIR</w:t>
             </w:r>
           </w:p>
         </w:tc>
@@ -5336,7 +6242,7 @@
           <w:sz w:val="17"/>
           <w:szCs w:val="17"/>
         </w:rPr>
-        <w:t xml:space="preserve">D — CORE / CARRY-PREP ACCESSORY</w:t>
+        <w:t xml:space="preserve">E — THIRD COMPOUND (INTEGRATION) — ANTI-ROTATION &amp; LOADED CARRY</w:t>
       </w:r>
     </w:p>
     <w:p>
@@ -5352,7 +6258,7 @@
           <w:sz w:val="17"/>
           <w:szCs w:val="17"/>
         </w:rPr>
-        <w:t xml:space="preserve">Format:  </w:t>
+        <w:t xml:space="preserve">Why:  </w:t>
       </w:r>
       <w:r>
         <w:rPr>
@@ -5361,7 +6267,7 @@
           <w:sz w:val="17"/>
           <w:szCs w:val="17"/>
         </w:rPr>
-        <w:t xml:space="preserve">Anti-rotation core work plus an isometric carry-prep hold — sets up Saturday's loaded Farmers Carry work. The suitcase hold loads the shoulder girdle isometrically, same as the loaded carry it's prepping for — normal grip/shoulder fatigue is expected, sharp or pinching pain is not.</w:t>
+        <w:t xml:space="preserve">The session's closer — one block that puts the whole day together: the braced trunk from the deadlift, the leg drive from the squat, and grip, all held at once while walking. The isometric suitcase hold this block used to finish on is now a loaded carry — the same pattern moving instead of standing still — with the left hand holding the load per the asymmetry note. Load starts at 35 lbs/hand, deliberately below the 45 lbs/hand already carried on Saturday, because this version is one-sided and lands at the end of the heaviest day of the week. This loads the shoulder girdle isometrically the same way Saturday's carry does: ordinary grip and shoulder fatigue is expected, sharp or pinching pain is the stop signal. Variations: a bilateral farmer's carry (both hands loaded, the easiest on the shoulder) or a front-rack kettlebell carry (kettlebells run to 25 lbs per bell — only if the front-rack position is comfortable on the day). Any time the carry is one-sided, the left hand holds the load.</w:t>
       </w:r>
     </w:p>
     <w:tbl>
@@ -5890,7 +6796,20 @@
                 <w:sz w:val="18"/>
                 <w:szCs w:val="18"/>
               </w:rPr>
-              <w:t xml:space="preserve">Suitcase Hold (Isometric)</w:t>
+              <w:t xml:space="preserve">Suitcase Carry (Left-Led)</w:t>
+            </w:r>
+          </w:p>
+          <w:p>
+            <w:r>
+              <w:rPr>
+                <w:rFonts w:ascii="Arial" w:cs="Arial" w:eastAsia="Arial" w:hAnsi="Arial"/>
+                <w:i/>
+                <w:iCs/>
+                <w:color w:val="B71C1C"/>
+                <w:sz w:val="14"/>
+                <w:szCs w:val="14"/>
+              </w:rPr>
+              <w:t xml:space="preserve">Left hand holds the load — weaker side per the asymmetry note. Sharp shoulder pain = stop</w:t>
             </w:r>
           </w:p>
         </w:tc>
@@ -5956,7 +6875,7 @@
                 <w:sz w:val="15"/>
                 <w:szCs w:val="15"/>
               </w:rPr>
-              <w:t xml:space="preserve">20s/side</w:t>
+              <w:t xml:space="preserve">20–25 yd/side</w:t>
             </w:r>
           </w:p>
         </w:tc>
@@ -5989,7 +6908,7 @@
                 <w:sz w:val="15"/>
                 <w:szCs w:val="15"/>
               </w:rPr>
-              <w:t xml:space="preserve">Mod DB</w:t>
+              <w:t xml:space="preserve">35 lbs/hand</w:t>
             </w:r>
           </w:p>
         </w:tc>
@@ -6022,7 +6941,7 @@
                 <w:sz w:val="15"/>
                 <w:szCs w:val="15"/>
               </w:rPr>
-              <w:t xml:space="preserve">Hold</w:t>
+              <w:t xml:space="preserve">Steady</w:t>
             </w:r>
           </w:p>
         </w:tc>
@@ -6055,7 +6974,7 @@
                 <w:sz w:val="15"/>
                 <w:szCs w:val="15"/>
               </w:rPr>
-              <w:t xml:space="preserve">30s</w:t>
+              <w:t xml:space="preserve">60s</w:t>
             </w:r>
           </w:p>
         </w:tc>
@@ -6085,7 +7004,18 @@
                 <w:sz w:val="17"/>
                 <w:szCs w:val="17"/>
               </w:rPr>
-              <w:t xml:space="preserve">Left hand leads — weaker leg-side. Sharp shoulder pain = stop.</w:t>
+              <w:t xml:space="preserve">Tall, level shoulders; resist the lean the whole way.</w:t>
+            </w:r>
+            <w:r>
+              <w:rPr>
+                <w:rFonts w:ascii="Arial" w:cs="Arial" w:eastAsia="Arial" w:hAnsi="Arial"/>
+                <w:i/>
+                <w:iCs/>
+                <w:color w:val="00695C"/>
+                <w:sz w:val="14"/>
+                <w:szCs w:val="14"/>
+              </w:rPr>
+              <w:t xml:space="preserve">  Distance &amp; posture governed — no RIR target</w:t>
             </w:r>
           </w:p>
         </w:tc>
@@ -6389,7 +7319,7 @@
           <w:sz w:val="17"/>
           <w:szCs w:val="17"/>
         </w:rPr>
-        <w:t xml:space="preserve">This isn't a standard %1RM intensity day, so the badge reads REHAB / STRENGTH rather than a percentage that would misstate what's actually prescribed. That doesn't mean light or limited — it means the point of today is to actively rebuild the rotator cuff and scapular stabilizers while continuing real strength work everywhere else. The corrective block below is strengthening work in its own right, not a warm-up throwaway, and runs ahead of compound pressing per ICONS's own 'control precedes power' sequencing. Overhead Press and Assisted Pull-Ups both keep progressing — load builds week to week — autoregulated by pain-free range of motion and RIR instead of a fixed percentage table, in coordination with Jason Bethea.</w:t>
+        <w:t xml:space="preserve">This isn't a standard %1RM intensity day, so the badge reads REHAB / STRENGTH rather than a percentage that would misstate what's actually prescribed. That doesn't mean light or limited — it means the point of today is to actively rebuild the rotator cuff and scapular stabilizers while continuing real strength work everywhere else. The cuff and scapular block below is strengthening work in its own right, not a warm-up throwaway, and runs first — ahead of every compound lift — per ICONS's own 'control precedes power' sequencing. Overhead Press and Assisted Pull-Ups both keep progressing — load builds week to week — autoregulated by pain-free range of motion and RIR instead of a fixed percentage table, in coordination with Jason Bethea.</w:t>
       </w:r>
     </w:p>
     <w:p>
@@ -6430,7 +7360,7 @@
           <w:sz w:val="17"/>
           <w:szCs w:val="17"/>
         </w:rPr>
-        <w:t xml:space="preserve">A — ROTATOR CUFF &amp; SCAPULAR STRENGTHENING</w:t>
+        <w:t xml:space="preserve">A — CORRECTIVE — ROTATOR CUFF &amp; SCAPULAR STRENGTHENING</w:t>
       </w:r>
     </w:p>
     <w:p>
@@ -6455,7 +7385,7 @@
           <w:sz w:val="17"/>
           <w:szCs w:val="17"/>
         </w:rPr>
-        <w:t xml:space="preserve">This is the strengthening protocol itself, not a warm-up — direct, progressive loading of the rotator cuff and scapular stabilizers, following the standard rehab loading sequence (isometric hold capacity → slow eccentric control → controlled concentric strength → dynamic loading) as capacity builds week to week. Runs before compound pressing so the shoulder is actively controlling the joint before it's asked to move real load.</w:t>
+        <w:t xml:space="preserve">This is the strengthening protocol itself, not a warm-up — direct, progressive loading of the rotator cuff and scapular stabilizers, following the standard rehab loading sequence (isometric hold capacity → slow eccentric control → controlled concentric strength → dynamic loading) as capacity builds week to week. It runs first, before any compound lift, so the shoulder is actively controlling the joint before it's asked to move real load. The three drills below are the prescribed set, but this block is meant to be selected from and progressed rather than repeated by rote: band pull-aparts, a scapular retraction-and-depression hold, a scapular push-up, prone I's as well as the Y-T-W's, a face pull (band or Kieser), and a wall slide with a lift-off at the top are all live options, and whichever one shows the cleanest control on the day is the one worth loading. Two families stay off the list for now and only come back with Jason Bethea's clearance: any hanging or dead-hang scapular work, which puts the healing cuff under traction, and end-range overhead loading beyond what the press below already covers.</w:t>
       </w:r>
     </w:p>
     <w:tbl>
@@ -7432,7 +8362,7 @@
           <w:sz w:val="17"/>
           <w:szCs w:val="17"/>
         </w:rPr>
-        <w:t xml:space="preserve">B — PRIMARY STRENGTH — INCLINE BENCH PRESS</w:t>
+        <w:t xml:space="preserve">B — PRIMARY COMPOUND — INCLINE DUMBBELL BENCH PRESS</w:t>
       </w:r>
     </w:p>
     <w:p>
@@ -7457,7 +8387,7 @@
           <w:sz w:val="17"/>
           <w:szCs w:val="17"/>
         </w:rPr>
-        <w:t xml:space="preserve">Well-tolerated in cuff rehab (controlled-ROM pressing) — Week 1 working load 30 lbs (90% of est. 1RM 32), progressing close to normal. 1-2 RIR; stop short of sharp or pinching pain, not of ordinary fatigue.</w:t>
+        <w:t xml:space="preserve">Well-tolerated in cuff rehab (controlled-ROM pressing) — Week 1 working load 30 lbs, building toward 35 lbs by Week 4, progressing close to normal. Two reps in reserve; stop short of sharp or pinching pain, not of ordinary fatigue. If the day calls for a variation, rotate between: a landmine press (the most shoulder-friendly pressing arc of the group), a dumbbell floor press (the floor limits the range, which is useful on a day the shoulder is irritable), a flat dumbbell press, or a machine chest press. A barbell bench press is deliberately not on this list while the cuff is in active rehab — the fixed bar path removes the shoulder's ability to find its own comfortable line. The incline dumbbell press stays the lift that gets tracked and retested.</w:t>
       </w:r>
     </w:p>
     <w:tbl>
@@ -7823,7 +8753,7 @@
                 <w:sz w:val="15"/>
                 <w:szCs w:val="15"/>
               </w:rPr>
-              <w:t xml:space="preserve">5</w:t>
+              <w:t xml:space="preserve">5-6</w:t>
             </w:r>
           </w:p>
         </w:tc>
@@ -7856,7 +8786,7 @@
                 <w:sz w:val="15"/>
                 <w:szCs w:val="15"/>
               </w:rPr>
-              <w:t xml:space="preserve">30 lbs (Wk1)</w:t>
+              <w:t xml:space="preserve">Wk1: 30 → Wk4: 35 lbs</w:t>
             </w:r>
           </w:p>
         </w:tc>
@@ -7952,7 +8882,7 @@
                 <w:sz w:val="17"/>
                 <w:szCs w:val="17"/>
               </w:rPr>
-              <w:t xml:space="preserve">Even bar path both arms. Stop at sharp/pinching pain.</w:t>
+              <w:t xml:space="preserve">Even path both arms. Stop at sharp/pinching pain.</w:t>
             </w:r>
             <w:r>
               <w:rPr>
@@ -7963,7 +8893,7 @@
                 <w:sz w:val="14"/>
                 <w:szCs w:val="14"/>
               </w:rPr>
-              <w:t xml:space="preserve">  1-2 RIR</w:t>
+              <w:t xml:space="preserve">  2 RIR</w:t>
             </w:r>
           </w:p>
         </w:tc>
@@ -7987,7 +8917,7 @@
           <w:sz w:val="17"/>
           <w:szCs w:val="17"/>
         </w:rPr>
-        <w:t xml:space="preserve">C — OVERHEAD PRESS — PROGRESSIVE STRENGTHENING, PAIN-FREE ROM</w:t>
+        <w:t xml:space="preserve">C — ACCESSORY — SINGLE-ARM DB ROW</w:t>
       </w:r>
     </w:p>
     <w:p>
@@ -8012,7 +8942,7 @@
           <w:sz w:val="17"/>
           <w:szCs w:val="17"/>
         </w:rPr>
-        <w:t xml:space="preserve">Genuine strengthening work, not a placeholder — load builds week to week from the tested 17.5 lb starting point the same as any other lift here, just autoregulated by pain-free range of motion and RIR instead of a fixed %1RM table.</w:t>
+        <w:t xml:space="preserve">Well-tolerated in cuff rehab (posterior-chain and scapular-stabilizer work) — build progressively from the tested 35 lb reference, close to normal progression. This is the muscle-building accessory of the day, and it deliberately runs at two reps in reserve rather than the one-rep-in-reserve a hypertrophy accessory would normally use: with the cuff in active rehab, the extra rep of margin is worth more than the last increment of stimulus. Dumbbells run to 60 lbs per hand; past that the landmine or a Kieser row carries the same pattern.</w:t>
       </w:r>
     </w:p>
     <w:tbl>
@@ -8312,7 +9242,7 @@
                 <w:sz w:val="18"/>
                 <w:szCs w:val="18"/>
               </w:rPr>
-              <w:t xml:space="preserve">Standing Overhead Press</w:t>
+              <w:t xml:space="preserve">Single-Arm DB Row</w:t>
             </w:r>
           </w:p>
         </w:tc>
@@ -8378,7 +9308,7 @@
                 <w:sz w:val="15"/>
                 <w:szCs w:val="15"/>
               </w:rPr>
-              <w:t xml:space="preserve">6-8</w:t>
+              <w:t xml:space="preserve">10-12/side</w:t>
             </w:r>
           </w:p>
         </w:tc>
@@ -8411,7 +9341,7 @@
                 <w:sz w:val="15"/>
                 <w:szCs w:val="15"/>
               </w:rPr>
-              <w:t xml:space="preserve">Self-select ~17.5-20 lbs, build weekly</w:t>
+              <w:t xml:space="preserve">35-40 lbs, build weekly</w:t>
             </w:r>
           </w:p>
         </w:tc>
@@ -8444,7 +9374,7 @@
                 <w:sz w:val="15"/>
                 <w:szCs w:val="15"/>
               </w:rPr>
-              <w:t xml:space="preserve">Controlled</w:t>
+              <w:t xml:space="preserve">2-1-2</w:t>
             </w:r>
           </w:p>
         </w:tc>
@@ -8477,7 +9407,7 @@
                 <w:sz w:val="15"/>
                 <w:szCs w:val="15"/>
               </w:rPr>
-              <w:t xml:space="preserve">2 min</w:t>
+              <w:t xml:space="preserve">60s</w:t>
             </w:r>
           </w:p>
         </w:tc>
@@ -8507,7 +9437,18 @@
                 <w:sz w:val="17"/>
                 <w:szCs w:val="17"/>
               </w:rPr>
-              <w:t xml:space="preserve">Full pain-free ROM; add load at 2 RIR + clean form.</w:t>
+              <w:t xml:space="preserve">Full lat stretch at bottom. Stop at sharp/pinching pain.</w:t>
+            </w:r>
+            <w:r>
+              <w:rPr>
+                <w:rFonts w:ascii="Arial" w:cs="Arial" w:eastAsia="Arial" w:hAnsi="Arial"/>
+                <w:i/>
+                <w:iCs/>
+                <w:color w:val="00695C"/>
+                <w:sz w:val="14"/>
+                <w:szCs w:val="14"/>
+              </w:rPr>
+              <w:t xml:space="preserve">  2 RIR</w:t>
             </w:r>
           </w:p>
         </w:tc>
@@ -8527,11 +9468,11 @@
           <w:rFonts w:ascii="Arial" w:cs="Arial" w:eastAsia="Arial" w:hAnsi="Arial"/>
           <w:b/>
           <w:bCs/>
-          <w:color w:val="6A1B9A"/>
+          <w:color w:val="00695C"/>
           <w:sz w:val="17"/>
           <w:szCs w:val="17"/>
         </w:rPr>
-        <w:t xml:space="preserve">D — PULL — PROGRESSIVE STRENGTHENING</w:t>
+        <w:t xml:space="preserve">D — SECONDARY COMPOUND — OVERHEAD PRESS &amp; VERTICAL PULL</w:t>
       </w:r>
     </w:p>
     <w:p>
@@ -8543,7 +9484,7 @@
           <w:rFonts w:ascii="Arial" w:cs="Arial" w:eastAsia="Arial" w:hAnsi="Arial"/>
           <w:b/>
           <w:bCs/>
-          <w:color w:val="6A1B9A"/>
+          <w:color w:val="00695C"/>
           <w:sz w:val="17"/>
           <w:szCs w:val="17"/>
         </w:rPr>
@@ -8556,7 +9497,7 @@
           <w:sz w:val="17"/>
           <w:szCs w:val="17"/>
         </w:rPr>
-        <w:t xml:space="preserve">Real progression target, not a scaled-back stand-in: reduce assistance week to week from the tested 5-rep baseline, autoregulated by pain-free ROM. Neutral or close grip is an available option, not a mandate, if standard wide grip aggravates the shoulder.</w:t>
+        <w:t xml:space="preserve">Genuine strengthening work, not a placeholder — press load builds week to week from the tested 17.5 lb starting point the same as any other lift here, just autoregulated by pain-free range of motion and RIR instead of a fixed percentage table. The plank shoulder taps that follow the press are deliberate and not optional: after loading the shoulder overhead in an open chain, the closed-chain hold immediately re-anchors scapular control on a stable base. Regress them to a quadruped position (knees down) if the full plank loads the cuff, and confirm the progression with Jason Bethea before the first session. Pull-ups then close the block: reduce assistance week to week from the tested 5-rep baseline, autoregulated by pain-free range. If the day calls for a press variation, rotate between: a half-kneeling single-arm dumbbell press (one side at a time, easiest to keep honest), a landmine press (an arc rather than a vertical line), or a seated press with back support. If the day calls for a pull variation: a neutral or close grip instead of standard, a Kieser pulldown, or a band-assisted pull-up. Every option lives inside the same rule as the press itself — pain-free range only, sharp or pinching pain ends the set.</w:t>
       </w:r>
     </w:p>
     <w:tbl>
@@ -8590,7 +9531,7 @@
               <w:bottom w:val="none" w:color="FFFFFF" w:sz="0"/>
               <w:right w:val="none" w:color="FFFFFF" w:sz="0"/>
             </w:tcBorders>
-            <w:shd w:fill="F3EEF9" w:color="auto" w:val="clear"/>
+            <w:shd w:fill="E0F2F1" w:color="auto" w:val="clear"/>
             <w:tcMar>
               <w:top w:type="dxa" w:w="40"/>
               <w:left w:type="dxa" w:w="80"/>
@@ -8608,7 +9549,7 @@
                 <w:rFonts w:ascii="Arial" w:cs="Arial" w:eastAsia="Arial" w:hAnsi="Arial"/>
                 <w:b/>
                 <w:bCs/>
-                <w:color w:val="6A1B9A"/>
+                <w:color w:val="00695C"/>
                 <w:sz w:val="15"/>
                 <w:szCs w:val="15"/>
               </w:rPr>
@@ -8625,25 +9566,25 @@
               <w:bottom w:val="none" w:color="FFFFFF" w:sz="0"/>
               <w:right w:val="none" w:color="FFFFFF" w:sz="0"/>
             </w:tcBorders>
-            <w:shd w:fill="F3EEF9" w:color="auto" w:val="clear"/>
-            <w:tcMar>
-              <w:top w:type="dxa" w:w="40"/>
-              <w:left w:type="dxa" w:w="80"/>
-              <w:bottom w:type="dxa" w:w="40"/>
-              <w:right w:type="dxa" w:w="80"/>
-            </w:tcMar>
-            <w:vAlign w:val="center"/>
-          </w:tcPr>
-          <w:p>
-            <w:pPr>
-              <w:jc w:val="center"/>
-            </w:pPr>
-            <w:r>
-              <w:rPr>
-                <w:rFonts w:ascii="Arial" w:cs="Arial" w:eastAsia="Arial" w:hAnsi="Arial"/>
-                <w:b/>
-                <w:bCs/>
-                <w:color w:val="6A1B9A"/>
+            <w:shd w:fill="E0F2F1" w:color="auto" w:val="clear"/>
+            <w:tcMar>
+              <w:top w:type="dxa" w:w="40"/>
+              <w:left w:type="dxa" w:w="80"/>
+              <w:bottom w:type="dxa" w:w="40"/>
+              <w:right w:type="dxa" w:w="80"/>
+            </w:tcMar>
+            <w:vAlign w:val="center"/>
+          </w:tcPr>
+          <w:p>
+            <w:pPr>
+              <w:jc w:val="center"/>
+            </w:pPr>
+            <w:r>
+              <w:rPr>
+                <w:rFonts w:ascii="Arial" w:cs="Arial" w:eastAsia="Arial" w:hAnsi="Arial"/>
+                <w:b/>
+                <w:bCs/>
+                <w:color w:val="00695C"/>
                 <w:sz w:val="13"/>
                 <w:szCs w:val="13"/>
               </w:rPr>
@@ -8660,25 +9601,25 @@
               <w:bottom w:val="none" w:color="FFFFFF" w:sz="0"/>
               <w:right w:val="none" w:color="FFFFFF" w:sz="0"/>
             </w:tcBorders>
-            <w:shd w:fill="F3EEF9" w:color="auto" w:val="clear"/>
-            <w:tcMar>
-              <w:top w:type="dxa" w:w="40"/>
-              <w:left w:type="dxa" w:w="80"/>
-              <w:bottom w:type="dxa" w:w="40"/>
-              <w:right w:type="dxa" w:w="80"/>
-            </w:tcMar>
-            <w:vAlign w:val="center"/>
-          </w:tcPr>
-          <w:p>
-            <w:pPr>
-              <w:jc w:val="center"/>
-            </w:pPr>
-            <w:r>
-              <w:rPr>
-                <w:rFonts w:ascii="Arial" w:cs="Arial" w:eastAsia="Arial" w:hAnsi="Arial"/>
-                <w:b/>
-                <w:bCs/>
-                <w:color w:val="6A1B9A"/>
+            <w:shd w:fill="E0F2F1" w:color="auto" w:val="clear"/>
+            <w:tcMar>
+              <w:top w:type="dxa" w:w="40"/>
+              <w:left w:type="dxa" w:w="80"/>
+              <w:bottom w:type="dxa" w:w="40"/>
+              <w:right w:type="dxa" w:w="80"/>
+            </w:tcMar>
+            <w:vAlign w:val="center"/>
+          </w:tcPr>
+          <w:p>
+            <w:pPr>
+              <w:jc w:val="center"/>
+            </w:pPr>
+            <w:r>
+              <w:rPr>
+                <w:rFonts w:ascii="Arial" w:cs="Arial" w:eastAsia="Arial" w:hAnsi="Arial"/>
+                <w:b/>
+                <w:bCs/>
+                <w:color w:val="00695C"/>
                 <w:sz w:val="13"/>
                 <w:szCs w:val="13"/>
               </w:rPr>
@@ -8695,25 +9636,25 @@
               <w:bottom w:val="none" w:color="FFFFFF" w:sz="0"/>
               <w:right w:val="none" w:color="FFFFFF" w:sz="0"/>
             </w:tcBorders>
-            <w:shd w:fill="F3EEF9" w:color="auto" w:val="clear"/>
-            <w:tcMar>
-              <w:top w:type="dxa" w:w="40"/>
-              <w:left w:type="dxa" w:w="80"/>
-              <w:bottom w:type="dxa" w:w="40"/>
-              <w:right w:type="dxa" w:w="80"/>
-            </w:tcMar>
-            <w:vAlign w:val="center"/>
-          </w:tcPr>
-          <w:p>
-            <w:pPr>
-              <w:jc w:val="center"/>
-            </w:pPr>
-            <w:r>
-              <w:rPr>
-                <w:rFonts w:ascii="Arial" w:cs="Arial" w:eastAsia="Arial" w:hAnsi="Arial"/>
-                <w:b/>
-                <w:bCs/>
-                <w:color w:val="6A1B9A"/>
+            <w:shd w:fill="E0F2F1" w:color="auto" w:val="clear"/>
+            <w:tcMar>
+              <w:top w:type="dxa" w:w="40"/>
+              <w:left w:type="dxa" w:w="80"/>
+              <w:bottom w:type="dxa" w:w="40"/>
+              <w:right w:type="dxa" w:w="80"/>
+            </w:tcMar>
+            <w:vAlign w:val="center"/>
+          </w:tcPr>
+          <w:p>
+            <w:pPr>
+              <w:jc w:val="center"/>
+            </w:pPr>
+            <w:r>
+              <w:rPr>
+                <w:rFonts w:ascii="Arial" w:cs="Arial" w:eastAsia="Arial" w:hAnsi="Arial"/>
+                <w:b/>
+                <w:bCs/>
+                <w:color w:val="00695C"/>
                 <w:sz w:val="13"/>
                 <w:szCs w:val="13"/>
               </w:rPr>
@@ -8730,25 +9671,25 @@
               <w:bottom w:val="none" w:color="FFFFFF" w:sz="0"/>
               <w:right w:val="none" w:color="FFFFFF" w:sz="0"/>
             </w:tcBorders>
-            <w:shd w:fill="F3EEF9" w:color="auto" w:val="clear"/>
-            <w:tcMar>
-              <w:top w:type="dxa" w:w="40"/>
-              <w:left w:type="dxa" w:w="80"/>
-              <w:bottom w:type="dxa" w:w="40"/>
-              <w:right w:type="dxa" w:w="80"/>
-            </w:tcMar>
-            <w:vAlign w:val="center"/>
-          </w:tcPr>
-          <w:p>
-            <w:pPr>
-              <w:jc w:val="center"/>
-            </w:pPr>
-            <w:r>
-              <w:rPr>
-                <w:rFonts w:ascii="Arial" w:cs="Arial" w:eastAsia="Arial" w:hAnsi="Arial"/>
-                <w:b/>
-                <w:bCs/>
-                <w:color w:val="6A1B9A"/>
+            <w:shd w:fill="E0F2F1" w:color="auto" w:val="clear"/>
+            <w:tcMar>
+              <w:top w:type="dxa" w:w="40"/>
+              <w:left w:type="dxa" w:w="80"/>
+              <w:bottom w:type="dxa" w:w="40"/>
+              <w:right w:type="dxa" w:w="80"/>
+            </w:tcMar>
+            <w:vAlign w:val="center"/>
+          </w:tcPr>
+          <w:p>
+            <w:pPr>
+              <w:jc w:val="center"/>
+            </w:pPr>
+            <w:r>
+              <w:rPr>
+                <w:rFonts w:ascii="Arial" w:cs="Arial" w:eastAsia="Arial" w:hAnsi="Arial"/>
+                <w:b/>
+                <w:bCs/>
+                <w:color w:val="00695C"/>
                 <w:sz w:val="13"/>
                 <w:szCs w:val="13"/>
               </w:rPr>
@@ -8765,25 +9706,25 @@
               <w:bottom w:val="none" w:color="FFFFFF" w:sz="0"/>
               <w:right w:val="none" w:color="FFFFFF" w:sz="0"/>
             </w:tcBorders>
-            <w:shd w:fill="F3EEF9" w:color="auto" w:val="clear"/>
-            <w:tcMar>
-              <w:top w:type="dxa" w:w="40"/>
-              <w:left w:type="dxa" w:w="80"/>
-              <w:bottom w:type="dxa" w:w="40"/>
-              <w:right w:type="dxa" w:w="80"/>
-            </w:tcMar>
-            <w:vAlign w:val="center"/>
-          </w:tcPr>
-          <w:p>
-            <w:pPr>
-              <w:jc w:val="center"/>
-            </w:pPr>
-            <w:r>
-              <w:rPr>
-                <w:rFonts w:ascii="Arial" w:cs="Arial" w:eastAsia="Arial" w:hAnsi="Arial"/>
-                <w:b/>
-                <w:bCs/>
-                <w:color w:val="6A1B9A"/>
+            <w:shd w:fill="E0F2F1" w:color="auto" w:val="clear"/>
+            <w:tcMar>
+              <w:top w:type="dxa" w:w="40"/>
+              <w:left w:type="dxa" w:w="80"/>
+              <w:bottom w:type="dxa" w:w="40"/>
+              <w:right w:type="dxa" w:w="80"/>
+            </w:tcMar>
+            <w:vAlign w:val="center"/>
+          </w:tcPr>
+          <w:p>
+            <w:pPr>
+              <w:jc w:val="center"/>
+            </w:pPr>
+            <w:r>
+              <w:rPr>
+                <w:rFonts w:ascii="Arial" w:cs="Arial" w:eastAsia="Arial" w:hAnsi="Arial"/>
+                <w:b/>
+                <w:bCs/>
+                <w:color w:val="00695C"/>
                 <w:sz w:val="13"/>
                 <w:szCs w:val="13"/>
               </w:rPr>
@@ -8800,7 +9741,7 @@
               <w:bottom w:val="none" w:color="FFFFFF" w:sz="0"/>
               <w:right w:val="none" w:color="FFFFFF" w:sz="0"/>
             </w:tcBorders>
-            <w:shd w:fill="F3EEF9" w:color="auto" w:val="clear"/>
+            <w:shd w:fill="E0F2F1" w:color="auto" w:val="clear"/>
             <w:tcMar>
               <w:top w:type="dxa" w:w="40"/>
               <w:left w:type="dxa" w:w="80"/>
@@ -8818,7 +9759,7 @@
                 <w:rFonts w:ascii="Arial" w:cs="Arial" w:eastAsia="Arial" w:hAnsi="Arial"/>
                 <w:b/>
                 <w:bCs/>
-                <w:color w:val="6A1B9A"/>
+                <w:color w:val="00695C"/>
                 <w:sz w:val="15"/>
                 <w:szCs w:val="15"/>
               </w:rPr>
@@ -8837,7 +9778,7 @@
               <w:bottom w:val="none" w:color="FFFFFF" w:sz="0"/>
               <w:right w:val="none" w:color="FFFFFF" w:sz="0"/>
             </w:tcBorders>
-            <w:shd w:fill="F8F4FB" w:color="auto" w:val="clear"/>
+            <w:shd w:fill="F0FAFA" w:color="auto" w:val="clear"/>
             <w:tcMar>
               <w:top w:type="dxa" w:w="40"/>
               <w:left w:type="dxa" w:w="80"/>
@@ -8856,7 +9797,20 @@
                 <w:sz w:val="18"/>
                 <w:szCs w:val="18"/>
               </w:rPr>
-              <w:t xml:space="preserve">Assisted Pull-Up (Standard or Neutral/Close Grip)</w:t>
+              <w:t xml:space="preserve">Standing Overhead Press</w:t>
+            </w:r>
+          </w:p>
+          <w:p>
+            <w:r>
+              <w:rPr>
+                <w:rFonts w:ascii="Arial" w:cs="Arial" w:eastAsia="Arial" w:hAnsi="Arial"/>
+                <w:i/>
+                <w:iCs/>
+                <w:color w:val="B71C1C"/>
+                <w:sz w:val="14"/>
+                <w:szCs w:val="14"/>
+              </w:rPr>
+              <w:t xml:space="preserve">Pain-free range only — sharp or pinching pain ends the set</w:t>
             </w:r>
           </w:p>
         </w:tc>
@@ -8869,7 +9823,7 @@
               <w:bottom w:val="none" w:color="FFFFFF" w:sz="0"/>
               <w:right w:val="none" w:color="FFFFFF" w:sz="0"/>
             </w:tcBorders>
-            <w:shd w:fill="F8F4FB" w:color="auto" w:val="clear"/>
+            <w:shd w:fill="F0FAFA" w:color="auto" w:val="clear"/>
             <w:tcMar>
               <w:top w:type="dxa" w:w="40"/>
               <w:left w:type="dxa" w:w="80"/>
@@ -8902,27 +9856,27 @@
               <w:bottom w:val="none" w:color="FFFFFF" w:sz="0"/>
               <w:right w:val="none" w:color="FFFFFF" w:sz="0"/>
             </w:tcBorders>
-            <w:shd w:fill="F8F4FB" w:color="auto" w:val="clear"/>
-            <w:tcMar>
-              <w:top w:type="dxa" w:w="40"/>
-              <w:left w:type="dxa" w:w="80"/>
-              <w:bottom w:type="dxa" w:w="40"/>
-              <w:right w:type="dxa" w:w="80"/>
-            </w:tcMar>
-            <w:vAlign w:val="center"/>
-          </w:tcPr>
-          <w:p>
-            <w:pPr>
-              <w:jc w:val="center"/>
-            </w:pPr>
-            <w:r>
-              <w:rPr>
-                <w:rFonts w:ascii="Arial" w:cs="Arial" w:eastAsia="Arial" w:hAnsi="Arial"/>
-                <w:color w:val="6B6B6B"/>
-                <w:sz w:val="15"/>
-                <w:szCs w:val="15"/>
-              </w:rPr>
-              <w:t xml:space="preserve">5-8</w:t>
+            <w:shd w:fill="F0FAFA" w:color="auto" w:val="clear"/>
+            <w:tcMar>
+              <w:top w:type="dxa" w:w="40"/>
+              <w:left w:type="dxa" w:w="80"/>
+              <w:bottom w:type="dxa" w:w="40"/>
+              <w:right w:type="dxa" w:w="80"/>
+            </w:tcMar>
+            <w:vAlign w:val="center"/>
+          </w:tcPr>
+          <w:p>
+            <w:pPr>
+              <w:jc w:val="center"/>
+            </w:pPr>
+            <w:r>
+              <w:rPr>
+                <w:rFonts w:ascii="Arial" w:cs="Arial" w:eastAsia="Arial" w:hAnsi="Arial"/>
+                <w:color w:val="6B6B6B"/>
+                <w:sz w:val="15"/>
+                <w:szCs w:val="15"/>
+              </w:rPr>
+              <w:t xml:space="preserve">6-8</w:t>
             </w:r>
           </w:p>
         </w:tc>
@@ -8935,27 +9889,27 @@
               <w:bottom w:val="none" w:color="FFFFFF" w:sz="0"/>
               <w:right w:val="none" w:color="FFFFFF" w:sz="0"/>
             </w:tcBorders>
-            <w:shd w:fill="F8F4FB" w:color="auto" w:val="clear"/>
-            <w:tcMar>
-              <w:top w:type="dxa" w:w="40"/>
-              <w:left w:type="dxa" w:w="80"/>
-              <w:bottom w:type="dxa" w:w="40"/>
-              <w:right w:type="dxa" w:w="80"/>
-            </w:tcMar>
-            <w:vAlign w:val="center"/>
-          </w:tcPr>
-          <w:p>
-            <w:pPr>
-              <w:jc w:val="center"/>
-            </w:pPr>
-            <w:r>
-              <w:rPr>
-                <w:rFonts w:ascii="Arial" w:cs="Arial" w:eastAsia="Arial" w:hAnsi="Arial"/>
-                <w:color w:val="6B6B6B"/>
-                <w:sz w:val="15"/>
-                <w:szCs w:val="15"/>
-              </w:rPr>
-              <w:t xml:space="preserve">Reduced assist week to week</w:t>
+            <w:shd w:fill="F0FAFA" w:color="auto" w:val="clear"/>
+            <w:tcMar>
+              <w:top w:type="dxa" w:w="40"/>
+              <w:left w:type="dxa" w:w="80"/>
+              <w:bottom w:type="dxa" w:w="40"/>
+              <w:right w:type="dxa" w:w="80"/>
+            </w:tcMar>
+            <w:vAlign w:val="center"/>
+          </w:tcPr>
+          <w:p>
+            <w:pPr>
+              <w:jc w:val="center"/>
+            </w:pPr>
+            <w:r>
+              <w:rPr>
+                <w:rFonts w:ascii="Arial" w:cs="Arial" w:eastAsia="Arial" w:hAnsi="Arial"/>
+                <w:color w:val="6B6B6B"/>
+                <w:sz w:val="15"/>
+                <w:szCs w:val="15"/>
+              </w:rPr>
+              <w:t xml:space="preserve">Self-select ~17.5-20 lbs, build weekly</w:t>
             </w:r>
           </w:p>
         </w:tc>
@@ -8968,7 +9922,7 @@
               <w:bottom w:val="none" w:color="FFFFFF" w:sz="0"/>
               <w:right w:val="none" w:color="FFFFFF" w:sz="0"/>
             </w:tcBorders>
-            <w:shd w:fill="F8F4FB" w:color="auto" w:val="clear"/>
+            <w:shd w:fill="F0FAFA" w:color="auto" w:val="clear"/>
             <w:tcMar>
               <w:top w:type="dxa" w:w="40"/>
               <w:left w:type="dxa" w:w="80"/>
@@ -9001,27 +9955,27 @@
               <w:bottom w:val="none" w:color="FFFFFF" w:sz="0"/>
               <w:right w:val="none" w:color="FFFFFF" w:sz="0"/>
             </w:tcBorders>
-            <w:shd w:fill="F8F4FB" w:color="auto" w:val="clear"/>
-            <w:tcMar>
-              <w:top w:type="dxa" w:w="40"/>
-              <w:left w:type="dxa" w:w="80"/>
-              <w:bottom w:type="dxa" w:w="40"/>
-              <w:right w:type="dxa" w:w="80"/>
-            </w:tcMar>
-            <w:vAlign w:val="center"/>
-          </w:tcPr>
-          <w:p>
-            <w:pPr>
-              <w:jc w:val="center"/>
-            </w:pPr>
-            <w:r>
-              <w:rPr>
-                <w:rFonts w:ascii="Arial" w:cs="Arial" w:eastAsia="Arial" w:hAnsi="Arial"/>
-                <w:color w:val="6B6B6B"/>
-                <w:sz w:val="15"/>
-                <w:szCs w:val="15"/>
-              </w:rPr>
-              <w:t xml:space="preserve">90s</w:t>
+            <w:shd w:fill="F0FAFA" w:color="auto" w:val="clear"/>
+            <w:tcMar>
+              <w:top w:type="dxa" w:w="40"/>
+              <w:left w:type="dxa" w:w="80"/>
+              <w:bottom w:type="dxa" w:w="40"/>
+              <w:right w:type="dxa" w:w="80"/>
+            </w:tcMar>
+            <w:vAlign w:val="center"/>
+          </w:tcPr>
+          <w:p>
+            <w:pPr>
+              <w:jc w:val="center"/>
+            </w:pPr>
+            <w:r>
+              <w:rPr>
+                <w:rFonts w:ascii="Arial" w:cs="Arial" w:eastAsia="Arial" w:hAnsi="Arial"/>
+                <w:color w:val="6B6B6B"/>
+                <w:sz w:val="15"/>
+                <w:szCs w:val="15"/>
+              </w:rPr>
+              <w:t xml:space="preserve">2 min</w:t>
             </w:r>
           </w:p>
         </w:tc>
@@ -9034,7 +9988,7 @@
               <w:bottom w:val="none" w:color="FFFFFF" w:sz="0"/>
               <w:right w:val="none" w:color="FFFFFF" w:sz="0"/>
             </w:tcBorders>
-            <w:shd w:fill="F8F4FB" w:color="auto" w:val="clear"/>
+            <w:shd w:fill="F0FAFA" w:color="auto" w:val="clear"/>
             <w:tcMar>
               <w:top w:type="dxa" w:w="40"/>
               <w:left w:type="dxa" w:w="80"/>
@@ -9051,7 +10005,500 @@
                 <w:sz w:val="17"/>
                 <w:szCs w:val="17"/>
               </w:rPr>
+              <w:t xml:space="preserve">Full pain-free ROM; add load at 2 RIR + clean form.</w:t>
+            </w:r>
+            <w:r>
+              <w:rPr>
+                <w:rFonts w:ascii="Arial" w:cs="Arial" w:eastAsia="Arial" w:hAnsi="Arial"/>
+                <w:i/>
+                <w:iCs/>
+                <w:color w:val="00695C"/>
+                <w:sz w:val="14"/>
+                <w:szCs w:val="14"/>
+              </w:rPr>
+              <w:t xml:space="preserve">  2 RIR</w:t>
+            </w:r>
+          </w:p>
+        </w:tc>
+      </w:tr>
+      <w:tr>
+        <w:tc>
+          <w:tcPr>
+            <w:tcW w:type="dxa" w:w="2400"/>
+            <w:tcBorders>
+              <w:top w:val="none" w:color="FFFFFF" w:sz="0"/>
+              <w:left w:val="none" w:color="FFFFFF" w:sz="0"/>
+              <w:bottom w:val="none" w:color="FFFFFF" w:sz="0"/>
+              <w:right w:val="none" w:color="FFFFFF" w:sz="0"/>
+            </w:tcBorders>
+            <w:shd w:fill="FFFFFF" w:color="auto" w:val="clear"/>
+            <w:tcMar>
+              <w:top w:type="dxa" w:w="40"/>
+              <w:left w:type="dxa" w:w="80"/>
+              <w:bottom w:type="dxa" w:w="40"/>
+              <w:right w:type="dxa" w:w="80"/>
+            </w:tcMar>
+            <w:vAlign w:val="center"/>
+          </w:tcPr>
+          <w:p>
+            <w:r>
+              <w:rPr>
+                <w:rFonts w:ascii="Arial" w:cs="Arial" w:eastAsia="Arial" w:hAnsi="Arial"/>
+                <w:b/>
+                <w:bCs/>
+                <w:color w:val="2C2C2C"/>
+                <w:sz w:val="18"/>
+                <w:szCs w:val="18"/>
+              </w:rPr>
+              <w:t xml:space="preserve">Plank Shoulder Taps (Static Hold)</w:t>
+            </w:r>
+          </w:p>
+          <w:p>
+            <w:r>
+              <w:rPr>
+                <w:rFonts w:ascii="Arial" w:cs="Arial" w:eastAsia="Arial" w:hAnsi="Arial"/>
+                <w:i/>
+                <w:iCs/>
+                <w:color w:val="B71C1C"/>
+                <w:sz w:val="14"/>
+                <w:szCs w:val="14"/>
+              </w:rPr>
+              <w:t xml:space="preserve">Regress to quadruped (knees down) if the plank loads the cuff</w:t>
+            </w:r>
+          </w:p>
+        </w:tc>
+        <w:tc>
+          <w:tcPr>
+            <w:tcW w:type="dxa" w:w="380"/>
+            <w:tcBorders>
+              <w:top w:val="none" w:color="FFFFFF" w:sz="0"/>
+              <w:left w:val="none" w:color="FFFFFF" w:sz="0"/>
+              <w:bottom w:val="none" w:color="FFFFFF" w:sz="0"/>
+              <w:right w:val="none" w:color="FFFFFF" w:sz="0"/>
+            </w:tcBorders>
+            <w:shd w:fill="FFFFFF" w:color="auto" w:val="clear"/>
+            <w:tcMar>
+              <w:top w:type="dxa" w:w="40"/>
+              <w:left w:type="dxa" w:w="80"/>
+              <w:bottom w:type="dxa" w:w="40"/>
+              <w:right w:type="dxa" w:w="80"/>
+            </w:tcMar>
+            <w:vAlign w:val="center"/>
+          </w:tcPr>
+          <w:p>
+            <w:pPr>
+              <w:jc w:val="center"/>
+            </w:pPr>
+            <w:r>
+              <w:rPr>
+                <w:rFonts w:ascii="Arial" w:cs="Arial" w:eastAsia="Arial" w:hAnsi="Arial"/>
+                <w:color w:val="6B6B6B"/>
+                <w:sz w:val="15"/>
+                <w:szCs w:val="15"/>
+              </w:rPr>
+              <w:t xml:space="preserve">2</w:t>
+            </w:r>
+          </w:p>
+        </w:tc>
+        <w:tc>
+          <w:tcPr>
+            <w:tcW w:type="dxa" w:w="420"/>
+            <w:tcBorders>
+              <w:top w:val="none" w:color="FFFFFF" w:sz="0"/>
+              <w:left w:val="none" w:color="FFFFFF" w:sz="0"/>
+              <w:bottom w:val="none" w:color="FFFFFF" w:sz="0"/>
+              <w:right w:val="none" w:color="FFFFFF" w:sz="0"/>
+            </w:tcBorders>
+            <w:shd w:fill="FFFFFF" w:color="auto" w:val="clear"/>
+            <w:tcMar>
+              <w:top w:type="dxa" w:w="40"/>
+              <w:left w:type="dxa" w:w="80"/>
+              <w:bottom w:type="dxa" w:w="40"/>
+              <w:right w:type="dxa" w:w="80"/>
+            </w:tcMar>
+            <w:vAlign w:val="center"/>
+          </w:tcPr>
+          <w:p>
+            <w:pPr>
+              <w:jc w:val="center"/>
+            </w:pPr>
+            <w:r>
+              <w:rPr>
+                <w:rFonts w:ascii="Arial" w:cs="Arial" w:eastAsia="Arial" w:hAnsi="Arial"/>
+                <w:color w:val="6B6B6B"/>
+                <w:sz w:val="15"/>
+                <w:szCs w:val="15"/>
+              </w:rPr>
+              <w:t xml:space="preserve">8-10 taps/side</w:t>
+            </w:r>
+          </w:p>
+        </w:tc>
+        <w:tc>
+          <w:tcPr>
+            <w:tcW w:type="dxa" w:w="680"/>
+            <w:tcBorders>
+              <w:top w:val="none" w:color="FFFFFF" w:sz="0"/>
+              <w:left w:val="none" w:color="FFFFFF" w:sz="0"/>
+              <w:bottom w:val="none" w:color="FFFFFF" w:sz="0"/>
+              <w:right w:val="none" w:color="FFFFFF" w:sz="0"/>
+            </w:tcBorders>
+            <w:shd w:fill="FFFFFF" w:color="auto" w:val="clear"/>
+            <w:tcMar>
+              <w:top w:type="dxa" w:w="40"/>
+              <w:left w:type="dxa" w:w="80"/>
+              <w:bottom w:type="dxa" w:w="40"/>
+              <w:right w:type="dxa" w:w="80"/>
+            </w:tcMar>
+            <w:vAlign w:val="center"/>
+          </w:tcPr>
+          <w:p>
+            <w:pPr>
+              <w:jc w:val="center"/>
+            </w:pPr>
+            <w:r>
+              <w:rPr>
+                <w:rFonts w:ascii="Arial" w:cs="Arial" w:eastAsia="Arial" w:hAnsi="Arial"/>
+                <w:color w:val="6B6B6B"/>
+                <w:sz w:val="15"/>
+                <w:szCs w:val="15"/>
+              </w:rPr>
+              <w:t xml:space="preserve">Bodyweight</w:t>
+            </w:r>
+          </w:p>
+        </w:tc>
+        <w:tc>
+          <w:tcPr>
+            <w:tcW w:type="dxa" w:w="540"/>
+            <w:tcBorders>
+              <w:top w:val="none" w:color="FFFFFF" w:sz="0"/>
+              <w:left w:val="none" w:color="FFFFFF" w:sz="0"/>
+              <w:bottom w:val="none" w:color="FFFFFF" w:sz="0"/>
+              <w:right w:val="none" w:color="FFFFFF" w:sz="0"/>
+            </w:tcBorders>
+            <w:shd w:fill="FFFFFF" w:color="auto" w:val="clear"/>
+            <w:tcMar>
+              <w:top w:type="dxa" w:w="40"/>
+              <w:left w:type="dxa" w:w="80"/>
+              <w:bottom w:type="dxa" w:w="40"/>
+              <w:right w:type="dxa" w:w="80"/>
+            </w:tcMar>
+            <w:vAlign w:val="center"/>
+          </w:tcPr>
+          <w:p>
+            <w:pPr>
+              <w:jc w:val="center"/>
+            </w:pPr>
+            <w:r>
+              <w:rPr>
+                <w:rFonts w:ascii="Arial" w:cs="Arial" w:eastAsia="Arial" w:hAnsi="Arial"/>
+                <w:color w:val="6B6B6B"/>
+                <w:sz w:val="15"/>
+                <w:szCs w:val="15"/>
+              </w:rPr>
+              <w:t xml:space="preserve">Slow, controlled</w:t>
+            </w:r>
+          </w:p>
+        </w:tc>
+        <w:tc>
+          <w:tcPr>
+            <w:tcW w:type="dxa" w:w="440"/>
+            <w:tcBorders>
+              <w:top w:val="none" w:color="FFFFFF" w:sz="0"/>
+              <w:left w:val="none" w:color="FFFFFF" w:sz="0"/>
+              <w:bottom w:val="none" w:color="FFFFFF" w:sz="0"/>
+              <w:right w:val="none" w:color="FFFFFF" w:sz="0"/>
+            </w:tcBorders>
+            <w:shd w:fill="FFFFFF" w:color="auto" w:val="clear"/>
+            <w:tcMar>
+              <w:top w:type="dxa" w:w="40"/>
+              <w:left w:type="dxa" w:w="80"/>
+              <w:bottom w:type="dxa" w:w="40"/>
+              <w:right w:type="dxa" w:w="80"/>
+            </w:tcMar>
+            <w:vAlign w:val="center"/>
+          </w:tcPr>
+          <w:p>
+            <w:pPr>
+              <w:jc w:val="center"/>
+            </w:pPr>
+            <w:r>
+              <w:rPr>
+                <w:rFonts w:ascii="Arial" w:cs="Arial" w:eastAsia="Arial" w:hAnsi="Arial"/>
+                <w:color w:val="6B6B6B"/>
+                <w:sz w:val="15"/>
+                <w:szCs w:val="15"/>
+              </w:rPr>
+              <w:t xml:space="preserve">45s</w:t>
+            </w:r>
+          </w:p>
+        </w:tc>
+        <w:tc>
+          <w:tcPr>
+            <w:tcW w:type="dxa" w:w="5580"/>
+            <w:tcBorders>
+              <w:top w:val="none" w:color="FFFFFF" w:sz="0"/>
+              <w:left w:val="none" w:color="FFFFFF" w:sz="0"/>
+              <w:bottom w:val="none" w:color="FFFFFF" w:sz="0"/>
+              <w:right w:val="none" w:color="FFFFFF" w:sz="0"/>
+            </w:tcBorders>
+            <w:shd w:fill="FFFFFF" w:color="auto" w:val="clear"/>
+            <w:tcMar>
+              <w:top w:type="dxa" w:w="40"/>
+              <w:left w:type="dxa" w:w="80"/>
+              <w:bottom w:type="dxa" w:w="40"/>
+              <w:right w:type="dxa" w:w="80"/>
+            </w:tcMar>
+            <w:vAlign w:val="center"/>
+          </w:tcPr>
+          <w:p>
+            <w:r>
+              <w:rPr>
+                <w:rFonts w:ascii="Arial" w:cs="Arial" w:eastAsia="Arial" w:hAnsi="Arial"/>
+                <w:color w:val="6B6B6B"/>
+                <w:sz w:val="17"/>
+                <w:szCs w:val="17"/>
+              </w:rPr>
+              <w:t xml:space="preserve">Hold the push-up position, hips level — tap slow, the hold is the work.</w:t>
+            </w:r>
+          </w:p>
+        </w:tc>
+      </w:tr>
+      <w:tr>
+        <w:tc>
+          <w:tcPr>
+            <w:tcW w:type="dxa" w:w="2400"/>
+            <w:tcBorders>
+              <w:top w:val="none" w:color="FFFFFF" w:sz="0"/>
+              <w:left w:val="none" w:color="FFFFFF" w:sz="0"/>
+              <w:bottom w:val="none" w:color="FFFFFF" w:sz="0"/>
+              <w:right w:val="none" w:color="FFFFFF" w:sz="0"/>
+            </w:tcBorders>
+            <w:shd w:fill="F0FAFA" w:color="auto" w:val="clear"/>
+            <w:tcMar>
+              <w:top w:type="dxa" w:w="40"/>
+              <w:left w:type="dxa" w:w="80"/>
+              <w:bottom w:type="dxa" w:w="40"/>
+              <w:right w:type="dxa" w:w="80"/>
+            </w:tcMar>
+            <w:vAlign w:val="center"/>
+          </w:tcPr>
+          <w:p>
+            <w:r>
+              <w:rPr>
+                <w:rFonts w:ascii="Arial" w:cs="Arial" w:eastAsia="Arial" w:hAnsi="Arial"/>
+                <w:b/>
+                <w:bCs/>
+                <w:color w:val="2C2C2C"/>
+                <w:sz w:val="18"/>
+                <w:szCs w:val="18"/>
+              </w:rPr>
+              <w:t xml:space="preserve">Assisted Pull-Up (Standard or Neutral/Close Grip)</w:t>
+            </w:r>
+          </w:p>
+        </w:tc>
+        <w:tc>
+          <w:tcPr>
+            <w:tcW w:type="dxa" w:w="380"/>
+            <w:tcBorders>
+              <w:top w:val="none" w:color="FFFFFF" w:sz="0"/>
+              <w:left w:val="none" w:color="FFFFFF" w:sz="0"/>
+              <w:bottom w:val="none" w:color="FFFFFF" w:sz="0"/>
+              <w:right w:val="none" w:color="FFFFFF" w:sz="0"/>
+            </w:tcBorders>
+            <w:shd w:fill="F0FAFA" w:color="auto" w:val="clear"/>
+            <w:tcMar>
+              <w:top w:type="dxa" w:w="40"/>
+              <w:left w:type="dxa" w:w="80"/>
+              <w:bottom w:type="dxa" w:w="40"/>
+              <w:right w:type="dxa" w:w="80"/>
+            </w:tcMar>
+            <w:vAlign w:val="center"/>
+          </w:tcPr>
+          <w:p>
+            <w:pPr>
+              <w:jc w:val="center"/>
+            </w:pPr>
+            <w:r>
+              <w:rPr>
+                <w:rFonts w:ascii="Arial" w:cs="Arial" w:eastAsia="Arial" w:hAnsi="Arial"/>
+                <w:color w:val="6B6B6B"/>
+                <w:sz w:val="15"/>
+                <w:szCs w:val="15"/>
+              </w:rPr>
+              <w:t xml:space="preserve">3</w:t>
+            </w:r>
+          </w:p>
+        </w:tc>
+        <w:tc>
+          <w:tcPr>
+            <w:tcW w:type="dxa" w:w="420"/>
+            <w:tcBorders>
+              <w:top w:val="none" w:color="FFFFFF" w:sz="0"/>
+              <w:left w:val="none" w:color="FFFFFF" w:sz="0"/>
+              <w:bottom w:val="none" w:color="FFFFFF" w:sz="0"/>
+              <w:right w:val="none" w:color="FFFFFF" w:sz="0"/>
+            </w:tcBorders>
+            <w:shd w:fill="F0FAFA" w:color="auto" w:val="clear"/>
+            <w:tcMar>
+              <w:top w:type="dxa" w:w="40"/>
+              <w:left w:type="dxa" w:w="80"/>
+              <w:bottom w:type="dxa" w:w="40"/>
+              <w:right w:type="dxa" w:w="80"/>
+            </w:tcMar>
+            <w:vAlign w:val="center"/>
+          </w:tcPr>
+          <w:p>
+            <w:pPr>
+              <w:jc w:val="center"/>
+            </w:pPr>
+            <w:r>
+              <w:rPr>
+                <w:rFonts w:ascii="Arial" w:cs="Arial" w:eastAsia="Arial" w:hAnsi="Arial"/>
+                <w:color w:val="6B6B6B"/>
+                <w:sz w:val="15"/>
+                <w:szCs w:val="15"/>
+              </w:rPr>
+              <w:t xml:space="preserve">5-8</w:t>
+            </w:r>
+          </w:p>
+        </w:tc>
+        <w:tc>
+          <w:tcPr>
+            <w:tcW w:type="dxa" w:w="680"/>
+            <w:tcBorders>
+              <w:top w:val="none" w:color="FFFFFF" w:sz="0"/>
+              <w:left w:val="none" w:color="FFFFFF" w:sz="0"/>
+              <w:bottom w:val="none" w:color="FFFFFF" w:sz="0"/>
+              <w:right w:val="none" w:color="FFFFFF" w:sz="0"/>
+            </w:tcBorders>
+            <w:shd w:fill="F0FAFA" w:color="auto" w:val="clear"/>
+            <w:tcMar>
+              <w:top w:type="dxa" w:w="40"/>
+              <w:left w:type="dxa" w:w="80"/>
+              <w:bottom w:type="dxa" w:w="40"/>
+              <w:right w:type="dxa" w:w="80"/>
+            </w:tcMar>
+            <w:vAlign w:val="center"/>
+          </w:tcPr>
+          <w:p>
+            <w:pPr>
+              <w:jc w:val="center"/>
+            </w:pPr>
+            <w:r>
+              <w:rPr>
+                <w:rFonts w:ascii="Arial" w:cs="Arial" w:eastAsia="Arial" w:hAnsi="Arial"/>
+                <w:color w:val="6B6B6B"/>
+                <w:sz w:val="15"/>
+                <w:szCs w:val="15"/>
+              </w:rPr>
+              <w:t xml:space="preserve">Reduced assist week to week</w:t>
+            </w:r>
+          </w:p>
+        </w:tc>
+        <w:tc>
+          <w:tcPr>
+            <w:tcW w:type="dxa" w:w="540"/>
+            <w:tcBorders>
+              <w:top w:val="none" w:color="FFFFFF" w:sz="0"/>
+              <w:left w:val="none" w:color="FFFFFF" w:sz="0"/>
+              <w:bottom w:val="none" w:color="FFFFFF" w:sz="0"/>
+              <w:right w:val="none" w:color="FFFFFF" w:sz="0"/>
+            </w:tcBorders>
+            <w:shd w:fill="F0FAFA" w:color="auto" w:val="clear"/>
+            <w:tcMar>
+              <w:top w:type="dxa" w:w="40"/>
+              <w:left w:type="dxa" w:w="80"/>
+              <w:bottom w:type="dxa" w:w="40"/>
+              <w:right w:type="dxa" w:w="80"/>
+            </w:tcMar>
+            <w:vAlign w:val="center"/>
+          </w:tcPr>
+          <w:p>
+            <w:pPr>
+              <w:jc w:val="center"/>
+            </w:pPr>
+            <w:r>
+              <w:rPr>
+                <w:rFonts w:ascii="Arial" w:cs="Arial" w:eastAsia="Arial" w:hAnsi="Arial"/>
+                <w:color w:val="6B6B6B"/>
+                <w:sz w:val="15"/>
+                <w:szCs w:val="15"/>
+              </w:rPr>
+              <w:t xml:space="preserve">Controlled</w:t>
+            </w:r>
+          </w:p>
+        </w:tc>
+        <w:tc>
+          <w:tcPr>
+            <w:tcW w:type="dxa" w:w="440"/>
+            <w:tcBorders>
+              <w:top w:val="none" w:color="FFFFFF" w:sz="0"/>
+              <w:left w:val="none" w:color="FFFFFF" w:sz="0"/>
+              <w:bottom w:val="none" w:color="FFFFFF" w:sz="0"/>
+              <w:right w:val="none" w:color="FFFFFF" w:sz="0"/>
+            </w:tcBorders>
+            <w:shd w:fill="F0FAFA" w:color="auto" w:val="clear"/>
+            <w:tcMar>
+              <w:top w:type="dxa" w:w="40"/>
+              <w:left w:type="dxa" w:w="80"/>
+              <w:bottom w:type="dxa" w:w="40"/>
+              <w:right w:type="dxa" w:w="80"/>
+            </w:tcMar>
+            <w:vAlign w:val="center"/>
+          </w:tcPr>
+          <w:p>
+            <w:pPr>
+              <w:jc w:val="center"/>
+            </w:pPr>
+            <w:r>
+              <w:rPr>
+                <w:rFonts w:ascii="Arial" w:cs="Arial" w:eastAsia="Arial" w:hAnsi="Arial"/>
+                <w:color w:val="6B6B6B"/>
+                <w:sz w:val="15"/>
+                <w:szCs w:val="15"/>
+              </w:rPr>
+              <w:t xml:space="preserve">90s</w:t>
+            </w:r>
+          </w:p>
+        </w:tc>
+        <w:tc>
+          <w:tcPr>
+            <w:tcW w:type="dxa" w:w="5580"/>
+            <w:tcBorders>
+              <w:top w:val="none" w:color="FFFFFF" w:sz="0"/>
+              <w:left w:val="none" w:color="FFFFFF" w:sz="0"/>
+              <w:bottom w:val="none" w:color="FFFFFF" w:sz="0"/>
+              <w:right w:val="none" w:color="FFFFFF" w:sz="0"/>
+            </w:tcBorders>
+            <w:shd w:fill="F0FAFA" w:color="auto" w:val="clear"/>
+            <w:tcMar>
+              <w:top w:type="dxa" w:w="40"/>
+              <w:left w:type="dxa" w:w="80"/>
+              <w:bottom w:type="dxa" w:w="40"/>
+              <w:right w:type="dxa" w:w="80"/>
+            </w:tcMar>
+            <w:vAlign w:val="center"/>
+          </w:tcPr>
+          <w:p>
+            <w:r>
+              <w:rPr>
+                <w:rFonts w:ascii="Arial" w:cs="Arial" w:eastAsia="Arial" w:hAnsi="Arial"/>
+                <w:color w:val="6B6B6B"/>
+                <w:sz w:val="17"/>
+                <w:szCs w:val="17"/>
+              </w:rPr>
               <w:t xml:space="preserve">Full hang to chin-over-bar; switch to neutral grip if it aggravates.</w:t>
+            </w:r>
+            <w:r>
+              <w:rPr>
+                <w:rFonts w:ascii="Arial" w:cs="Arial" w:eastAsia="Arial" w:hAnsi="Arial"/>
+                <w:i/>
+                <w:iCs/>
+                <w:color w:val="00695C"/>
+                <w:sz w:val="14"/>
+                <w:szCs w:val="14"/>
+              </w:rPr>
+              <w:t xml:space="preserve">  2 RIR</w:t>
             </w:r>
           </w:p>
         </w:tc>
@@ -9071,11 +10518,11 @@
           <w:rFonts w:ascii="Arial" w:cs="Arial" w:eastAsia="Arial" w:hAnsi="Arial"/>
           <w:b/>
           <w:bCs/>
-          <w:color w:val="00695C"/>
+          <w:color w:val="C9A227"/>
           <w:sz w:val="17"/>
           <w:szCs w:val="17"/>
         </w:rPr>
-        <w:t xml:space="preserve">E — ACCESSORY — SINGLE-ARM DB ROW</w:t>
+        <w:t xml:space="preserve">E — THIRD COMPOUND (INTEGRATION) — CLOSED-CHAIN FULL-BODY HOLD</w:t>
       </w:r>
     </w:p>
     <w:p>
@@ -9087,11 +10534,11 @@
           <w:rFonts w:ascii="Arial" w:cs="Arial" w:eastAsia="Arial" w:hAnsi="Arial"/>
           <w:b/>
           <w:bCs/>
-          <w:color w:val="00695C"/>
+          <w:color w:val="C9A227"/>
           <w:sz w:val="17"/>
           <w:szCs w:val="17"/>
         </w:rPr>
-        <w:t xml:space="preserve">Load Target:  </w:t>
+        <w:t xml:space="preserve">Why:  </w:t>
       </w:r>
       <w:r>
         <w:rPr>
@@ -9100,7 +10547,7 @@
           <w:sz w:val="17"/>
           <w:szCs w:val="17"/>
         </w:rPr>
-        <w:t xml:space="preserve">Well-tolerated in cuff rehab (posterior-chain/scap-stabilizer work) — build progressively from the tested 35 lb reference at 1-2 RIR, close to normal progression.</w:t>
+        <w:t xml:space="preserve">The session's closer — one position that holds everything the day built at once: scapular control from the first block, trunk bracing, and the whole shoulder girdle supporting bodyweight on a stable base. It is the next step in the same closed-chain line the plank shoulder taps sit on, kept as a HOLD rather than a travelling crawl so nothing about the shoulder demand outruns where the rehab actually is. Bodyweight only, no added load, and no progression past a hold without Jason Bethea's clearance. Regress to a quadruped hover (knees an inch off the floor) or a straight plank if the bear position loads the cuff; the same pain rule governs — sharp or pinching pain ends the set, ordinary fatigue does not.</w:t>
       </w:r>
     </w:p>
     <w:tbl>
@@ -9134,7 +10581,7 @@
               <w:bottom w:val="none" w:color="FFFFFF" w:sz="0"/>
               <w:right w:val="none" w:color="FFFFFF" w:sz="0"/>
             </w:tcBorders>
-            <w:shd w:fill="E0F2F1" w:color="auto" w:val="clear"/>
+            <w:shd w:fill="F5E8C0" w:color="auto" w:val="clear"/>
             <w:tcMar>
               <w:top w:type="dxa" w:w="40"/>
               <w:left w:type="dxa" w:w="80"/>
@@ -9152,7 +10599,7 @@
                 <w:rFonts w:ascii="Arial" w:cs="Arial" w:eastAsia="Arial" w:hAnsi="Arial"/>
                 <w:b/>
                 <w:bCs/>
-                <w:color w:val="00695C"/>
+                <w:color w:val="C9A227"/>
                 <w:sz w:val="15"/>
                 <w:szCs w:val="15"/>
               </w:rPr>
@@ -9169,25 +10616,25 @@
               <w:bottom w:val="none" w:color="FFFFFF" w:sz="0"/>
               <w:right w:val="none" w:color="FFFFFF" w:sz="0"/>
             </w:tcBorders>
-            <w:shd w:fill="E0F2F1" w:color="auto" w:val="clear"/>
-            <w:tcMar>
-              <w:top w:type="dxa" w:w="40"/>
-              <w:left w:type="dxa" w:w="80"/>
-              <w:bottom w:type="dxa" w:w="40"/>
-              <w:right w:type="dxa" w:w="80"/>
-            </w:tcMar>
-            <w:vAlign w:val="center"/>
-          </w:tcPr>
-          <w:p>
-            <w:pPr>
-              <w:jc w:val="center"/>
-            </w:pPr>
-            <w:r>
-              <w:rPr>
-                <w:rFonts w:ascii="Arial" w:cs="Arial" w:eastAsia="Arial" w:hAnsi="Arial"/>
-                <w:b/>
-                <w:bCs/>
-                <w:color w:val="00695C"/>
+            <w:shd w:fill="F5E8C0" w:color="auto" w:val="clear"/>
+            <w:tcMar>
+              <w:top w:type="dxa" w:w="40"/>
+              <w:left w:type="dxa" w:w="80"/>
+              <w:bottom w:type="dxa" w:w="40"/>
+              <w:right w:type="dxa" w:w="80"/>
+            </w:tcMar>
+            <w:vAlign w:val="center"/>
+          </w:tcPr>
+          <w:p>
+            <w:pPr>
+              <w:jc w:val="center"/>
+            </w:pPr>
+            <w:r>
+              <w:rPr>
+                <w:rFonts w:ascii="Arial" w:cs="Arial" w:eastAsia="Arial" w:hAnsi="Arial"/>
+                <w:b/>
+                <w:bCs/>
+                <w:color w:val="C9A227"/>
                 <w:sz w:val="13"/>
                 <w:szCs w:val="13"/>
               </w:rPr>
@@ -9204,25 +10651,25 @@
               <w:bottom w:val="none" w:color="FFFFFF" w:sz="0"/>
               <w:right w:val="none" w:color="FFFFFF" w:sz="0"/>
             </w:tcBorders>
-            <w:shd w:fill="E0F2F1" w:color="auto" w:val="clear"/>
-            <w:tcMar>
-              <w:top w:type="dxa" w:w="40"/>
-              <w:left w:type="dxa" w:w="80"/>
-              <w:bottom w:type="dxa" w:w="40"/>
-              <w:right w:type="dxa" w:w="80"/>
-            </w:tcMar>
-            <w:vAlign w:val="center"/>
-          </w:tcPr>
-          <w:p>
-            <w:pPr>
-              <w:jc w:val="center"/>
-            </w:pPr>
-            <w:r>
-              <w:rPr>
-                <w:rFonts w:ascii="Arial" w:cs="Arial" w:eastAsia="Arial" w:hAnsi="Arial"/>
-                <w:b/>
-                <w:bCs/>
-                <w:color w:val="00695C"/>
+            <w:shd w:fill="F5E8C0" w:color="auto" w:val="clear"/>
+            <w:tcMar>
+              <w:top w:type="dxa" w:w="40"/>
+              <w:left w:type="dxa" w:w="80"/>
+              <w:bottom w:type="dxa" w:w="40"/>
+              <w:right w:type="dxa" w:w="80"/>
+            </w:tcMar>
+            <w:vAlign w:val="center"/>
+          </w:tcPr>
+          <w:p>
+            <w:pPr>
+              <w:jc w:val="center"/>
+            </w:pPr>
+            <w:r>
+              <w:rPr>
+                <w:rFonts w:ascii="Arial" w:cs="Arial" w:eastAsia="Arial" w:hAnsi="Arial"/>
+                <w:b/>
+                <w:bCs/>
+                <w:color w:val="C9A227"/>
                 <w:sz w:val="13"/>
                 <w:szCs w:val="13"/>
               </w:rPr>
@@ -9239,25 +10686,25 @@
               <w:bottom w:val="none" w:color="FFFFFF" w:sz="0"/>
               <w:right w:val="none" w:color="FFFFFF" w:sz="0"/>
             </w:tcBorders>
-            <w:shd w:fill="E0F2F1" w:color="auto" w:val="clear"/>
-            <w:tcMar>
-              <w:top w:type="dxa" w:w="40"/>
-              <w:left w:type="dxa" w:w="80"/>
-              <w:bottom w:type="dxa" w:w="40"/>
-              <w:right w:type="dxa" w:w="80"/>
-            </w:tcMar>
-            <w:vAlign w:val="center"/>
-          </w:tcPr>
-          <w:p>
-            <w:pPr>
-              <w:jc w:val="center"/>
-            </w:pPr>
-            <w:r>
-              <w:rPr>
-                <w:rFonts w:ascii="Arial" w:cs="Arial" w:eastAsia="Arial" w:hAnsi="Arial"/>
-                <w:b/>
-                <w:bCs/>
-                <w:color w:val="00695C"/>
+            <w:shd w:fill="F5E8C0" w:color="auto" w:val="clear"/>
+            <w:tcMar>
+              <w:top w:type="dxa" w:w="40"/>
+              <w:left w:type="dxa" w:w="80"/>
+              <w:bottom w:type="dxa" w:w="40"/>
+              <w:right w:type="dxa" w:w="80"/>
+            </w:tcMar>
+            <w:vAlign w:val="center"/>
+          </w:tcPr>
+          <w:p>
+            <w:pPr>
+              <w:jc w:val="center"/>
+            </w:pPr>
+            <w:r>
+              <w:rPr>
+                <w:rFonts w:ascii="Arial" w:cs="Arial" w:eastAsia="Arial" w:hAnsi="Arial"/>
+                <w:b/>
+                <w:bCs/>
+                <w:color w:val="C9A227"/>
                 <w:sz w:val="13"/>
                 <w:szCs w:val="13"/>
               </w:rPr>
@@ -9274,25 +10721,25 @@
               <w:bottom w:val="none" w:color="FFFFFF" w:sz="0"/>
               <w:right w:val="none" w:color="FFFFFF" w:sz="0"/>
             </w:tcBorders>
-            <w:shd w:fill="E0F2F1" w:color="auto" w:val="clear"/>
-            <w:tcMar>
-              <w:top w:type="dxa" w:w="40"/>
-              <w:left w:type="dxa" w:w="80"/>
-              <w:bottom w:type="dxa" w:w="40"/>
-              <w:right w:type="dxa" w:w="80"/>
-            </w:tcMar>
-            <w:vAlign w:val="center"/>
-          </w:tcPr>
-          <w:p>
-            <w:pPr>
-              <w:jc w:val="center"/>
-            </w:pPr>
-            <w:r>
-              <w:rPr>
-                <w:rFonts w:ascii="Arial" w:cs="Arial" w:eastAsia="Arial" w:hAnsi="Arial"/>
-                <w:b/>
-                <w:bCs/>
-                <w:color w:val="00695C"/>
+            <w:shd w:fill="F5E8C0" w:color="auto" w:val="clear"/>
+            <w:tcMar>
+              <w:top w:type="dxa" w:w="40"/>
+              <w:left w:type="dxa" w:w="80"/>
+              <w:bottom w:type="dxa" w:w="40"/>
+              <w:right w:type="dxa" w:w="80"/>
+            </w:tcMar>
+            <w:vAlign w:val="center"/>
+          </w:tcPr>
+          <w:p>
+            <w:pPr>
+              <w:jc w:val="center"/>
+            </w:pPr>
+            <w:r>
+              <w:rPr>
+                <w:rFonts w:ascii="Arial" w:cs="Arial" w:eastAsia="Arial" w:hAnsi="Arial"/>
+                <w:b/>
+                <w:bCs/>
+                <w:color w:val="C9A227"/>
                 <w:sz w:val="13"/>
                 <w:szCs w:val="13"/>
               </w:rPr>
@@ -9309,25 +10756,25 @@
               <w:bottom w:val="none" w:color="FFFFFF" w:sz="0"/>
               <w:right w:val="none" w:color="FFFFFF" w:sz="0"/>
             </w:tcBorders>
-            <w:shd w:fill="E0F2F1" w:color="auto" w:val="clear"/>
-            <w:tcMar>
-              <w:top w:type="dxa" w:w="40"/>
-              <w:left w:type="dxa" w:w="80"/>
-              <w:bottom w:type="dxa" w:w="40"/>
-              <w:right w:type="dxa" w:w="80"/>
-            </w:tcMar>
-            <w:vAlign w:val="center"/>
-          </w:tcPr>
-          <w:p>
-            <w:pPr>
-              <w:jc w:val="center"/>
-            </w:pPr>
-            <w:r>
-              <w:rPr>
-                <w:rFonts w:ascii="Arial" w:cs="Arial" w:eastAsia="Arial" w:hAnsi="Arial"/>
-                <w:b/>
-                <w:bCs/>
-                <w:color w:val="00695C"/>
+            <w:shd w:fill="F5E8C0" w:color="auto" w:val="clear"/>
+            <w:tcMar>
+              <w:top w:type="dxa" w:w="40"/>
+              <w:left w:type="dxa" w:w="80"/>
+              <w:bottom w:type="dxa" w:w="40"/>
+              <w:right w:type="dxa" w:w="80"/>
+            </w:tcMar>
+            <w:vAlign w:val="center"/>
+          </w:tcPr>
+          <w:p>
+            <w:pPr>
+              <w:jc w:val="center"/>
+            </w:pPr>
+            <w:r>
+              <w:rPr>
+                <w:rFonts w:ascii="Arial" w:cs="Arial" w:eastAsia="Arial" w:hAnsi="Arial"/>
+                <w:b/>
+                <w:bCs/>
+                <w:color w:val="C9A227"/>
                 <w:sz w:val="13"/>
                 <w:szCs w:val="13"/>
               </w:rPr>
@@ -9344,7 +10791,7 @@
               <w:bottom w:val="none" w:color="FFFFFF" w:sz="0"/>
               <w:right w:val="none" w:color="FFFFFF" w:sz="0"/>
             </w:tcBorders>
-            <w:shd w:fill="E0F2F1" w:color="auto" w:val="clear"/>
+            <w:shd w:fill="F5E8C0" w:color="auto" w:val="clear"/>
             <w:tcMar>
               <w:top w:type="dxa" w:w="40"/>
               <w:left w:type="dxa" w:w="80"/>
@@ -9362,7 +10809,7 @@
                 <w:rFonts w:ascii="Arial" w:cs="Arial" w:eastAsia="Arial" w:hAnsi="Arial"/>
                 <w:b/>
                 <w:bCs/>
-                <w:color w:val="00695C"/>
+                <w:color w:val="C9A227"/>
                 <w:sz w:val="15"/>
                 <w:szCs w:val="15"/>
               </w:rPr>
@@ -9381,7 +10828,7 @@
               <w:bottom w:val="none" w:color="FFFFFF" w:sz="0"/>
               <w:right w:val="none" w:color="FFFFFF" w:sz="0"/>
             </w:tcBorders>
-            <w:shd w:fill="F0FAFA" w:color="auto" w:val="clear"/>
+            <w:shd w:fill="FAF3E0" w:color="auto" w:val="clear"/>
             <w:tcMar>
               <w:top w:type="dxa" w:w="40"/>
               <w:left w:type="dxa" w:w="80"/>
@@ -9400,7 +10847,20 @@
                 <w:sz w:val="18"/>
                 <w:szCs w:val="18"/>
               </w:rPr>
-              <w:t xml:space="preserve">Single-Arm DB Row</w:t>
+              <w:t xml:space="preserve">Bear Crawl Hold (Static)</w:t>
+            </w:r>
+          </w:p>
+          <w:p>
+            <w:r>
+              <w:rPr>
+                <w:rFonts w:ascii="Arial" w:cs="Arial" w:eastAsia="Arial" w:hAnsi="Arial"/>
+                <w:i/>
+                <w:iCs/>
+                <w:color w:val="B71C1C"/>
+                <w:sz w:val="14"/>
+                <w:szCs w:val="14"/>
+              </w:rPr>
+              <w:t xml:space="preserve">Regress to quadruped hover or a straight plank if the bear position loads the cuff</w:t>
             </w:r>
           </w:p>
         </w:tc>
@@ -9413,7 +10873,7 @@
               <w:bottom w:val="none" w:color="FFFFFF" w:sz="0"/>
               <w:right w:val="none" w:color="FFFFFF" w:sz="0"/>
             </w:tcBorders>
-            <w:shd w:fill="F0FAFA" w:color="auto" w:val="clear"/>
+            <w:shd w:fill="FAF3E0" w:color="auto" w:val="clear"/>
             <w:tcMar>
               <w:top w:type="dxa" w:w="40"/>
               <w:left w:type="dxa" w:w="80"/>
@@ -9446,27 +10906,27 @@
               <w:bottom w:val="none" w:color="FFFFFF" w:sz="0"/>
               <w:right w:val="none" w:color="FFFFFF" w:sz="0"/>
             </w:tcBorders>
-            <w:shd w:fill="F0FAFA" w:color="auto" w:val="clear"/>
-            <w:tcMar>
-              <w:top w:type="dxa" w:w="40"/>
-              <w:left w:type="dxa" w:w="80"/>
-              <w:bottom w:type="dxa" w:w="40"/>
-              <w:right w:type="dxa" w:w="80"/>
-            </w:tcMar>
-            <w:vAlign w:val="center"/>
-          </w:tcPr>
-          <w:p>
-            <w:pPr>
-              <w:jc w:val="center"/>
-            </w:pPr>
-            <w:r>
-              <w:rPr>
-                <w:rFonts w:ascii="Arial" w:cs="Arial" w:eastAsia="Arial" w:hAnsi="Arial"/>
-                <w:color w:val="6B6B6B"/>
-                <w:sz w:val="15"/>
-                <w:szCs w:val="15"/>
-              </w:rPr>
-              <w:t xml:space="preserve">10-12/side</w:t>
+            <w:shd w:fill="FAF3E0" w:color="auto" w:val="clear"/>
+            <w:tcMar>
+              <w:top w:type="dxa" w:w="40"/>
+              <w:left w:type="dxa" w:w="80"/>
+              <w:bottom w:type="dxa" w:w="40"/>
+              <w:right w:type="dxa" w:w="80"/>
+            </w:tcMar>
+            <w:vAlign w:val="center"/>
+          </w:tcPr>
+          <w:p>
+            <w:pPr>
+              <w:jc w:val="center"/>
+            </w:pPr>
+            <w:r>
+              <w:rPr>
+                <w:rFonts w:ascii="Arial" w:cs="Arial" w:eastAsia="Arial" w:hAnsi="Arial"/>
+                <w:color w:val="6B6B6B"/>
+                <w:sz w:val="15"/>
+                <w:szCs w:val="15"/>
+              </w:rPr>
+              <w:t xml:space="preserve">20-30s</w:t>
             </w:r>
           </w:p>
         </w:tc>
@@ -9479,27 +10939,27 @@
               <w:bottom w:val="none" w:color="FFFFFF" w:sz="0"/>
               <w:right w:val="none" w:color="FFFFFF" w:sz="0"/>
             </w:tcBorders>
-            <w:shd w:fill="F0FAFA" w:color="auto" w:val="clear"/>
-            <w:tcMar>
-              <w:top w:type="dxa" w:w="40"/>
-              <w:left w:type="dxa" w:w="80"/>
-              <w:bottom w:type="dxa" w:w="40"/>
-              <w:right w:type="dxa" w:w="80"/>
-            </w:tcMar>
-            <w:vAlign w:val="center"/>
-          </w:tcPr>
-          <w:p>
-            <w:pPr>
-              <w:jc w:val="center"/>
-            </w:pPr>
-            <w:r>
-              <w:rPr>
-                <w:rFonts w:ascii="Arial" w:cs="Arial" w:eastAsia="Arial" w:hAnsi="Arial"/>
-                <w:color w:val="6B6B6B"/>
-                <w:sz w:val="15"/>
-                <w:szCs w:val="15"/>
-              </w:rPr>
-              <w:t xml:space="preserve">35-40 lbs, build weekly</w:t>
+            <w:shd w:fill="FAF3E0" w:color="auto" w:val="clear"/>
+            <w:tcMar>
+              <w:top w:type="dxa" w:w="40"/>
+              <w:left w:type="dxa" w:w="80"/>
+              <w:bottom w:type="dxa" w:w="40"/>
+              <w:right w:type="dxa" w:w="80"/>
+            </w:tcMar>
+            <w:vAlign w:val="center"/>
+          </w:tcPr>
+          <w:p>
+            <w:pPr>
+              <w:jc w:val="center"/>
+            </w:pPr>
+            <w:r>
+              <w:rPr>
+                <w:rFonts w:ascii="Arial" w:cs="Arial" w:eastAsia="Arial" w:hAnsi="Arial"/>
+                <w:color w:val="6B6B6B"/>
+                <w:sz w:val="15"/>
+                <w:szCs w:val="15"/>
+              </w:rPr>
+              <w:t xml:space="preserve">Bodyweight</w:t>
             </w:r>
           </w:p>
         </w:tc>
@@ -9512,27 +10972,27 @@
               <w:bottom w:val="none" w:color="FFFFFF" w:sz="0"/>
               <w:right w:val="none" w:color="FFFFFF" w:sz="0"/>
             </w:tcBorders>
-            <w:shd w:fill="F0FAFA" w:color="auto" w:val="clear"/>
-            <w:tcMar>
-              <w:top w:type="dxa" w:w="40"/>
-              <w:left w:type="dxa" w:w="80"/>
-              <w:bottom w:type="dxa" w:w="40"/>
-              <w:right w:type="dxa" w:w="80"/>
-            </w:tcMar>
-            <w:vAlign w:val="center"/>
-          </w:tcPr>
-          <w:p>
-            <w:pPr>
-              <w:jc w:val="center"/>
-            </w:pPr>
-            <w:r>
-              <w:rPr>
-                <w:rFonts w:ascii="Arial" w:cs="Arial" w:eastAsia="Arial" w:hAnsi="Arial"/>
-                <w:color w:val="6B6B6B"/>
-                <w:sz w:val="15"/>
-                <w:szCs w:val="15"/>
-              </w:rPr>
-              <w:t xml:space="preserve">2-1-2</w:t>
+            <w:shd w:fill="FAF3E0" w:color="auto" w:val="clear"/>
+            <w:tcMar>
+              <w:top w:type="dxa" w:w="40"/>
+              <w:left w:type="dxa" w:w="80"/>
+              <w:bottom w:type="dxa" w:w="40"/>
+              <w:right w:type="dxa" w:w="80"/>
+            </w:tcMar>
+            <w:vAlign w:val="center"/>
+          </w:tcPr>
+          <w:p>
+            <w:pPr>
+              <w:jc w:val="center"/>
+            </w:pPr>
+            <w:r>
+              <w:rPr>
+                <w:rFonts w:ascii="Arial" w:cs="Arial" w:eastAsia="Arial" w:hAnsi="Arial"/>
+                <w:color w:val="6B6B6B"/>
+                <w:sz w:val="15"/>
+                <w:szCs w:val="15"/>
+              </w:rPr>
+              <w:t xml:space="preserve">Hold</w:t>
             </w:r>
           </w:p>
         </w:tc>
@@ -9545,27 +11005,27 @@
               <w:bottom w:val="none" w:color="FFFFFF" w:sz="0"/>
               <w:right w:val="none" w:color="FFFFFF" w:sz="0"/>
             </w:tcBorders>
-            <w:shd w:fill="F0FAFA" w:color="auto" w:val="clear"/>
-            <w:tcMar>
-              <w:top w:type="dxa" w:w="40"/>
-              <w:left w:type="dxa" w:w="80"/>
-              <w:bottom w:type="dxa" w:w="40"/>
-              <w:right w:type="dxa" w:w="80"/>
-            </w:tcMar>
-            <w:vAlign w:val="center"/>
-          </w:tcPr>
-          <w:p>
-            <w:pPr>
-              <w:jc w:val="center"/>
-            </w:pPr>
-            <w:r>
-              <w:rPr>
-                <w:rFonts w:ascii="Arial" w:cs="Arial" w:eastAsia="Arial" w:hAnsi="Arial"/>
-                <w:color w:val="6B6B6B"/>
-                <w:sz w:val="15"/>
-                <w:szCs w:val="15"/>
-              </w:rPr>
-              <w:t xml:space="preserve">60s</w:t>
+            <w:shd w:fill="FAF3E0" w:color="auto" w:val="clear"/>
+            <w:tcMar>
+              <w:top w:type="dxa" w:w="40"/>
+              <w:left w:type="dxa" w:w="80"/>
+              <w:bottom w:type="dxa" w:w="40"/>
+              <w:right w:type="dxa" w:w="80"/>
+            </w:tcMar>
+            <w:vAlign w:val="center"/>
+          </w:tcPr>
+          <w:p>
+            <w:pPr>
+              <w:jc w:val="center"/>
+            </w:pPr>
+            <w:r>
+              <w:rPr>
+                <w:rFonts w:ascii="Arial" w:cs="Arial" w:eastAsia="Arial" w:hAnsi="Arial"/>
+                <w:color w:val="6B6B6B"/>
+                <w:sz w:val="15"/>
+                <w:szCs w:val="15"/>
+              </w:rPr>
+              <w:t xml:space="preserve">45s</w:t>
             </w:r>
           </w:p>
         </w:tc>
@@ -9578,7 +11038,7 @@
               <w:bottom w:val="none" w:color="FFFFFF" w:sz="0"/>
               <w:right w:val="none" w:color="FFFFFF" w:sz="0"/>
             </w:tcBorders>
-            <w:shd w:fill="F0FAFA" w:color="auto" w:val="clear"/>
+            <w:shd w:fill="FAF3E0" w:color="auto" w:val="clear"/>
             <w:tcMar>
               <w:top w:type="dxa" w:w="40"/>
               <w:left w:type="dxa" w:w="80"/>
@@ -9595,7 +11055,18 @@
                 <w:sz w:val="17"/>
                 <w:szCs w:val="17"/>
               </w:rPr>
-              <w:t xml:space="preserve">Full lat stretch at bottom. Stop at sharp/pinching pain.</w:t>
+              <w:t xml:space="preserve">Knees hovering, back flat, ribs down. Breathe through the hold.</w:t>
+            </w:r>
+            <w:r>
+              <w:rPr>
+                <w:rFonts w:ascii="Arial" w:cs="Arial" w:eastAsia="Arial" w:hAnsi="Arial"/>
+                <w:i/>
+                <w:iCs/>
+                <w:color w:val="00695C"/>
+                <w:sz w:val="14"/>
+                <w:szCs w:val="14"/>
+              </w:rPr>
+              <w:t xml:space="preserve">  Hold quality governed — no RIR target</w:t>
             </w:r>
           </w:p>
         </w:tc>
@@ -9899,7 +11370,7 @@
           <w:sz w:val="17"/>
           <w:szCs w:val="17"/>
         </w:rPr>
-        <w:t xml:space="preserve">Moderate accumulation day — build clean volume at 2 RIR, not a max-effort test. Left leads every unilateral leg set this week per the asymmetry note. Farmers Carry and push-ups both load the shoulder girdle isometrically — apply the same pain-monitoring rule from Day 2 here too, even though today's primary focus is the lower body. The session closes with a short conditioning finisher — the metabolic third of the ICONS three-zone build.</w:t>
+        <w:t xml:space="preserve">Moderate accumulation day — build clean volume at two reps in reserve, not a max-effort test. Left leads every unilateral leg set this week per the asymmetry note. Farmers Carry and push-ups both load the shoulder girdle isometrically — apply the same pain-monitoring rule from Day 2 here too, even though today's primary focus is the lower body. The session closes with a short conditioning finisher — the metabolic third of the ICONS three-zone build.</w:t>
       </w:r>
     </w:p>
     <w:p>
@@ -9940,7 +11411,7 @@
           <w:sz w:val="17"/>
           <w:szCs w:val="17"/>
         </w:rPr>
-        <w:t xml:space="preserve">A — HIP &amp; ANKLE MOBILITY PREP</w:t>
+        <w:t xml:space="preserve">A — CORRECTIVE — HIP &amp; ANKLE MOBILITY PREP</w:t>
       </w:r>
     </w:p>
     <w:p>
@@ -10713,7 +12184,7 @@
           <w:sz w:val="17"/>
           <w:szCs w:val="17"/>
         </w:rPr>
-        <w:t xml:space="preserve">B — PRIMARY — SINGLE-LEG ROMANIAN DEADLIFT</w:t>
+        <w:t xml:space="preserve">B — PRIMARY COMPOUND — SINGLE-LEG ROMANIAN DEADLIFT (LEFT-LED)</w:t>
       </w:r>
     </w:p>
     <w:p>
@@ -10738,7 +12209,7 @@
           <w:sz w:val="17"/>
           <w:szCs w:val="17"/>
         </w:rPr>
-        <w:t xml:space="preserve">Reference load 30 lbs (no rep count recorded at intake) — left leg leads per the asymmetry protocol; build progressively at 1-2 RIR.</w:t>
+        <w:t xml:space="preserve">Reference load 30 lbs (no rep count recorded at intake) — left leg leads per the asymmetry protocol; build progressively at two reps in reserve and log the working weight weekly so a real Week 4 number exists. If the day calls for a variation, rotate between: a two-hand dumbbell single-leg RDL (easier to balance, more load), a rack- or rail-supported single-leg RDL (a hand on the upright removes the balance demand — and it is the version to use on a day the shoulder does not want to hold a dumbbell out at arm's length), or a b-stance RDL (back toe down for support, still one hip doing the work).</w:t>
       </w:r>
     </w:p>
     <w:tbl>
@@ -11041,6 +12512,19 @@
               <w:t xml:space="preserve">Single-Leg Romanian Deadlift</w:t>
             </w:r>
           </w:p>
+          <w:p>
+            <w:r>
+              <w:rPr>
+                <w:rFonts w:ascii="Arial" w:cs="Arial" w:eastAsia="Arial" w:hAnsi="Arial"/>
+                <w:i/>
+                <w:iCs/>
+                <w:color w:val="B71C1C"/>
+                <w:sz w:val="14"/>
+                <w:szCs w:val="14"/>
+              </w:rPr>
+              <w:t xml:space="preserve">Left leg leads — weaker side per the asymmetry note</w:t>
+            </w:r>
+          </w:p>
         </w:tc>
         <w:tc>
           <w:tcPr>
@@ -11137,7 +12621,7 @@
                 <w:sz w:val="15"/>
                 <w:szCs w:val="15"/>
               </w:rPr>
-              <w:t xml:space="preserve">30 lbs (reference) → build 1-2 RIR</w:t>
+              <w:t xml:space="preserve">30 lbs (reference) → build weekly</w:t>
             </w:r>
           </w:p>
         </w:tc>
@@ -11233,7 +12717,1141 @@
                 <w:sz w:val="17"/>
                 <w:szCs w:val="17"/>
               </w:rPr>
-              <w:t xml:space="preserve">Left leg leads — weaker side. Hips square, soft knee.</w:t>
+              <w:t xml:space="preserve">Left leg leads. Hips square, soft knee.</w:t>
+            </w:r>
+            <w:r>
+              <w:rPr>
+                <w:rFonts w:ascii="Arial" w:cs="Arial" w:eastAsia="Arial" w:hAnsi="Arial"/>
+                <w:i/>
+                <w:iCs/>
+                <w:color w:val="00695C"/>
+                <w:sz w:val="14"/>
+                <w:szCs w:val="14"/>
+              </w:rPr>
+              <w:t xml:space="preserve">  2 RIR</w:t>
+            </w:r>
+          </w:p>
+        </w:tc>
+      </w:tr>
+    </w:tbl>
+    <w:p>
+      <w:pPr>
+        <w:spacing w:after="100"/>
+      </w:pPr>
+    </w:p>
+    <w:p>
+      <w:pPr>
+        <w:spacing w:after="60" w:before="120"/>
+      </w:pPr>
+      <w:r>
+        <w:rPr>
+          <w:rFonts w:ascii="Arial" w:cs="Arial" w:eastAsia="Arial" w:hAnsi="Arial"/>
+          <w:b/>
+          <w:bCs/>
+          <w:color w:val="43A047"/>
+          <w:sz w:val="17"/>
+          <w:szCs w:val="17"/>
+        </w:rPr>
+        <w:t xml:space="preserve">C — ACCESSORY — PUSH-UP PROTOCOL</w:t>
+      </w:r>
+    </w:p>
+    <w:p>
+      <w:pPr>
+        <w:spacing w:after="80"/>
+      </w:pPr>
+      <w:r>
+        <w:rPr>
+          <w:rFonts w:ascii="Arial" w:cs="Arial" w:eastAsia="Arial" w:hAnsi="Arial"/>
+          <w:b/>
+          <w:bCs/>
+          <w:color w:val="43A047"/>
+          <w:sz w:val="17"/>
+          <w:szCs w:val="17"/>
+        </w:rPr>
+        <w:t xml:space="preserve">Load Target:  </w:t>
+      </w:r>
+      <w:r>
+        <w:rPr>
+          <w:rFonts w:ascii="Arial" w:cs="Arial" w:eastAsia="Arial" w:hAnsi="Arial"/>
+          <w:color w:val="2C2C2C"/>
+          <w:sz w:val="17"/>
+          <w:szCs w:val="17"/>
+        </w:rPr>
+        <w:t xml:space="preserve">Baseline 12 full push-ups, tested 8/11/2026 — eight-week target is 20-22 in a single set, and this is the block that moves that number. Today is a full-body day, so this block carries the week's second dose of upper-body pushing volume: a controlled, non-overhead range that is normally well tolerated alongside the cuff work, at a different angle from Thursday's incline press. The same pain-monitoring rule still applies.</w:t>
+      </w:r>
+    </w:p>
+    <w:tbl>
+      <w:tblPr>
+        <w:tblW w:type="dxa" w:w="10440"/>
+        <w:tblBorders>
+          <w:top w:val="none" w:color="FFFFFF" w:sz="0"/>
+          <w:left w:val="none" w:color="FFFFFF" w:sz="0"/>
+          <w:bottom w:val="none" w:color="FFFFFF" w:sz="0"/>
+          <w:right w:val="none" w:color="FFFFFF" w:sz="0"/>
+          <w:insideH w:val="single" w:color="auto" w:sz="4"/>
+          <w:insideV w:val="single" w:color="auto" w:sz="4"/>
+        </w:tblBorders>
+      </w:tblPr>
+      <w:tblGrid>
+        <w:gridCol w:w="2400"/>
+        <w:gridCol w:w="380"/>
+        <w:gridCol w:w="420"/>
+        <w:gridCol w:w="680"/>
+        <w:gridCol w:w="540"/>
+        <w:gridCol w:w="440"/>
+        <w:gridCol w:w="5580"/>
+      </w:tblGrid>
+      <w:tr>
+        <w:tc>
+          <w:tcPr>
+            <w:tcW w:type="dxa" w:w="2400"/>
+            <w:tcBorders>
+              <w:top w:val="none" w:color="FFFFFF" w:sz="0"/>
+              <w:left w:val="none" w:color="FFFFFF" w:sz="0"/>
+              <w:bottom w:val="none" w:color="FFFFFF" w:sz="0"/>
+              <w:right w:val="none" w:color="FFFFFF" w:sz="0"/>
+            </w:tcBorders>
+            <w:shd w:fill="E8F5E9" w:color="auto" w:val="clear"/>
+            <w:tcMar>
+              <w:top w:type="dxa" w:w="40"/>
+              <w:left w:type="dxa" w:w="80"/>
+              <w:bottom w:type="dxa" w:w="40"/>
+              <w:right w:type="dxa" w:w="80"/>
+            </w:tcMar>
+            <w:vAlign w:val="center"/>
+          </w:tcPr>
+          <w:p>
+            <w:pPr>
+              <w:jc w:val="left"/>
+            </w:pPr>
+            <w:r>
+              <w:rPr>
+                <w:rFonts w:ascii="Arial" w:cs="Arial" w:eastAsia="Arial" w:hAnsi="Arial"/>
+                <w:b/>
+                <w:bCs/>
+                <w:color w:val="43A047"/>
+                <w:sz w:val="15"/>
+                <w:szCs w:val="15"/>
+              </w:rPr>
+              <w:t xml:space="preserve">EXERCISE</w:t>
+            </w:r>
+          </w:p>
+        </w:tc>
+        <w:tc>
+          <w:tcPr>
+            <w:tcW w:type="dxa" w:w="380"/>
+            <w:tcBorders>
+              <w:top w:val="none" w:color="FFFFFF" w:sz="0"/>
+              <w:left w:val="none" w:color="FFFFFF" w:sz="0"/>
+              <w:bottom w:val="none" w:color="FFFFFF" w:sz="0"/>
+              <w:right w:val="none" w:color="FFFFFF" w:sz="0"/>
+            </w:tcBorders>
+            <w:shd w:fill="E8F5E9" w:color="auto" w:val="clear"/>
+            <w:tcMar>
+              <w:top w:type="dxa" w:w="40"/>
+              <w:left w:type="dxa" w:w="80"/>
+              <w:bottom w:type="dxa" w:w="40"/>
+              <w:right w:type="dxa" w:w="80"/>
+            </w:tcMar>
+            <w:vAlign w:val="center"/>
+          </w:tcPr>
+          <w:p>
+            <w:pPr>
+              <w:jc w:val="center"/>
+            </w:pPr>
+            <w:r>
+              <w:rPr>
+                <w:rFonts w:ascii="Arial" w:cs="Arial" w:eastAsia="Arial" w:hAnsi="Arial"/>
+                <w:b/>
+                <w:bCs/>
+                <w:color w:val="43A047"/>
+                <w:sz w:val="13"/>
+                <w:szCs w:val="13"/>
+              </w:rPr>
+              <w:t xml:space="preserve">SETS</w:t>
+            </w:r>
+          </w:p>
+        </w:tc>
+        <w:tc>
+          <w:tcPr>
+            <w:tcW w:type="dxa" w:w="420"/>
+            <w:tcBorders>
+              <w:top w:val="none" w:color="FFFFFF" w:sz="0"/>
+              <w:left w:val="none" w:color="FFFFFF" w:sz="0"/>
+              <w:bottom w:val="none" w:color="FFFFFF" w:sz="0"/>
+              <w:right w:val="none" w:color="FFFFFF" w:sz="0"/>
+            </w:tcBorders>
+            <w:shd w:fill="E8F5E9" w:color="auto" w:val="clear"/>
+            <w:tcMar>
+              <w:top w:type="dxa" w:w="40"/>
+              <w:left w:type="dxa" w:w="80"/>
+              <w:bottom w:type="dxa" w:w="40"/>
+              <w:right w:type="dxa" w:w="80"/>
+            </w:tcMar>
+            <w:vAlign w:val="center"/>
+          </w:tcPr>
+          <w:p>
+            <w:pPr>
+              <w:jc w:val="center"/>
+            </w:pPr>
+            <w:r>
+              <w:rPr>
+                <w:rFonts w:ascii="Arial" w:cs="Arial" w:eastAsia="Arial" w:hAnsi="Arial"/>
+                <w:b/>
+                <w:bCs/>
+                <w:color w:val="43A047"/>
+                <w:sz w:val="13"/>
+                <w:szCs w:val="13"/>
+              </w:rPr>
+              <w:t xml:space="preserve">REPS</w:t>
+            </w:r>
+          </w:p>
+        </w:tc>
+        <w:tc>
+          <w:tcPr>
+            <w:tcW w:type="dxa" w:w="680"/>
+            <w:tcBorders>
+              <w:top w:val="none" w:color="FFFFFF" w:sz="0"/>
+              <w:left w:val="none" w:color="FFFFFF" w:sz="0"/>
+              <w:bottom w:val="none" w:color="FFFFFF" w:sz="0"/>
+              <w:right w:val="none" w:color="FFFFFF" w:sz="0"/>
+            </w:tcBorders>
+            <w:shd w:fill="E8F5E9" w:color="auto" w:val="clear"/>
+            <w:tcMar>
+              <w:top w:type="dxa" w:w="40"/>
+              <w:left w:type="dxa" w:w="80"/>
+              <w:bottom w:type="dxa" w:w="40"/>
+              <w:right w:type="dxa" w:w="80"/>
+            </w:tcMar>
+            <w:vAlign w:val="center"/>
+          </w:tcPr>
+          <w:p>
+            <w:pPr>
+              <w:jc w:val="center"/>
+            </w:pPr>
+            <w:r>
+              <w:rPr>
+                <w:rFonts w:ascii="Arial" w:cs="Arial" w:eastAsia="Arial" w:hAnsi="Arial"/>
+                <w:b/>
+                <w:bCs/>
+                <w:color w:val="43A047"/>
+                <w:sz w:val="13"/>
+                <w:szCs w:val="13"/>
+              </w:rPr>
+              <w:t xml:space="preserve">LOAD</w:t>
+            </w:r>
+          </w:p>
+        </w:tc>
+        <w:tc>
+          <w:tcPr>
+            <w:tcW w:type="dxa" w:w="540"/>
+            <w:tcBorders>
+              <w:top w:val="none" w:color="FFFFFF" w:sz="0"/>
+              <w:left w:val="none" w:color="FFFFFF" w:sz="0"/>
+              <w:bottom w:val="none" w:color="FFFFFF" w:sz="0"/>
+              <w:right w:val="none" w:color="FFFFFF" w:sz="0"/>
+            </w:tcBorders>
+            <w:shd w:fill="E8F5E9" w:color="auto" w:val="clear"/>
+            <w:tcMar>
+              <w:top w:type="dxa" w:w="40"/>
+              <w:left w:type="dxa" w:w="80"/>
+              <w:bottom w:type="dxa" w:w="40"/>
+              <w:right w:type="dxa" w:w="80"/>
+            </w:tcMar>
+            <w:vAlign w:val="center"/>
+          </w:tcPr>
+          <w:p>
+            <w:pPr>
+              <w:jc w:val="center"/>
+            </w:pPr>
+            <w:r>
+              <w:rPr>
+                <w:rFonts w:ascii="Arial" w:cs="Arial" w:eastAsia="Arial" w:hAnsi="Arial"/>
+                <w:b/>
+                <w:bCs/>
+                <w:color w:val="43A047"/>
+                <w:sz w:val="13"/>
+                <w:szCs w:val="13"/>
+              </w:rPr>
+              <w:t xml:space="preserve">TEMPO</w:t>
+            </w:r>
+          </w:p>
+        </w:tc>
+        <w:tc>
+          <w:tcPr>
+            <w:tcW w:type="dxa" w:w="440"/>
+            <w:tcBorders>
+              <w:top w:val="none" w:color="FFFFFF" w:sz="0"/>
+              <w:left w:val="none" w:color="FFFFFF" w:sz="0"/>
+              <w:bottom w:val="none" w:color="FFFFFF" w:sz="0"/>
+              <w:right w:val="none" w:color="FFFFFF" w:sz="0"/>
+            </w:tcBorders>
+            <w:shd w:fill="E8F5E9" w:color="auto" w:val="clear"/>
+            <w:tcMar>
+              <w:top w:type="dxa" w:w="40"/>
+              <w:left w:type="dxa" w:w="80"/>
+              <w:bottom w:type="dxa" w:w="40"/>
+              <w:right w:type="dxa" w:w="80"/>
+            </w:tcMar>
+            <w:vAlign w:val="center"/>
+          </w:tcPr>
+          <w:p>
+            <w:pPr>
+              <w:jc w:val="center"/>
+            </w:pPr>
+            <w:r>
+              <w:rPr>
+                <w:rFonts w:ascii="Arial" w:cs="Arial" w:eastAsia="Arial" w:hAnsi="Arial"/>
+                <w:b/>
+                <w:bCs/>
+                <w:color w:val="43A047"/>
+                <w:sz w:val="13"/>
+                <w:szCs w:val="13"/>
+              </w:rPr>
+              <w:t xml:space="preserve">REST</w:t>
+            </w:r>
+          </w:p>
+        </w:tc>
+        <w:tc>
+          <w:tcPr>
+            <w:tcW w:type="dxa" w:w="5580"/>
+            <w:tcBorders>
+              <w:top w:val="none" w:color="FFFFFF" w:sz="0"/>
+              <w:left w:val="none" w:color="FFFFFF" w:sz="0"/>
+              <w:bottom w:val="none" w:color="FFFFFF" w:sz="0"/>
+              <w:right w:val="none" w:color="FFFFFF" w:sz="0"/>
+            </w:tcBorders>
+            <w:shd w:fill="E8F5E9" w:color="auto" w:val="clear"/>
+            <w:tcMar>
+              <w:top w:type="dxa" w:w="40"/>
+              <w:left w:type="dxa" w:w="80"/>
+              <w:bottom w:type="dxa" w:w="40"/>
+              <w:right w:type="dxa" w:w="80"/>
+            </w:tcMar>
+            <w:vAlign w:val="center"/>
+          </w:tcPr>
+          <w:p>
+            <w:pPr>
+              <w:jc w:val="left"/>
+            </w:pPr>
+            <w:r>
+              <w:rPr>
+                <w:rFonts w:ascii="Arial" w:cs="Arial" w:eastAsia="Arial" w:hAnsi="Arial"/>
+                <w:b/>
+                <w:bCs/>
+                <w:color w:val="43A047"/>
+                <w:sz w:val="15"/>
+                <w:szCs w:val="15"/>
+              </w:rPr>
+              <w:t xml:space="preserve">COACHING CUE</w:t>
+            </w:r>
+          </w:p>
+        </w:tc>
+      </w:tr>
+      <w:tr>
+        <w:tc>
+          <w:tcPr>
+            <w:tcW w:type="dxa" w:w="2400"/>
+            <w:tcBorders>
+              <w:top w:val="none" w:color="FFFFFF" w:sz="0"/>
+              <w:left w:val="none" w:color="FFFFFF" w:sz="0"/>
+              <w:bottom w:val="none" w:color="FFFFFF" w:sz="0"/>
+              <w:right w:val="none" w:color="FFFFFF" w:sz="0"/>
+            </w:tcBorders>
+            <w:shd w:fill="F1F8F2" w:color="auto" w:val="clear"/>
+            <w:tcMar>
+              <w:top w:type="dxa" w:w="40"/>
+              <w:left w:type="dxa" w:w="80"/>
+              <w:bottom w:type="dxa" w:w="40"/>
+              <w:right w:type="dxa" w:w="80"/>
+            </w:tcMar>
+            <w:vAlign w:val="center"/>
+          </w:tcPr>
+          <w:p>
+            <w:r>
+              <w:rPr>
+                <w:rFonts w:ascii="Arial" w:cs="Arial" w:eastAsia="Arial" w:hAnsi="Arial"/>
+                <w:b/>
+                <w:bCs/>
+                <w:color w:val="2C2C2C"/>
+                <w:sz w:val="18"/>
+                <w:szCs w:val="18"/>
+              </w:rPr>
+              <w:t xml:space="preserve">Push-Ups</w:t>
+            </w:r>
+          </w:p>
+        </w:tc>
+        <w:tc>
+          <w:tcPr>
+            <w:tcW w:type="dxa" w:w="380"/>
+            <w:tcBorders>
+              <w:top w:val="none" w:color="FFFFFF" w:sz="0"/>
+              <w:left w:val="none" w:color="FFFFFF" w:sz="0"/>
+              <w:bottom w:val="none" w:color="FFFFFF" w:sz="0"/>
+              <w:right w:val="none" w:color="FFFFFF" w:sz="0"/>
+            </w:tcBorders>
+            <w:shd w:fill="F1F8F2" w:color="auto" w:val="clear"/>
+            <w:tcMar>
+              <w:top w:type="dxa" w:w="40"/>
+              <w:left w:type="dxa" w:w="80"/>
+              <w:bottom w:type="dxa" w:w="40"/>
+              <w:right w:type="dxa" w:w="80"/>
+            </w:tcMar>
+            <w:vAlign w:val="center"/>
+          </w:tcPr>
+          <w:p>
+            <w:pPr>
+              <w:jc w:val="center"/>
+            </w:pPr>
+            <w:r>
+              <w:rPr>
+                <w:rFonts w:ascii="Arial" w:cs="Arial" w:eastAsia="Arial" w:hAnsi="Arial"/>
+                <w:color w:val="6B6B6B"/>
+                <w:sz w:val="15"/>
+                <w:szCs w:val="15"/>
+              </w:rPr>
+              <w:t xml:space="preserve">3</w:t>
+            </w:r>
+          </w:p>
+        </w:tc>
+        <w:tc>
+          <w:tcPr>
+            <w:tcW w:type="dxa" w:w="420"/>
+            <w:tcBorders>
+              <w:top w:val="none" w:color="FFFFFF" w:sz="0"/>
+              <w:left w:val="none" w:color="FFFFFF" w:sz="0"/>
+              <w:bottom w:val="none" w:color="FFFFFF" w:sz="0"/>
+              <w:right w:val="none" w:color="FFFFFF" w:sz="0"/>
+            </w:tcBorders>
+            <w:shd w:fill="F1F8F2" w:color="auto" w:val="clear"/>
+            <w:tcMar>
+              <w:top w:type="dxa" w:w="40"/>
+              <w:left w:type="dxa" w:w="80"/>
+              <w:bottom w:type="dxa" w:w="40"/>
+              <w:right w:type="dxa" w:w="80"/>
+            </w:tcMar>
+            <w:vAlign w:val="center"/>
+          </w:tcPr>
+          <w:p>
+            <w:pPr>
+              <w:jc w:val="center"/>
+            </w:pPr>
+            <w:r>
+              <w:rPr>
+                <w:rFonts w:ascii="Arial" w:cs="Arial" w:eastAsia="Arial" w:hAnsi="Arial"/>
+                <w:color w:val="6B6B6B"/>
+                <w:sz w:val="15"/>
+                <w:szCs w:val="15"/>
+              </w:rPr>
+              <w:t xml:space="preserve">10-14</w:t>
+            </w:r>
+          </w:p>
+        </w:tc>
+        <w:tc>
+          <w:tcPr>
+            <w:tcW w:type="dxa" w:w="680"/>
+            <w:tcBorders>
+              <w:top w:val="none" w:color="FFFFFF" w:sz="0"/>
+              <w:left w:val="none" w:color="FFFFFF" w:sz="0"/>
+              <w:bottom w:val="none" w:color="FFFFFF" w:sz="0"/>
+              <w:right w:val="none" w:color="FFFFFF" w:sz="0"/>
+            </w:tcBorders>
+            <w:shd w:fill="F1F8F2" w:color="auto" w:val="clear"/>
+            <w:tcMar>
+              <w:top w:type="dxa" w:w="40"/>
+              <w:left w:type="dxa" w:w="80"/>
+              <w:bottom w:type="dxa" w:w="40"/>
+              <w:right w:type="dxa" w:w="80"/>
+            </w:tcMar>
+            <w:vAlign w:val="center"/>
+          </w:tcPr>
+          <w:p>
+            <w:pPr>
+              <w:jc w:val="center"/>
+            </w:pPr>
+            <w:r>
+              <w:rPr>
+                <w:rFonts w:ascii="Arial" w:cs="Arial" w:eastAsia="Arial" w:hAnsi="Arial"/>
+                <w:color w:val="6B6B6B"/>
+                <w:sz w:val="15"/>
+                <w:szCs w:val="15"/>
+              </w:rPr>
+              <w:t xml:space="preserve">Bodyweight</w:t>
+            </w:r>
+          </w:p>
+        </w:tc>
+        <w:tc>
+          <w:tcPr>
+            <w:tcW w:type="dxa" w:w="540"/>
+            <w:tcBorders>
+              <w:top w:val="none" w:color="FFFFFF" w:sz="0"/>
+              <w:left w:val="none" w:color="FFFFFF" w:sz="0"/>
+              <w:bottom w:val="none" w:color="FFFFFF" w:sz="0"/>
+              <w:right w:val="none" w:color="FFFFFF" w:sz="0"/>
+            </w:tcBorders>
+            <w:shd w:fill="F1F8F2" w:color="auto" w:val="clear"/>
+            <w:tcMar>
+              <w:top w:type="dxa" w:w="40"/>
+              <w:left w:type="dxa" w:w="80"/>
+              <w:bottom w:type="dxa" w:w="40"/>
+              <w:right w:type="dxa" w:w="80"/>
+            </w:tcMar>
+            <w:vAlign w:val="center"/>
+          </w:tcPr>
+          <w:p>
+            <w:pPr>
+              <w:jc w:val="center"/>
+            </w:pPr>
+            <w:r>
+              <w:rPr>
+                <w:rFonts w:ascii="Arial" w:cs="Arial" w:eastAsia="Arial" w:hAnsi="Arial"/>
+                <w:color w:val="6B6B6B"/>
+                <w:sz w:val="15"/>
+                <w:szCs w:val="15"/>
+              </w:rPr>
+              <w:t xml:space="preserve">2-0-1</w:t>
+            </w:r>
+          </w:p>
+        </w:tc>
+        <w:tc>
+          <w:tcPr>
+            <w:tcW w:type="dxa" w:w="440"/>
+            <w:tcBorders>
+              <w:top w:val="none" w:color="FFFFFF" w:sz="0"/>
+              <w:left w:val="none" w:color="FFFFFF" w:sz="0"/>
+              <w:bottom w:val="none" w:color="FFFFFF" w:sz="0"/>
+              <w:right w:val="none" w:color="FFFFFF" w:sz="0"/>
+            </w:tcBorders>
+            <w:shd w:fill="F1F8F2" w:color="auto" w:val="clear"/>
+            <w:tcMar>
+              <w:top w:type="dxa" w:w="40"/>
+              <w:left w:type="dxa" w:w="80"/>
+              <w:bottom w:type="dxa" w:w="40"/>
+              <w:right w:type="dxa" w:w="80"/>
+            </w:tcMar>
+            <w:vAlign w:val="center"/>
+          </w:tcPr>
+          <w:p>
+            <w:pPr>
+              <w:jc w:val="center"/>
+            </w:pPr>
+            <w:r>
+              <w:rPr>
+                <w:rFonts w:ascii="Arial" w:cs="Arial" w:eastAsia="Arial" w:hAnsi="Arial"/>
+                <w:color w:val="6B6B6B"/>
+                <w:sz w:val="15"/>
+                <w:szCs w:val="15"/>
+              </w:rPr>
+              <w:t xml:space="preserve">60s</w:t>
+            </w:r>
+          </w:p>
+        </w:tc>
+        <w:tc>
+          <w:tcPr>
+            <w:tcW w:type="dxa" w:w="5580"/>
+            <w:tcBorders>
+              <w:top w:val="none" w:color="FFFFFF" w:sz="0"/>
+              <w:left w:val="none" w:color="FFFFFF" w:sz="0"/>
+              <w:bottom w:val="none" w:color="FFFFFF" w:sz="0"/>
+              <w:right w:val="none" w:color="FFFFFF" w:sz="0"/>
+            </w:tcBorders>
+            <w:shd w:fill="F1F8F2" w:color="auto" w:val="clear"/>
+            <w:tcMar>
+              <w:top w:type="dxa" w:w="40"/>
+              <w:left w:type="dxa" w:w="80"/>
+              <w:bottom w:type="dxa" w:w="40"/>
+              <w:right w:type="dxa" w:w="80"/>
+            </w:tcMar>
+            <w:vAlign w:val="center"/>
+          </w:tcPr>
+          <w:p>
+            <w:r>
+              <w:rPr>
+                <w:rFonts w:ascii="Arial" w:cs="Arial" w:eastAsia="Arial" w:hAnsi="Arial"/>
+                <w:color w:val="6B6B6B"/>
+                <w:sz w:val="17"/>
+                <w:szCs w:val="17"/>
+              </w:rPr>
+              <w:t xml:space="preserve">Full range, no shoulder pinch. Build past the 12-rep baseline.</w:t>
+            </w:r>
+            <w:r>
+              <w:rPr>
+                <w:rFonts w:ascii="Arial" w:cs="Arial" w:eastAsia="Arial" w:hAnsi="Arial"/>
+                <w:i/>
+                <w:iCs/>
+                <w:color w:val="00695C"/>
+                <w:sz w:val="14"/>
+                <w:szCs w:val="14"/>
+              </w:rPr>
+              <w:t xml:space="preserve">  2 RIR</w:t>
+            </w:r>
+          </w:p>
+        </w:tc>
+      </w:tr>
+    </w:tbl>
+    <w:p>
+      <w:pPr>
+        <w:spacing w:after="100"/>
+      </w:pPr>
+    </w:p>
+    <w:p>
+      <w:pPr>
+        <w:spacing w:after="60" w:before="120"/>
+      </w:pPr>
+      <w:r>
+        <w:rPr>
+          <w:rFonts w:ascii="Arial" w:cs="Arial" w:eastAsia="Arial" w:hAnsi="Arial"/>
+          <w:b/>
+          <w:bCs/>
+          <w:color w:val="43A047"/>
+          <w:sz w:val="17"/>
+          <w:szCs w:val="17"/>
+        </w:rPr>
+        <w:t xml:space="preserve">D — SECONDARY COMPOUND — SPLIT SQUAT (LEFT-LED)</w:t>
+      </w:r>
+    </w:p>
+    <w:p>
+      <w:pPr>
+        <w:spacing w:after="80"/>
+      </w:pPr>
+      <w:r>
+        <w:rPr>
+          <w:rFonts w:ascii="Arial" w:cs="Arial" w:eastAsia="Arial" w:hAnsi="Arial"/>
+          <w:b/>
+          <w:bCs/>
+          <w:color w:val="43A047"/>
+          <w:sz w:val="17"/>
+          <w:szCs w:val="17"/>
+        </w:rPr>
+        <w:t xml:space="preserve">Load Target:  </w:t>
+      </w:r>
+      <w:r>
+        <w:rPr>
+          <w:rFonts w:ascii="Arial" w:cs="Arial" w:eastAsia="Arial" w:hAnsi="Arial"/>
+          <w:color w:val="2C2C2C"/>
+          <w:sz w:val="17"/>
+          <w:szCs w:val="17"/>
+        </w:rPr>
+        <w:t xml:space="preserve">The day's second compound pattern — knee-dominant, rotating off the hinge above, and the loaded lunge pattern the week otherwise never touches. Left leg leads every set per the asymmetry protocol. No tested baseline exists for this pattern, so load starts moderate and is built weekly at two reps in reserve; dumbbells held at the sides keep the shoulder completely out of it. If the day calls for a variation, rotate between: a rear-foot-elevated split squat (more range, more demand on the front leg), a reverse lunge (easier to balance, kinder to the knee), or a goblet split squat (one dumbbell at the chest — only if the front-rack position is comfortable that day).</w:t>
+      </w:r>
+    </w:p>
+    <w:tbl>
+      <w:tblPr>
+        <w:tblW w:type="dxa" w:w="10440"/>
+        <w:tblBorders>
+          <w:top w:val="none" w:color="FFFFFF" w:sz="0"/>
+          <w:left w:val="none" w:color="FFFFFF" w:sz="0"/>
+          <w:bottom w:val="none" w:color="FFFFFF" w:sz="0"/>
+          <w:right w:val="none" w:color="FFFFFF" w:sz="0"/>
+          <w:insideH w:val="single" w:color="auto" w:sz="4"/>
+          <w:insideV w:val="single" w:color="auto" w:sz="4"/>
+        </w:tblBorders>
+      </w:tblPr>
+      <w:tblGrid>
+        <w:gridCol w:w="2400"/>
+        <w:gridCol w:w="380"/>
+        <w:gridCol w:w="420"/>
+        <w:gridCol w:w="680"/>
+        <w:gridCol w:w="540"/>
+        <w:gridCol w:w="440"/>
+        <w:gridCol w:w="5580"/>
+      </w:tblGrid>
+      <w:tr>
+        <w:tc>
+          <w:tcPr>
+            <w:tcW w:type="dxa" w:w="2400"/>
+            <w:tcBorders>
+              <w:top w:val="none" w:color="FFFFFF" w:sz="0"/>
+              <w:left w:val="none" w:color="FFFFFF" w:sz="0"/>
+              <w:bottom w:val="none" w:color="FFFFFF" w:sz="0"/>
+              <w:right w:val="none" w:color="FFFFFF" w:sz="0"/>
+            </w:tcBorders>
+            <w:shd w:fill="E8F5E9" w:color="auto" w:val="clear"/>
+            <w:tcMar>
+              <w:top w:type="dxa" w:w="40"/>
+              <w:left w:type="dxa" w:w="80"/>
+              <w:bottom w:type="dxa" w:w="40"/>
+              <w:right w:type="dxa" w:w="80"/>
+            </w:tcMar>
+            <w:vAlign w:val="center"/>
+          </w:tcPr>
+          <w:p>
+            <w:pPr>
+              <w:jc w:val="left"/>
+            </w:pPr>
+            <w:r>
+              <w:rPr>
+                <w:rFonts w:ascii="Arial" w:cs="Arial" w:eastAsia="Arial" w:hAnsi="Arial"/>
+                <w:b/>
+                <w:bCs/>
+                <w:color w:val="43A047"/>
+                <w:sz w:val="15"/>
+                <w:szCs w:val="15"/>
+              </w:rPr>
+              <w:t xml:space="preserve">EXERCISE</w:t>
+            </w:r>
+          </w:p>
+        </w:tc>
+        <w:tc>
+          <w:tcPr>
+            <w:tcW w:type="dxa" w:w="380"/>
+            <w:tcBorders>
+              <w:top w:val="none" w:color="FFFFFF" w:sz="0"/>
+              <w:left w:val="none" w:color="FFFFFF" w:sz="0"/>
+              <w:bottom w:val="none" w:color="FFFFFF" w:sz="0"/>
+              <w:right w:val="none" w:color="FFFFFF" w:sz="0"/>
+            </w:tcBorders>
+            <w:shd w:fill="E8F5E9" w:color="auto" w:val="clear"/>
+            <w:tcMar>
+              <w:top w:type="dxa" w:w="40"/>
+              <w:left w:type="dxa" w:w="80"/>
+              <w:bottom w:type="dxa" w:w="40"/>
+              <w:right w:type="dxa" w:w="80"/>
+            </w:tcMar>
+            <w:vAlign w:val="center"/>
+          </w:tcPr>
+          <w:p>
+            <w:pPr>
+              <w:jc w:val="center"/>
+            </w:pPr>
+            <w:r>
+              <w:rPr>
+                <w:rFonts w:ascii="Arial" w:cs="Arial" w:eastAsia="Arial" w:hAnsi="Arial"/>
+                <w:b/>
+                <w:bCs/>
+                <w:color w:val="43A047"/>
+                <w:sz w:val="13"/>
+                <w:szCs w:val="13"/>
+              </w:rPr>
+              <w:t xml:space="preserve">SETS</w:t>
+            </w:r>
+          </w:p>
+        </w:tc>
+        <w:tc>
+          <w:tcPr>
+            <w:tcW w:type="dxa" w:w="420"/>
+            <w:tcBorders>
+              <w:top w:val="none" w:color="FFFFFF" w:sz="0"/>
+              <w:left w:val="none" w:color="FFFFFF" w:sz="0"/>
+              <w:bottom w:val="none" w:color="FFFFFF" w:sz="0"/>
+              <w:right w:val="none" w:color="FFFFFF" w:sz="0"/>
+            </w:tcBorders>
+            <w:shd w:fill="E8F5E9" w:color="auto" w:val="clear"/>
+            <w:tcMar>
+              <w:top w:type="dxa" w:w="40"/>
+              <w:left w:type="dxa" w:w="80"/>
+              <w:bottom w:type="dxa" w:w="40"/>
+              <w:right w:type="dxa" w:w="80"/>
+            </w:tcMar>
+            <w:vAlign w:val="center"/>
+          </w:tcPr>
+          <w:p>
+            <w:pPr>
+              <w:jc w:val="center"/>
+            </w:pPr>
+            <w:r>
+              <w:rPr>
+                <w:rFonts w:ascii="Arial" w:cs="Arial" w:eastAsia="Arial" w:hAnsi="Arial"/>
+                <w:b/>
+                <w:bCs/>
+                <w:color w:val="43A047"/>
+                <w:sz w:val="13"/>
+                <w:szCs w:val="13"/>
+              </w:rPr>
+              <w:t xml:space="preserve">REPS</w:t>
+            </w:r>
+          </w:p>
+        </w:tc>
+        <w:tc>
+          <w:tcPr>
+            <w:tcW w:type="dxa" w:w="680"/>
+            <w:tcBorders>
+              <w:top w:val="none" w:color="FFFFFF" w:sz="0"/>
+              <w:left w:val="none" w:color="FFFFFF" w:sz="0"/>
+              <w:bottom w:val="none" w:color="FFFFFF" w:sz="0"/>
+              <w:right w:val="none" w:color="FFFFFF" w:sz="0"/>
+            </w:tcBorders>
+            <w:shd w:fill="E8F5E9" w:color="auto" w:val="clear"/>
+            <w:tcMar>
+              <w:top w:type="dxa" w:w="40"/>
+              <w:left w:type="dxa" w:w="80"/>
+              <w:bottom w:type="dxa" w:w="40"/>
+              <w:right w:type="dxa" w:w="80"/>
+            </w:tcMar>
+            <w:vAlign w:val="center"/>
+          </w:tcPr>
+          <w:p>
+            <w:pPr>
+              <w:jc w:val="center"/>
+            </w:pPr>
+            <w:r>
+              <w:rPr>
+                <w:rFonts w:ascii="Arial" w:cs="Arial" w:eastAsia="Arial" w:hAnsi="Arial"/>
+                <w:b/>
+                <w:bCs/>
+                <w:color w:val="43A047"/>
+                <w:sz w:val="13"/>
+                <w:szCs w:val="13"/>
+              </w:rPr>
+              <w:t xml:space="preserve">LOAD</w:t>
+            </w:r>
+          </w:p>
+        </w:tc>
+        <w:tc>
+          <w:tcPr>
+            <w:tcW w:type="dxa" w:w="540"/>
+            <w:tcBorders>
+              <w:top w:val="none" w:color="FFFFFF" w:sz="0"/>
+              <w:left w:val="none" w:color="FFFFFF" w:sz="0"/>
+              <w:bottom w:val="none" w:color="FFFFFF" w:sz="0"/>
+              <w:right w:val="none" w:color="FFFFFF" w:sz="0"/>
+            </w:tcBorders>
+            <w:shd w:fill="E8F5E9" w:color="auto" w:val="clear"/>
+            <w:tcMar>
+              <w:top w:type="dxa" w:w="40"/>
+              <w:left w:type="dxa" w:w="80"/>
+              <w:bottom w:type="dxa" w:w="40"/>
+              <w:right w:type="dxa" w:w="80"/>
+            </w:tcMar>
+            <w:vAlign w:val="center"/>
+          </w:tcPr>
+          <w:p>
+            <w:pPr>
+              <w:jc w:val="center"/>
+            </w:pPr>
+            <w:r>
+              <w:rPr>
+                <w:rFonts w:ascii="Arial" w:cs="Arial" w:eastAsia="Arial" w:hAnsi="Arial"/>
+                <w:b/>
+                <w:bCs/>
+                <w:color w:val="43A047"/>
+                <w:sz w:val="13"/>
+                <w:szCs w:val="13"/>
+              </w:rPr>
+              <w:t xml:space="preserve">TEMPO</w:t>
+            </w:r>
+          </w:p>
+        </w:tc>
+        <w:tc>
+          <w:tcPr>
+            <w:tcW w:type="dxa" w:w="440"/>
+            <w:tcBorders>
+              <w:top w:val="none" w:color="FFFFFF" w:sz="0"/>
+              <w:left w:val="none" w:color="FFFFFF" w:sz="0"/>
+              <w:bottom w:val="none" w:color="FFFFFF" w:sz="0"/>
+              <w:right w:val="none" w:color="FFFFFF" w:sz="0"/>
+            </w:tcBorders>
+            <w:shd w:fill="E8F5E9" w:color="auto" w:val="clear"/>
+            <w:tcMar>
+              <w:top w:type="dxa" w:w="40"/>
+              <w:left w:type="dxa" w:w="80"/>
+              <w:bottom w:type="dxa" w:w="40"/>
+              <w:right w:type="dxa" w:w="80"/>
+            </w:tcMar>
+            <w:vAlign w:val="center"/>
+          </w:tcPr>
+          <w:p>
+            <w:pPr>
+              <w:jc w:val="center"/>
+            </w:pPr>
+            <w:r>
+              <w:rPr>
+                <w:rFonts w:ascii="Arial" w:cs="Arial" w:eastAsia="Arial" w:hAnsi="Arial"/>
+                <w:b/>
+                <w:bCs/>
+                <w:color w:val="43A047"/>
+                <w:sz w:val="13"/>
+                <w:szCs w:val="13"/>
+              </w:rPr>
+              <w:t xml:space="preserve">REST</w:t>
+            </w:r>
+          </w:p>
+        </w:tc>
+        <w:tc>
+          <w:tcPr>
+            <w:tcW w:type="dxa" w:w="5580"/>
+            <w:tcBorders>
+              <w:top w:val="none" w:color="FFFFFF" w:sz="0"/>
+              <w:left w:val="none" w:color="FFFFFF" w:sz="0"/>
+              <w:bottom w:val="none" w:color="FFFFFF" w:sz="0"/>
+              <w:right w:val="none" w:color="FFFFFF" w:sz="0"/>
+            </w:tcBorders>
+            <w:shd w:fill="E8F5E9" w:color="auto" w:val="clear"/>
+            <w:tcMar>
+              <w:top w:type="dxa" w:w="40"/>
+              <w:left w:type="dxa" w:w="80"/>
+              <w:bottom w:type="dxa" w:w="40"/>
+              <w:right w:type="dxa" w:w="80"/>
+            </w:tcMar>
+            <w:vAlign w:val="center"/>
+          </w:tcPr>
+          <w:p>
+            <w:pPr>
+              <w:jc w:val="left"/>
+            </w:pPr>
+            <w:r>
+              <w:rPr>
+                <w:rFonts w:ascii="Arial" w:cs="Arial" w:eastAsia="Arial" w:hAnsi="Arial"/>
+                <w:b/>
+                <w:bCs/>
+                <w:color w:val="43A047"/>
+                <w:sz w:val="15"/>
+                <w:szCs w:val="15"/>
+              </w:rPr>
+              <w:t xml:space="preserve">COACHING CUE</w:t>
+            </w:r>
+          </w:p>
+        </w:tc>
+      </w:tr>
+      <w:tr>
+        <w:tc>
+          <w:tcPr>
+            <w:tcW w:type="dxa" w:w="2400"/>
+            <w:tcBorders>
+              <w:top w:val="none" w:color="FFFFFF" w:sz="0"/>
+              <w:left w:val="none" w:color="FFFFFF" w:sz="0"/>
+              <w:bottom w:val="none" w:color="FFFFFF" w:sz="0"/>
+              <w:right w:val="none" w:color="FFFFFF" w:sz="0"/>
+            </w:tcBorders>
+            <w:shd w:fill="F1F8F2" w:color="auto" w:val="clear"/>
+            <w:tcMar>
+              <w:top w:type="dxa" w:w="40"/>
+              <w:left w:type="dxa" w:w="80"/>
+              <w:bottom w:type="dxa" w:w="40"/>
+              <w:right w:type="dxa" w:w="80"/>
+            </w:tcMar>
+            <w:vAlign w:val="center"/>
+          </w:tcPr>
+          <w:p>
+            <w:r>
+              <w:rPr>
+                <w:rFonts w:ascii="Arial" w:cs="Arial" w:eastAsia="Arial" w:hAnsi="Arial"/>
+                <w:b/>
+                <w:bCs/>
+                <w:color w:val="2C2C2C"/>
+                <w:sz w:val="18"/>
+                <w:szCs w:val="18"/>
+              </w:rPr>
+              <w:t xml:space="preserve">Split Squat (DB at Sides)</w:t>
+            </w:r>
+          </w:p>
+          <w:p>
+            <w:r>
+              <w:rPr>
+                <w:rFonts w:ascii="Arial" w:cs="Arial" w:eastAsia="Arial" w:hAnsi="Arial"/>
+                <w:i/>
+                <w:iCs/>
+                <w:color w:val="B71C1C"/>
+                <w:sz w:val="14"/>
+                <w:szCs w:val="14"/>
+              </w:rPr>
+              <w:t xml:space="preserve">Left leg leads — weaker side per the asymmetry note</w:t>
+            </w:r>
+          </w:p>
+        </w:tc>
+        <w:tc>
+          <w:tcPr>
+            <w:tcW w:type="dxa" w:w="380"/>
+            <w:tcBorders>
+              <w:top w:val="none" w:color="FFFFFF" w:sz="0"/>
+              <w:left w:val="none" w:color="FFFFFF" w:sz="0"/>
+              <w:bottom w:val="none" w:color="FFFFFF" w:sz="0"/>
+              <w:right w:val="none" w:color="FFFFFF" w:sz="0"/>
+            </w:tcBorders>
+            <w:shd w:fill="F1F8F2" w:color="auto" w:val="clear"/>
+            <w:tcMar>
+              <w:top w:type="dxa" w:w="40"/>
+              <w:left w:type="dxa" w:w="80"/>
+              <w:bottom w:type="dxa" w:w="40"/>
+              <w:right w:type="dxa" w:w="80"/>
+            </w:tcMar>
+            <w:vAlign w:val="center"/>
+          </w:tcPr>
+          <w:p>
+            <w:pPr>
+              <w:jc w:val="center"/>
+            </w:pPr>
+            <w:r>
+              <w:rPr>
+                <w:rFonts w:ascii="Arial" w:cs="Arial" w:eastAsia="Arial" w:hAnsi="Arial"/>
+                <w:color w:val="6B6B6B"/>
+                <w:sz w:val="15"/>
+                <w:szCs w:val="15"/>
+              </w:rPr>
+              <w:t xml:space="preserve">3</w:t>
+            </w:r>
+          </w:p>
+        </w:tc>
+        <w:tc>
+          <w:tcPr>
+            <w:tcW w:type="dxa" w:w="420"/>
+            <w:tcBorders>
+              <w:top w:val="none" w:color="FFFFFF" w:sz="0"/>
+              <w:left w:val="none" w:color="FFFFFF" w:sz="0"/>
+              <w:bottom w:val="none" w:color="FFFFFF" w:sz="0"/>
+              <w:right w:val="none" w:color="FFFFFF" w:sz="0"/>
+            </w:tcBorders>
+            <w:shd w:fill="F1F8F2" w:color="auto" w:val="clear"/>
+            <w:tcMar>
+              <w:top w:type="dxa" w:w="40"/>
+              <w:left w:type="dxa" w:w="80"/>
+              <w:bottom w:type="dxa" w:w="40"/>
+              <w:right w:type="dxa" w:w="80"/>
+            </w:tcMar>
+            <w:vAlign w:val="center"/>
+          </w:tcPr>
+          <w:p>
+            <w:pPr>
+              <w:jc w:val="center"/>
+            </w:pPr>
+            <w:r>
+              <w:rPr>
+                <w:rFonts w:ascii="Arial" w:cs="Arial" w:eastAsia="Arial" w:hAnsi="Arial"/>
+                <w:color w:val="6B6B6B"/>
+                <w:sz w:val="15"/>
+                <w:szCs w:val="15"/>
+              </w:rPr>
+              <w:t xml:space="preserve">8/side</w:t>
+            </w:r>
+          </w:p>
+        </w:tc>
+        <w:tc>
+          <w:tcPr>
+            <w:tcW w:type="dxa" w:w="680"/>
+            <w:tcBorders>
+              <w:top w:val="none" w:color="FFFFFF" w:sz="0"/>
+              <w:left w:val="none" w:color="FFFFFF" w:sz="0"/>
+              <w:bottom w:val="none" w:color="FFFFFF" w:sz="0"/>
+              <w:right w:val="none" w:color="FFFFFF" w:sz="0"/>
+            </w:tcBorders>
+            <w:shd w:fill="F1F8F2" w:color="auto" w:val="clear"/>
+            <w:tcMar>
+              <w:top w:type="dxa" w:w="40"/>
+              <w:left w:type="dxa" w:w="80"/>
+              <w:bottom w:type="dxa" w:w="40"/>
+              <w:right w:type="dxa" w:w="80"/>
+            </w:tcMar>
+            <w:vAlign w:val="center"/>
+          </w:tcPr>
+          <w:p>
+            <w:pPr>
+              <w:jc w:val="center"/>
+            </w:pPr>
+            <w:r>
+              <w:rPr>
+                <w:rFonts w:ascii="Arial" w:cs="Arial" w:eastAsia="Arial" w:hAnsi="Arial"/>
+                <w:color w:val="6B6B6B"/>
+                <w:sz w:val="15"/>
+                <w:szCs w:val="15"/>
+              </w:rPr>
+              <w:t xml:space="preserve">Mod DB → build weekly</w:t>
+            </w:r>
+          </w:p>
+        </w:tc>
+        <w:tc>
+          <w:tcPr>
+            <w:tcW w:type="dxa" w:w="540"/>
+            <w:tcBorders>
+              <w:top w:val="none" w:color="FFFFFF" w:sz="0"/>
+              <w:left w:val="none" w:color="FFFFFF" w:sz="0"/>
+              <w:bottom w:val="none" w:color="FFFFFF" w:sz="0"/>
+              <w:right w:val="none" w:color="FFFFFF" w:sz="0"/>
+            </w:tcBorders>
+            <w:shd w:fill="F1F8F2" w:color="auto" w:val="clear"/>
+            <w:tcMar>
+              <w:top w:type="dxa" w:w="40"/>
+              <w:left w:type="dxa" w:w="80"/>
+              <w:bottom w:type="dxa" w:w="40"/>
+              <w:right w:type="dxa" w:w="80"/>
+            </w:tcMar>
+            <w:vAlign w:val="center"/>
+          </w:tcPr>
+          <w:p>
+            <w:pPr>
+              <w:jc w:val="center"/>
+            </w:pPr>
+            <w:r>
+              <w:rPr>
+                <w:rFonts w:ascii="Arial" w:cs="Arial" w:eastAsia="Arial" w:hAnsi="Arial"/>
+                <w:color w:val="6B6B6B"/>
+                <w:sz w:val="15"/>
+                <w:szCs w:val="15"/>
+              </w:rPr>
+              <w:t xml:space="preserve">2-1-1</w:t>
+            </w:r>
+          </w:p>
+        </w:tc>
+        <w:tc>
+          <w:tcPr>
+            <w:tcW w:type="dxa" w:w="440"/>
+            <w:tcBorders>
+              <w:top w:val="none" w:color="FFFFFF" w:sz="0"/>
+              <w:left w:val="none" w:color="FFFFFF" w:sz="0"/>
+              <w:bottom w:val="none" w:color="FFFFFF" w:sz="0"/>
+              <w:right w:val="none" w:color="FFFFFF" w:sz="0"/>
+            </w:tcBorders>
+            <w:shd w:fill="F1F8F2" w:color="auto" w:val="clear"/>
+            <w:tcMar>
+              <w:top w:type="dxa" w:w="40"/>
+              <w:left w:type="dxa" w:w="80"/>
+              <w:bottom w:type="dxa" w:w="40"/>
+              <w:right w:type="dxa" w:w="80"/>
+            </w:tcMar>
+            <w:vAlign w:val="center"/>
+          </w:tcPr>
+          <w:p>
+            <w:pPr>
+              <w:jc w:val="center"/>
+            </w:pPr>
+            <w:r>
+              <w:rPr>
+                <w:rFonts w:ascii="Arial" w:cs="Arial" w:eastAsia="Arial" w:hAnsi="Arial"/>
+                <w:color w:val="6B6B6B"/>
+                <w:sz w:val="15"/>
+                <w:szCs w:val="15"/>
+              </w:rPr>
+              <w:t xml:space="preserve">75s</w:t>
+            </w:r>
+          </w:p>
+        </w:tc>
+        <w:tc>
+          <w:tcPr>
+            <w:tcW w:type="dxa" w:w="5580"/>
+            <w:tcBorders>
+              <w:top w:val="none" w:color="FFFFFF" w:sz="0"/>
+              <w:left w:val="none" w:color="FFFFFF" w:sz="0"/>
+              <w:bottom w:val="none" w:color="FFFFFF" w:sz="0"/>
+              <w:right w:val="none" w:color="FFFFFF" w:sz="0"/>
+            </w:tcBorders>
+            <w:shd w:fill="F1F8F2" w:color="auto" w:val="clear"/>
+            <w:tcMar>
+              <w:top w:type="dxa" w:w="40"/>
+              <w:left w:type="dxa" w:w="80"/>
+              <w:bottom w:type="dxa" w:w="40"/>
+              <w:right w:type="dxa" w:w="80"/>
+            </w:tcMar>
+            <w:vAlign w:val="center"/>
+          </w:tcPr>
+          <w:p>
+            <w:r>
+              <w:rPr>
+                <w:rFonts w:ascii="Arial" w:cs="Arial" w:eastAsia="Arial" w:hAnsi="Arial"/>
+                <w:color w:val="6B6B6B"/>
+                <w:sz w:val="17"/>
+                <w:szCs w:val="17"/>
+              </w:rPr>
+              <w:t xml:space="preserve">Left leg leads. Even depth both sides, knee tracks the toe.</w:t>
+            </w:r>
+            <w:r>
+              <w:rPr>
+                <w:rFonts w:ascii="Arial" w:cs="Arial" w:eastAsia="Arial" w:hAnsi="Arial"/>
+                <w:i/>
+                <w:iCs/>
+                <w:color w:val="00695C"/>
+                <w:sz w:val="14"/>
+                <w:szCs w:val="14"/>
+              </w:rPr>
+              <w:t xml:space="preserve">  2 RIR</w:t>
             </w:r>
           </w:p>
         </w:tc>
@@ -11257,7 +13875,7 @@
           <w:sz w:val="17"/>
           <w:szCs w:val="17"/>
         </w:rPr>
-        <w:t xml:space="preserve">C — LOADED CARRIES</w:t>
+        <w:t xml:space="preserve">E — THIRD COMPOUND (INTEGRATION) — LOADED CARRY &amp; CORE UNDER LOAD</w:t>
       </w:r>
     </w:p>
     <w:p>
@@ -11282,7 +13900,7 @@
           <w:sz w:val="17"/>
           <w:szCs w:val="17"/>
         </w:rPr>
-        <w:t xml:space="preserve">Tested at 45 lbs/hand — hold there this week and build from it as grip and trunk control allow. This loads the shoulder girdle isometrically; ordinary grip/shoulder fatigue is expected, sharp or pinching pain is the stop signal.</w:t>
+        <w:t xml:space="preserve">The session's closer — the day's hip work, grip, and trunk position held together under load. Carry tested at 45 lbs/hand on 8/11/2026: hold there in Week 1 and build toward 50 lbs/hand by Week 4 as grip and trunk control allow. Plank progresses from the tested 1:18 baseline. The carry loads the shoulder girdle isometrically; ordinary grip and shoulder fatigue is expected, sharp or pinching pain is the stop signal. If the day calls for a variation, rotate between: a suitcase carry (one-sided, left hand holds the load), a hex bar carry (the vehicle once load passes the 60 lbs/hand dumbbell ceiling), or a front-rack kettlebell carry (to 25 lbs per bell — only if the front-rack position is comfortable). Distance and posture govern the carry, not a rep target.</w:t>
       </w:r>
     </w:p>
     <w:tbl>
@@ -11681,7 +14299,7 @@
                 <w:sz w:val="15"/>
                 <w:szCs w:val="15"/>
               </w:rPr>
-              <w:t xml:space="preserve">45 lbs/hand</w:t>
+              <w:t xml:space="preserve">Wk1: 45 → Wk4: 50 lbs/hand</w:t>
             </w:r>
           </w:p>
         </w:tc>
@@ -11779,320 +14397,16 @@
               </w:rPr>
               <w:t xml:space="preserve">Tall posture, no shrug; even stride both sides.</w:t>
             </w:r>
-          </w:p>
-        </w:tc>
-      </w:tr>
-    </w:tbl>
-    <w:p>
-      <w:pPr>
-        <w:spacing w:after="100"/>
-      </w:pPr>
-    </w:p>
-    <w:p>
-      <w:pPr>
-        <w:spacing w:after="60" w:before="120"/>
-      </w:pPr>
-      <w:r>
-        <w:rPr>
-          <w:rFonts w:ascii="Arial" w:cs="Arial" w:eastAsia="Arial" w:hAnsi="Arial"/>
-          <w:b/>
-          <w:bCs/>
-          <w:color w:val="43A047"/>
-          <w:sz w:val="17"/>
-          <w:szCs w:val="17"/>
-        </w:rPr>
-        <w:t xml:space="preserve">D — CORE &amp; PUSH-UP PROTOCOL</w:t>
-      </w:r>
-    </w:p>
-    <w:p>
-      <w:pPr>
-        <w:spacing w:after="80"/>
-      </w:pPr>
-      <w:r>
-        <w:rPr>
-          <w:rFonts w:ascii="Arial" w:cs="Arial" w:eastAsia="Arial" w:hAnsi="Arial"/>
-          <w:b/>
-          <w:bCs/>
-          <w:color w:val="43A047"/>
-          <w:sz w:val="17"/>
-          <w:szCs w:val="17"/>
-        </w:rPr>
-        <w:t xml:space="preserve">Load Target:  </w:t>
-      </w:r>
-      <w:r>
-        <w:rPr>
-          <w:rFonts w:ascii="Arial" w:cs="Arial" w:eastAsia="Arial" w:hAnsi="Arial"/>
-          <w:color w:val="2C2C2C"/>
-          <w:sz w:val="17"/>
-          <w:szCs w:val="17"/>
-        </w:rPr>
-        <w:t xml:space="preserve">Progression from the tested 1:18 plank and 12-rep push-up baselines. Push-ups load the shoulder girdle isometrically through a controlled, non-overhead range — normally well-tolerated in cuff rehab; the same pain-monitoring rule still applies.</w:t>
-      </w:r>
-    </w:p>
-    <w:tbl>
-      <w:tblPr>
-        <w:tblW w:type="dxa" w:w="10440"/>
-        <w:tblBorders>
-          <w:top w:val="none" w:color="FFFFFF" w:sz="0"/>
-          <w:left w:val="none" w:color="FFFFFF" w:sz="0"/>
-          <w:bottom w:val="none" w:color="FFFFFF" w:sz="0"/>
-          <w:right w:val="none" w:color="FFFFFF" w:sz="0"/>
-          <w:insideH w:val="single" w:color="auto" w:sz="4"/>
-          <w:insideV w:val="single" w:color="auto" w:sz="4"/>
-        </w:tblBorders>
-      </w:tblPr>
-      <w:tblGrid>
-        <w:gridCol w:w="2400"/>
-        <w:gridCol w:w="380"/>
-        <w:gridCol w:w="420"/>
-        <w:gridCol w:w="680"/>
-        <w:gridCol w:w="540"/>
-        <w:gridCol w:w="440"/>
-        <w:gridCol w:w="5580"/>
-      </w:tblGrid>
-      <w:tr>
-        <w:tc>
-          <w:tcPr>
-            <w:tcW w:type="dxa" w:w="2400"/>
-            <w:tcBorders>
-              <w:top w:val="none" w:color="FFFFFF" w:sz="0"/>
-              <w:left w:val="none" w:color="FFFFFF" w:sz="0"/>
-              <w:bottom w:val="none" w:color="FFFFFF" w:sz="0"/>
-              <w:right w:val="none" w:color="FFFFFF" w:sz="0"/>
-            </w:tcBorders>
-            <w:shd w:fill="E8F5E9" w:color="auto" w:val="clear"/>
-            <w:tcMar>
-              <w:top w:type="dxa" w:w="40"/>
-              <w:left w:type="dxa" w:w="80"/>
-              <w:bottom w:type="dxa" w:w="40"/>
-              <w:right w:type="dxa" w:w="80"/>
-            </w:tcMar>
-            <w:vAlign w:val="center"/>
-          </w:tcPr>
-          <w:p>
-            <w:pPr>
-              <w:jc w:val="left"/>
-            </w:pPr>
-            <w:r>
-              <w:rPr>
-                <w:rFonts w:ascii="Arial" w:cs="Arial" w:eastAsia="Arial" w:hAnsi="Arial"/>
-                <w:b/>
-                <w:bCs/>
-                <w:color w:val="43A047"/>
-                <w:sz w:val="15"/>
-                <w:szCs w:val="15"/>
-              </w:rPr>
-              <w:t xml:space="preserve">EXERCISE</w:t>
-            </w:r>
-          </w:p>
-        </w:tc>
-        <w:tc>
-          <w:tcPr>
-            <w:tcW w:type="dxa" w:w="380"/>
-            <w:tcBorders>
-              <w:top w:val="none" w:color="FFFFFF" w:sz="0"/>
-              <w:left w:val="none" w:color="FFFFFF" w:sz="0"/>
-              <w:bottom w:val="none" w:color="FFFFFF" w:sz="0"/>
-              <w:right w:val="none" w:color="FFFFFF" w:sz="0"/>
-            </w:tcBorders>
-            <w:shd w:fill="E8F5E9" w:color="auto" w:val="clear"/>
-            <w:tcMar>
-              <w:top w:type="dxa" w:w="40"/>
-              <w:left w:type="dxa" w:w="80"/>
-              <w:bottom w:type="dxa" w:w="40"/>
-              <w:right w:type="dxa" w:w="80"/>
-            </w:tcMar>
-            <w:vAlign w:val="center"/>
-          </w:tcPr>
-          <w:p>
-            <w:pPr>
-              <w:jc w:val="center"/>
-            </w:pPr>
-            <w:r>
-              <w:rPr>
-                <w:rFonts w:ascii="Arial" w:cs="Arial" w:eastAsia="Arial" w:hAnsi="Arial"/>
-                <w:b/>
-                <w:bCs/>
-                <w:color w:val="43A047"/>
-                <w:sz w:val="13"/>
-                <w:szCs w:val="13"/>
-              </w:rPr>
-              <w:t xml:space="preserve">SETS</w:t>
-            </w:r>
-          </w:p>
-        </w:tc>
-        <w:tc>
-          <w:tcPr>
-            <w:tcW w:type="dxa" w:w="420"/>
-            <w:tcBorders>
-              <w:top w:val="none" w:color="FFFFFF" w:sz="0"/>
-              <w:left w:val="none" w:color="FFFFFF" w:sz="0"/>
-              <w:bottom w:val="none" w:color="FFFFFF" w:sz="0"/>
-              <w:right w:val="none" w:color="FFFFFF" w:sz="0"/>
-            </w:tcBorders>
-            <w:shd w:fill="E8F5E9" w:color="auto" w:val="clear"/>
-            <w:tcMar>
-              <w:top w:type="dxa" w:w="40"/>
-              <w:left w:type="dxa" w:w="80"/>
-              <w:bottom w:type="dxa" w:w="40"/>
-              <w:right w:type="dxa" w:w="80"/>
-            </w:tcMar>
-            <w:vAlign w:val="center"/>
-          </w:tcPr>
-          <w:p>
-            <w:pPr>
-              <w:jc w:val="center"/>
-            </w:pPr>
-            <w:r>
-              <w:rPr>
-                <w:rFonts w:ascii="Arial" w:cs="Arial" w:eastAsia="Arial" w:hAnsi="Arial"/>
-                <w:b/>
-                <w:bCs/>
-                <w:color w:val="43A047"/>
-                <w:sz w:val="13"/>
-                <w:szCs w:val="13"/>
-              </w:rPr>
-              <w:t xml:space="preserve">REPS</w:t>
-            </w:r>
-          </w:p>
-        </w:tc>
-        <w:tc>
-          <w:tcPr>
-            <w:tcW w:type="dxa" w:w="680"/>
-            <w:tcBorders>
-              <w:top w:val="none" w:color="FFFFFF" w:sz="0"/>
-              <w:left w:val="none" w:color="FFFFFF" w:sz="0"/>
-              <w:bottom w:val="none" w:color="FFFFFF" w:sz="0"/>
-              <w:right w:val="none" w:color="FFFFFF" w:sz="0"/>
-            </w:tcBorders>
-            <w:shd w:fill="E8F5E9" w:color="auto" w:val="clear"/>
-            <w:tcMar>
-              <w:top w:type="dxa" w:w="40"/>
-              <w:left w:type="dxa" w:w="80"/>
-              <w:bottom w:type="dxa" w:w="40"/>
-              <w:right w:type="dxa" w:w="80"/>
-            </w:tcMar>
-            <w:vAlign w:val="center"/>
-          </w:tcPr>
-          <w:p>
-            <w:pPr>
-              <w:jc w:val="center"/>
-            </w:pPr>
-            <w:r>
-              <w:rPr>
-                <w:rFonts w:ascii="Arial" w:cs="Arial" w:eastAsia="Arial" w:hAnsi="Arial"/>
-                <w:b/>
-                <w:bCs/>
-                <w:color w:val="43A047"/>
-                <w:sz w:val="13"/>
-                <w:szCs w:val="13"/>
-              </w:rPr>
-              <w:t xml:space="preserve">LOAD</w:t>
-            </w:r>
-          </w:p>
-        </w:tc>
-        <w:tc>
-          <w:tcPr>
-            <w:tcW w:type="dxa" w:w="540"/>
-            <w:tcBorders>
-              <w:top w:val="none" w:color="FFFFFF" w:sz="0"/>
-              <w:left w:val="none" w:color="FFFFFF" w:sz="0"/>
-              <w:bottom w:val="none" w:color="FFFFFF" w:sz="0"/>
-              <w:right w:val="none" w:color="FFFFFF" w:sz="0"/>
-            </w:tcBorders>
-            <w:shd w:fill="E8F5E9" w:color="auto" w:val="clear"/>
-            <w:tcMar>
-              <w:top w:type="dxa" w:w="40"/>
-              <w:left w:type="dxa" w:w="80"/>
-              <w:bottom w:type="dxa" w:w="40"/>
-              <w:right w:type="dxa" w:w="80"/>
-            </w:tcMar>
-            <w:vAlign w:val="center"/>
-          </w:tcPr>
-          <w:p>
-            <w:pPr>
-              <w:jc w:val="center"/>
-            </w:pPr>
-            <w:r>
-              <w:rPr>
-                <w:rFonts w:ascii="Arial" w:cs="Arial" w:eastAsia="Arial" w:hAnsi="Arial"/>
-                <w:b/>
-                <w:bCs/>
-                <w:color w:val="43A047"/>
-                <w:sz w:val="13"/>
-                <w:szCs w:val="13"/>
-              </w:rPr>
-              <w:t xml:space="preserve">TEMPO</w:t>
-            </w:r>
-          </w:p>
-        </w:tc>
-        <w:tc>
-          <w:tcPr>
-            <w:tcW w:type="dxa" w:w="440"/>
-            <w:tcBorders>
-              <w:top w:val="none" w:color="FFFFFF" w:sz="0"/>
-              <w:left w:val="none" w:color="FFFFFF" w:sz="0"/>
-              <w:bottom w:val="none" w:color="FFFFFF" w:sz="0"/>
-              <w:right w:val="none" w:color="FFFFFF" w:sz="0"/>
-            </w:tcBorders>
-            <w:shd w:fill="E8F5E9" w:color="auto" w:val="clear"/>
-            <w:tcMar>
-              <w:top w:type="dxa" w:w="40"/>
-              <w:left w:type="dxa" w:w="80"/>
-              <w:bottom w:type="dxa" w:w="40"/>
-              <w:right w:type="dxa" w:w="80"/>
-            </w:tcMar>
-            <w:vAlign w:val="center"/>
-          </w:tcPr>
-          <w:p>
-            <w:pPr>
-              <w:jc w:val="center"/>
-            </w:pPr>
-            <w:r>
-              <w:rPr>
-                <w:rFonts w:ascii="Arial" w:cs="Arial" w:eastAsia="Arial" w:hAnsi="Arial"/>
-                <w:b/>
-                <w:bCs/>
-                <w:color w:val="43A047"/>
-                <w:sz w:val="13"/>
-                <w:szCs w:val="13"/>
-              </w:rPr>
-              <w:t xml:space="preserve">REST</w:t>
-            </w:r>
-          </w:p>
-        </w:tc>
-        <w:tc>
-          <w:tcPr>
-            <w:tcW w:type="dxa" w:w="5580"/>
-            <w:tcBorders>
-              <w:top w:val="none" w:color="FFFFFF" w:sz="0"/>
-              <w:left w:val="none" w:color="FFFFFF" w:sz="0"/>
-              <w:bottom w:val="none" w:color="FFFFFF" w:sz="0"/>
-              <w:right w:val="none" w:color="FFFFFF" w:sz="0"/>
-            </w:tcBorders>
-            <w:shd w:fill="E8F5E9" w:color="auto" w:val="clear"/>
-            <w:tcMar>
-              <w:top w:type="dxa" w:w="40"/>
-              <w:left w:type="dxa" w:w="80"/>
-              <w:bottom w:type="dxa" w:w="40"/>
-              <w:right w:type="dxa" w:w="80"/>
-            </w:tcMar>
-            <w:vAlign w:val="center"/>
-          </w:tcPr>
-          <w:p>
-            <w:pPr>
-              <w:jc w:val="left"/>
-            </w:pPr>
-            <w:r>
-              <w:rPr>
-                <w:rFonts w:ascii="Arial" w:cs="Arial" w:eastAsia="Arial" w:hAnsi="Arial"/>
-                <w:b/>
-                <w:bCs/>
-                <w:color w:val="43A047"/>
-                <w:sz w:val="15"/>
-                <w:szCs w:val="15"/>
-              </w:rPr>
-              <w:t xml:space="preserve">COACHING CUE</w:t>
+            <w:r>
+              <w:rPr>
+                <w:rFonts w:ascii="Arial" w:cs="Arial" w:eastAsia="Arial" w:hAnsi="Arial"/>
+                <w:i/>
+                <w:iCs/>
+                <w:color w:val="00695C"/>
+                <w:sz w:val="14"/>
+                <w:szCs w:val="14"/>
+              </w:rPr>
+              <w:t xml:space="preserve">  Distance &amp; posture governed — no RIR target</w:t>
             </w:r>
           </w:p>
         </w:tc>
@@ -12107,7 +14421,7 @@
               <w:bottom w:val="none" w:color="FFFFFF" w:sz="0"/>
               <w:right w:val="none" w:color="FFFFFF" w:sz="0"/>
             </w:tcBorders>
-            <w:shd w:fill="F1F8F2" w:color="auto" w:val="clear"/>
+            <w:shd w:fill="FFFFFF" w:color="auto" w:val="clear"/>
             <w:tcMar>
               <w:top w:type="dxa" w:w="40"/>
               <w:left w:type="dxa" w:w="80"/>
@@ -12139,7 +14453,7 @@
               <w:bottom w:val="none" w:color="FFFFFF" w:sz="0"/>
               <w:right w:val="none" w:color="FFFFFF" w:sz="0"/>
             </w:tcBorders>
-            <w:shd w:fill="F1F8F2" w:color="auto" w:val="clear"/>
+            <w:shd w:fill="FFFFFF" w:color="auto" w:val="clear"/>
             <w:tcMar>
               <w:top w:type="dxa" w:w="40"/>
               <w:left w:type="dxa" w:w="80"/>
@@ -12172,7 +14486,7 @@
               <w:bottom w:val="none" w:color="FFFFFF" w:sz="0"/>
               <w:right w:val="none" w:color="FFFFFF" w:sz="0"/>
             </w:tcBorders>
-            <w:shd w:fill="F1F8F2" w:color="auto" w:val="clear"/>
+            <w:shd w:fill="FFFFFF" w:color="auto" w:val="clear"/>
             <w:tcMar>
               <w:top w:type="dxa" w:w="40"/>
               <w:left w:type="dxa" w:w="80"/>
@@ -12205,7 +14519,7 @@
               <w:bottom w:val="none" w:color="FFFFFF" w:sz="0"/>
               <w:right w:val="none" w:color="FFFFFF" w:sz="0"/>
             </w:tcBorders>
-            <w:shd w:fill="F1F8F2" w:color="auto" w:val="clear"/>
+            <w:shd w:fill="FFFFFF" w:color="auto" w:val="clear"/>
             <w:tcMar>
               <w:top w:type="dxa" w:w="40"/>
               <w:left w:type="dxa" w:w="80"/>
@@ -12238,7 +14552,7 @@
               <w:bottom w:val="none" w:color="FFFFFF" w:sz="0"/>
               <w:right w:val="none" w:color="FFFFFF" w:sz="0"/>
             </w:tcBorders>
-            <w:shd w:fill="F1F8F2" w:color="auto" w:val="clear"/>
+            <w:shd w:fill="FFFFFF" w:color="auto" w:val="clear"/>
             <w:tcMar>
               <w:top w:type="dxa" w:w="40"/>
               <w:left w:type="dxa" w:w="80"/>
@@ -12271,7 +14585,7 @@
               <w:bottom w:val="none" w:color="FFFFFF" w:sz="0"/>
               <w:right w:val="none" w:color="FFFFFF" w:sz="0"/>
             </w:tcBorders>
-            <w:shd w:fill="F1F8F2" w:color="auto" w:val="clear"/>
+            <w:shd w:fill="FFFFFF" w:color="auto" w:val="clear"/>
             <w:tcMar>
               <w:top w:type="dxa" w:w="40"/>
               <w:left w:type="dxa" w:w="80"/>
@@ -12304,7 +14618,7 @@
               <w:bottom w:val="none" w:color="FFFFFF" w:sz="0"/>
               <w:right w:val="none" w:color="FFFFFF" w:sz="0"/>
             </w:tcBorders>
-            <w:shd w:fill="F1F8F2" w:color="auto" w:val="clear"/>
+            <w:shd w:fill="FFFFFF" w:color="auto" w:val="clear"/>
             <w:tcMar>
               <w:top w:type="dxa" w:w="40"/>
               <w:left w:type="dxa" w:w="80"/>
@@ -12321,236 +14635,7 @@
                 <w:sz w:val="17"/>
                 <w:szCs w:val="17"/>
               </w:rPr>
-              <w:t xml:space="preserve">Ribs down, no lumbar sag. Build past 1:18 baseline.</w:t>
-            </w:r>
-          </w:p>
-        </w:tc>
-      </w:tr>
-      <w:tr>
-        <w:tc>
-          <w:tcPr>
-            <w:tcW w:type="dxa" w:w="2400"/>
-            <w:tcBorders>
-              <w:top w:val="none" w:color="FFFFFF" w:sz="0"/>
-              <w:left w:val="none" w:color="FFFFFF" w:sz="0"/>
-              <w:bottom w:val="none" w:color="FFFFFF" w:sz="0"/>
-              <w:right w:val="none" w:color="FFFFFF" w:sz="0"/>
-            </w:tcBorders>
-            <w:shd w:fill="FFFFFF" w:color="auto" w:val="clear"/>
-            <w:tcMar>
-              <w:top w:type="dxa" w:w="40"/>
-              <w:left w:type="dxa" w:w="80"/>
-              <w:bottom w:type="dxa" w:w="40"/>
-              <w:right w:type="dxa" w:w="80"/>
-            </w:tcMar>
-            <w:vAlign w:val="center"/>
-          </w:tcPr>
-          <w:p>
-            <w:r>
-              <w:rPr>
-                <w:rFonts w:ascii="Arial" w:cs="Arial" w:eastAsia="Arial" w:hAnsi="Arial"/>
-                <w:b/>
-                <w:bCs/>
-                <w:color w:val="2C2C2C"/>
-                <w:sz w:val="18"/>
-                <w:szCs w:val="18"/>
-              </w:rPr>
-              <w:t xml:space="preserve">Push-Ups</w:t>
-            </w:r>
-          </w:p>
-        </w:tc>
-        <w:tc>
-          <w:tcPr>
-            <w:tcW w:type="dxa" w:w="380"/>
-            <w:tcBorders>
-              <w:top w:val="none" w:color="FFFFFF" w:sz="0"/>
-              <w:left w:val="none" w:color="FFFFFF" w:sz="0"/>
-              <w:bottom w:val="none" w:color="FFFFFF" w:sz="0"/>
-              <w:right w:val="none" w:color="FFFFFF" w:sz="0"/>
-            </w:tcBorders>
-            <w:shd w:fill="FFFFFF" w:color="auto" w:val="clear"/>
-            <w:tcMar>
-              <w:top w:type="dxa" w:w="40"/>
-              <w:left w:type="dxa" w:w="80"/>
-              <w:bottom w:type="dxa" w:w="40"/>
-              <w:right w:type="dxa" w:w="80"/>
-            </w:tcMar>
-            <w:vAlign w:val="center"/>
-          </w:tcPr>
-          <w:p>
-            <w:pPr>
-              <w:jc w:val="center"/>
-            </w:pPr>
-            <w:r>
-              <w:rPr>
-                <w:rFonts w:ascii="Arial" w:cs="Arial" w:eastAsia="Arial" w:hAnsi="Arial"/>
-                <w:color w:val="6B6B6B"/>
-                <w:sz w:val="15"/>
-                <w:szCs w:val="15"/>
-              </w:rPr>
-              <w:t xml:space="preserve">3</w:t>
-            </w:r>
-          </w:p>
-        </w:tc>
-        <w:tc>
-          <w:tcPr>
-            <w:tcW w:type="dxa" w:w="420"/>
-            <w:tcBorders>
-              <w:top w:val="none" w:color="FFFFFF" w:sz="0"/>
-              <w:left w:val="none" w:color="FFFFFF" w:sz="0"/>
-              <w:bottom w:val="none" w:color="FFFFFF" w:sz="0"/>
-              <w:right w:val="none" w:color="FFFFFF" w:sz="0"/>
-            </w:tcBorders>
-            <w:shd w:fill="FFFFFF" w:color="auto" w:val="clear"/>
-            <w:tcMar>
-              <w:top w:type="dxa" w:w="40"/>
-              <w:left w:type="dxa" w:w="80"/>
-              <w:bottom w:type="dxa" w:w="40"/>
-              <w:right w:type="dxa" w:w="80"/>
-            </w:tcMar>
-            <w:vAlign w:val="center"/>
-          </w:tcPr>
-          <w:p>
-            <w:pPr>
-              <w:jc w:val="center"/>
-            </w:pPr>
-            <w:r>
-              <w:rPr>
-                <w:rFonts w:ascii="Arial" w:cs="Arial" w:eastAsia="Arial" w:hAnsi="Arial"/>
-                <w:color w:val="6B6B6B"/>
-                <w:sz w:val="15"/>
-                <w:szCs w:val="15"/>
-              </w:rPr>
-              <w:t xml:space="preserve">10-14</w:t>
-            </w:r>
-          </w:p>
-        </w:tc>
-        <w:tc>
-          <w:tcPr>
-            <w:tcW w:type="dxa" w:w="680"/>
-            <w:tcBorders>
-              <w:top w:val="none" w:color="FFFFFF" w:sz="0"/>
-              <w:left w:val="none" w:color="FFFFFF" w:sz="0"/>
-              <w:bottom w:val="none" w:color="FFFFFF" w:sz="0"/>
-              <w:right w:val="none" w:color="FFFFFF" w:sz="0"/>
-            </w:tcBorders>
-            <w:shd w:fill="FFFFFF" w:color="auto" w:val="clear"/>
-            <w:tcMar>
-              <w:top w:type="dxa" w:w="40"/>
-              <w:left w:type="dxa" w:w="80"/>
-              <w:bottom w:type="dxa" w:w="40"/>
-              <w:right w:type="dxa" w:w="80"/>
-            </w:tcMar>
-            <w:vAlign w:val="center"/>
-          </w:tcPr>
-          <w:p>
-            <w:pPr>
-              <w:jc w:val="center"/>
-            </w:pPr>
-            <w:r>
-              <w:rPr>
-                <w:rFonts w:ascii="Arial" w:cs="Arial" w:eastAsia="Arial" w:hAnsi="Arial"/>
-                <w:color w:val="6B6B6B"/>
-                <w:sz w:val="15"/>
-                <w:szCs w:val="15"/>
-              </w:rPr>
-              <w:t xml:space="preserve">Bodyweight</w:t>
-            </w:r>
-          </w:p>
-        </w:tc>
-        <w:tc>
-          <w:tcPr>
-            <w:tcW w:type="dxa" w:w="540"/>
-            <w:tcBorders>
-              <w:top w:val="none" w:color="FFFFFF" w:sz="0"/>
-              <w:left w:val="none" w:color="FFFFFF" w:sz="0"/>
-              <w:bottom w:val="none" w:color="FFFFFF" w:sz="0"/>
-              <w:right w:val="none" w:color="FFFFFF" w:sz="0"/>
-            </w:tcBorders>
-            <w:shd w:fill="FFFFFF" w:color="auto" w:val="clear"/>
-            <w:tcMar>
-              <w:top w:type="dxa" w:w="40"/>
-              <w:left w:type="dxa" w:w="80"/>
-              <w:bottom w:type="dxa" w:w="40"/>
-              <w:right w:type="dxa" w:w="80"/>
-            </w:tcMar>
-            <w:vAlign w:val="center"/>
-          </w:tcPr>
-          <w:p>
-            <w:pPr>
-              <w:jc w:val="center"/>
-            </w:pPr>
-            <w:r>
-              <w:rPr>
-                <w:rFonts w:ascii="Arial" w:cs="Arial" w:eastAsia="Arial" w:hAnsi="Arial"/>
-                <w:color w:val="6B6B6B"/>
-                <w:sz w:val="15"/>
-                <w:szCs w:val="15"/>
-              </w:rPr>
-              <w:t xml:space="preserve">2-0-1</w:t>
-            </w:r>
-          </w:p>
-        </w:tc>
-        <w:tc>
-          <w:tcPr>
-            <w:tcW w:type="dxa" w:w="440"/>
-            <w:tcBorders>
-              <w:top w:val="none" w:color="FFFFFF" w:sz="0"/>
-              <w:left w:val="none" w:color="FFFFFF" w:sz="0"/>
-              <w:bottom w:val="none" w:color="FFFFFF" w:sz="0"/>
-              <w:right w:val="none" w:color="FFFFFF" w:sz="0"/>
-            </w:tcBorders>
-            <w:shd w:fill="FFFFFF" w:color="auto" w:val="clear"/>
-            <w:tcMar>
-              <w:top w:type="dxa" w:w="40"/>
-              <w:left w:type="dxa" w:w="80"/>
-              <w:bottom w:type="dxa" w:w="40"/>
-              <w:right w:type="dxa" w:w="80"/>
-            </w:tcMar>
-            <w:vAlign w:val="center"/>
-          </w:tcPr>
-          <w:p>
-            <w:pPr>
-              <w:jc w:val="center"/>
-            </w:pPr>
-            <w:r>
-              <w:rPr>
-                <w:rFonts w:ascii="Arial" w:cs="Arial" w:eastAsia="Arial" w:hAnsi="Arial"/>
-                <w:color w:val="6B6B6B"/>
-                <w:sz w:val="15"/>
-                <w:szCs w:val="15"/>
-              </w:rPr>
-              <w:t xml:space="preserve">60s</w:t>
-            </w:r>
-          </w:p>
-        </w:tc>
-        <w:tc>
-          <w:tcPr>
-            <w:tcW w:type="dxa" w:w="5580"/>
-            <w:tcBorders>
-              <w:top w:val="none" w:color="FFFFFF" w:sz="0"/>
-              <w:left w:val="none" w:color="FFFFFF" w:sz="0"/>
-              <w:bottom w:val="none" w:color="FFFFFF" w:sz="0"/>
-              <w:right w:val="none" w:color="FFFFFF" w:sz="0"/>
-            </w:tcBorders>
-            <w:shd w:fill="FFFFFF" w:color="auto" w:val="clear"/>
-            <w:tcMar>
-              <w:top w:type="dxa" w:w="40"/>
-              <w:left w:type="dxa" w:w="80"/>
-              <w:bottom w:type="dxa" w:w="40"/>
-              <w:right w:type="dxa" w:w="80"/>
-            </w:tcMar>
-            <w:vAlign w:val="center"/>
-          </w:tcPr>
-          <w:p>
-            <w:r>
-              <w:rPr>
-                <w:rFonts w:ascii="Arial" w:cs="Arial" w:eastAsia="Arial" w:hAnsi="Arial"/>
-                <w:color w:val="6B6B6B"/>
-                <w:sz w:val="17"/>
-                <w:szCs w:val="17"/>
-              </w:rPr>
-              <w:t xml:space="preserve">Full range, no shoulder pinch. Build past 12-rep baseline.</w:t>
+              <w:t xml:space="preserve">Ribs down, no lumbar sag. Build past the 1:18 baseline.</w:t>
             </w:r>
           </w:p>
         </w:tc>
@@ -12574,7 +14659,7 @@
           <w:sz w:val="17"/>
           <w:szCs w:val="17"/>
         </w:rPr>
-        <w:t xml:space="preserve">E — CONDITIONING FINISHER</w:t>
+        <w:t xml:space="preserve">F — METABOLIC FINISHER</w:t>
       </w:r>
     </w:p>
     <w:p>
@@ -13152,7 +15237,7 @@
           <w:sz w:val="17"/>
           <w:szCs w:val="17"/>
         </w:rPr>
-        <w:t xml:space="preserve">Moderate accumulation day — build clean volume at 2 RIR, not a max-effort test. Left leads every unilateral leg set this week per the asymmetry note; sharp or pinching shoulder pain during carries or push-ups is still the stop signal, ordinary fatigue is not.</w:t>
+        <w:t xml:space="preserve">Moderate accumulation day — build clean volume at two reps in reserve, not a max-effort test. Left leads every unilateral leg set this week per the asymmetry note; sharp or pinching shoulder pain during carries or push-ups is still the stop signal, ordinary fatigue is not.</w:t>
       </w:r>
     </w:p>
     <w:p>
@@ -13603,7 +15688,7 @@
                 <w:sz w:val="14"/>
                 <w:szCs w:val="14"/>
               </w:rPr>
-              <w:t xml:space="preserve">Hex Bar Deadlift · Back Squat</w:t>
+              <w:t xml:space="preserve">Hex Bar Deadlift · Back Squat · Suitcase Carry</w:t>
             </w:r>
           </w:p>
         </w:tc>
@@ -13638,7 +15723,7 @@
                 <w:sz w:val="14"/>
                 <w:szCs w:val="14"/>
               </w:rPr>
-              <w:t xml:space="preserve">Add load at top of rep range + 2 RIR + clean form.</w:t>
+              <w:t xml:space="preserve">Hex DL 180 → 190 lbs by Wk 4, all at 2 RIR + clean form.</w:t>
             </w:r>
           </w:p>
         </w:tc>
@@ -13780,7 +15865,7 @@
                 <w:sz w:val="14"/>
                 <w:szCs w:val="14"/>
               </w:rPr>
-              <w:t xml:space="preserve">Rotator Cuff/Scap Block · Incline Bench · OHP · Pull-Up · SA Row</w:t>
+              <w:t xml:space="preserve">Cuff/Scap Block · Incline Press · SA Row · OHP + Shoulder Taps · Pull-Up</w:t>
             </w:r>
           </w:p>
         </w:tc>
@@ -13815,7 +15900,7 @@
                 <w:sz w:val="14"/>
                 <w:szCs w:val="14"/>
               </w:rPr>
-              <w:t xml:space="preserve">Progress cuff/scap work through isometric→eccentric→concentric→dynamic; add load on OHP/pull-up/row at pain-free RIR.</w:t>
+              <w:t xml:space="preserve">Progress cuff/scap work isometric→eccentric→concentric→dynamic; incline 30 → 35 lbs; OHP/pull-up at pain-free RIR.</w:t>
             </w:r>
           </w:p>
         </w:tc>
@@ -13957,7 +16042,7 @@
                 <w:sz w:val="14"/>
                 <w:szCs w:val="14"/>
               </w:rPr>
-              <w:t xml:space="preserve">SL RDL · Farmers Carry · Plank/Push-Ups</w:t>
+              <w:t xml:space="preserve">SL RDL · Push-Ups · Split Squat · Carry/Plank</w:t>
             </w:r>
           </w:p>
         </w:tc>
@@ -13992,7 +16077,7 @@
                 <w:sz w:val="14"/>
                 <w:szCs w:val="14"/>
               </w:rPr>
-              <w:t xml:space="preserve">Build carry load; extend plank hold and push-up reps past baseline.</w:t>
+              <w:t xml:space="preserve">Carry 45 → 50 lbs/hand; extend plank past 1:18 and push-ups past 12.</w:t>
             </w:r>
           </w:p>
         </w:tc>
@@ -14025,7 +16110,7 @@
           <w:sz w:val="17"/>
           <w:szCs w:val="17"/>
         </w:rPr>
-        <w:t xml:space="preserve">Confirm all primary/secondary lifts are progressing cleanly at their prescribed RIR (add load only at top of rep range with clean form). Rotator cuff/scapular strengthening block progresses from isometric to slow eccentric loading, fully pain-free. Left-leads unilateral leg work should show improving control and even tempo both sides.</w:t>
+        <w:t xml:space="preserve">Week 4 is the strength check, and these are the numbers it checks against: Hex Bar Deadlift 190 lbs x 5, Incline Dumbbell Press 35 lbs x 5-6, Farmers Carry 50 lbs/hand — every one reached at two reps in reserve with clean form, not by grinding. Back Squat, Single-Arm Row, Single-Leg RDL and Split Squat should each have a real logged working weight by then, not just the intake reference number. Rotator cuff and scapular block progressed from isometric holds into slow eccentric loading, fully pain-free. Plank shoulder taps held cleanly in the full plank position, or clearly progressing from the quadruped regression. Overhead Press and Assisted Pull-Ups both showing real week-over-week load or assistance progression. Left-led unilateral leg work showing improving control and even tempo on both sides. Week 5, immediately after this check, is the planned deload week — same exercises, sets roughly halved, loads at 50-70%, everything at 3+ reps in reserve, with the cuff block holding its stage — before Weeks 6-8 rebuild.</w:t>
       </w:r>
     </w:p>
     <w:p>
@@ -14050,7 +16135,7 @@
           <w:sz w:val="17"/>
           <w:szCs w:val="17"/>
         </w:rPr>
-        <w:t xml:space="preserve">Target Hex Bar Deadlift 195-200 x 5, Incline Bench 35-40 x 8, Single-Arm Row 40+ lbs x 10-12/side, Farmers Carry 55-60 lbs/hand, Plank 1:45-2:00, Push-Ups 20-22 reps. Overhead Press and Assisted Pull-Ups showing real week-over-week load/assistance progression, fully pain-free through range. Rotator cuff strengthening block progressed into controlled concentric or early dynamic loading, per Jason Bethea's clearance.</w:t>
+        <w:t xml:space="preserve">Target Hex Bar Deadlift 195-200 x 5, Incline Dumbbell Press 35-40 x 8, Single-Arm Row 40+ lbs x 10-12/side, Farmers Carry 55-60 lbs/hand, Plank 1:45-2:00, Push-Ups 20-22 reps in a single set, Split Squat carrying a real logged working load on both sides. Overhead Press and Assisted Pull-Ups showing real week-over-week load/assistance progression, fully pain-free through range. Rotator cuff strengthening block progressed into controlled concentric or early dynamic loading, per Jason Bethea's clearance. These are eight-week targets measured after the Week 5 deload and the Weeks 6-8 rebuild — not numbers to chase through the lighter week.</w:t>
       </w:r>
     </w:p>
     <w:p>
@@ -14075,7 +16160,7 @@
           <w:sz w:val="17"/>
           <w:szCs w:val="17"/>
         </w:rPr>
-        <w:t xml:space="preserve">8-week Styku re-scan — track ALST Index, VFA trend, Shape Score, body fat % trend, and left/right leg LST gap reduction (currently ~5% relative to the larger side), alongside the strength baselines table above and continued shoulder progress coordinated with Jason Bethea.</w:t>
+        <w:t xml:space="preserve">Two clocks, deliberately separate. Strength is rechecked every four weeks against the Week 4 numbers above. Body composition gets a Styku re-scan at eight weeks — landing at the end of the Weeks 6-8 rebuild rather than mid-deload, so it reads a consolidated block. Track at that scan: ALST Index (currently 7.92 kg/m², above the male at-risk line), VFA trend (currently 87.1 cm², read directionally rather than against a fixed risk band), body fat % and lean mass trend (the body-recomposition priority, per the composition note above), Shape Score, and the left/right leg lean-mass gap (currently ~5% relative to the larger side — below the threshold that would make the left-leads assignment a corrective priority rather than a coaching convention). Shoulder progress runs on its own track, coordinated with Jason Bethea, rather than waiting on either of these clocks.</w:t>
       </w:r>
     </w:p>
     <w:p>

</xml_diff>